<commit_message>
Backend role guards on admin routes
</commit_message>
<xml_diff>
--- a/Things To Do.docx
+++ b/Things To Do.docx
@@ -3688,6 +3688,43 @@
         <w:ind w:left="720"/>
         <w:contextualSpacing/>
       </w:pPr>
+      <w:r>
+        <w:drawing>
+          <wp:inline distT="0" distB="0" distL="0" distR="0" wp14:anchorId="04AEF69B" wp14:editId="22BA584F">
+            <wp:extent cx="4038600" cy="2641918"/>
+            <wp:effectExtent l="0" t="0" r="0" b="6350"/>
+            <wp:docPr id="494003662" name="Picture 1"/>
+            <wp:cNvGraphicFramePr>
+              <a:graphicFrameLocks xmlns:a="http://schemas.openxmlformats.org/drawingml/2006/main" noChangeAspect="1"/>
+            </wp:cNvGraphicFramePr>
+            <a:graphic xmlns:a="http://schemas.openxmlformats.org/drawingml/2006/main">
+              <a:graphicData uri="http://schemas.openxmlformats.org/drawingml/2006/picture">
+                <pic:pic xmlns:pic="http://schemas.openxmlformats.org/drawingml/2006/picture">
+                  <pic:nvPicPr>
+                    <pic:cNvPr id="494003662" name=""/>
+                    <pic:cNvPicPr/>
+                  </pic:nvPicPr>
+                  <pic:blipFill>
+                    <a:blip r:embed="rId5"/>
+                    <a:stretch>
+                      <a:fillRect/>
+                    </a:stretch>
+                  </pic:blipFill>
+                  <pic:spPr>
+                    <a:xfrm>
+                      <a:off x="0" y="0"/>
+                      <a:ext cx="4046146" cy="2646855"/>
+                    </a:xfrm>
+                    <a:prstGeom prst="rect">
+                      <a:avLst/>
+                    </a:prstGeom>
+                  </pic:spPr>
+                </pic:pic>
+              </a:graphicData>
+            </a:graphic>
+          </wp:inline>
+        </w:drawing>
+      </w:r>
     </w:p>
     <w:p>
       <w:pPr>
@@ -3710,6 +3747,7 @@
           <w:b/>
           <w:bCs/>
         </w:rPr>
+        <w:lastRenderedPageBreak/>
         <w:t xml:space="preserve">Replace </w:t>
       </w:r>
       <w:proofErr w:type="gramStart"/>
@@ -3735,6 +3773,13 @@
       <w:r>
         <w:t>) (30 min, polish)</w:t>
       </w:r>
+    </w:p>
+    <w:p>
+      <w:pPr>
+        <w:spacing w:line="240" w:lineRule="auto"/>
+        <w:ind w:left="720"/>
+        <w:contextualSpacing/>
+      </w:pPr>
     </w:p>
     <w:p>
       <w:pPr>
@@ -3869,7 +3914,6 @@
         <w:spacing w:line="240" w:lineRule="auto"/>
       </w:pPr>
       <w:r>
-        <w:lastRenderedPageBreak/>
         <w:t xml:space="preserve">On profile, provide </w:t>
       </w:r>
       <w:r>
@@ -3906,6 +3950,19 @@
       </w:pPr>
       <w:r>
         <w:t>On the discovery page, provide a way or resetting searches to clear all</w:t>
+      </w:r>
+    </w:p>
+    <w:p>
+      <w:pPr>
+        <w:pStyle w:val="ListParagraph"/>
+        <w:numPr>
+          <w:ilvl w:val="0"/>
+          <w:numId w:val="8"/>
+        </w:numPr>
+        <w:spacing w:line="240" w:lineRule="auto"/>
+      </w:pPr>
+      <w:r>
+        <w:t>How to download visual charts</w:t>
       </w:r>
     </w:p>
     <w:sectPr>

</xml_diff>

<commit_message>
Replaced alert() with toast()
</commit_message>
<xml_diff>
--- a/Things To Do.docx
+++ b/Things To Do.docx
@@ -3779,6 +3779,2453 @@
         <w:spacing w:line="240" w:lineRule="auto"/>
         <w:ind w:left="720"/>
         <w:contextualSpacing/>
+        <w:rPr>
+          <w:b/>
+          <w:bCs/>
+        </w:rPr>
+      </w:pPr>
+      <w:r>
+        <w:rPr>
+          <w:b/>
+          <w:bCs/>
+        </w:rPr>
+        <w:t> Why Task 3 Matters</w:t>
+      </w:r>
+    </w:p>
+    <w:p>
+      <w:pPr>
+        <w:pStyle w:val="ListParagraph"/>
+        <w:numPr>
+          <w:ilvl w:val="0"/>
+          <w:numId w:val="25"/>
+        </w:numPr>
+        <w:spacing w:line="240" w:lineRule="auto"/>
+        <w:rPr>
+          <w:b/>
+          <w:bCs/>
+        </w:rPr>
+      </w:pPr>
+      <w:r>
+        <w:rPr>
+          <w:b/>
+          <w:bCs/>
+        </w:rPr>
+        <w:t>User Experience — The Big One</w:t>
+      </w:r>
+    </w:p>
+    <w:p>
+      <w:pPr>
+        <w:spacing w:line="240" w:lineRule="auto"/>
+        <w:ind w:left="720"/>
+        <w:contextualSpacing/>
+      </w:pPr>
+      <w:r>
+        <w:t xml:space="preserve">Native </w:t>
+      </w:r>
+      <w:proofErr w:type="gramStart"/>
+      <w:r>
+        <w:t>alert(</w:t>
+      </w:r>
+      <w:proofErr w:type="gramEnd"/>
+      <w:r>
+        <w:t xml:space="preserve">) </w:t>
+      </w:r>
+      <w:r>
+        <w:rPr>
+          <w:b/>
+          <w:bCs/>
+        </w:rPr>
+        <w:t>freezes the entire browser</w:t>
+      </w:r>
+      <w:r>
+        <w:t xml:space="preserve"> until the user clicks "OK". It:</w:t>
+      </w:r>
+    </w:p>
+    <w:p>
+      <w:pPr>
+        <w:numPr>
+          <w:ilvl w:val="0"/>
+          <w:numId w:val="21"/>
+        </w:numPr>
+        <w:spacing w:line="240" w:lineRule="auto"/>
+        <w:contextualSpacing/>
+      </w:pPr>
+      <w:r>
+        <w:t>Blocks them from doing anything else</w:t>
+      </w:r>
+    </w:p>
+    <w:p>
+      <w:pPr>
+        <w:numPr>
+          <w:ilvl w:val="0"/>
+          <w:numId w:val="21"/>
+        </w:numPr>
+        <w:spacing w:line="240" w:lineRule="auto"/>
+        <w:contextualSpacing/>
+      </w:pPr>
+      <w:r>
+        <w:t>Can't be styled (ugly native gray box, whatever OS you're on)</w:t>
+      </w:r>
+    </w:p>
+    <w:p>
+      <w:pPr>
+        <w:numPr>
+          <w:ilvl w:val="0"/>
+          <w:numId w:val="21"/>
+        </w:numPr>
+        <w:spacing w:line="240" w:lineRule="auto"/>
+        <w:contextualSpacing/>
+      </w:pPr>
+      <w:r>
+        <w:t>Feels like a system error, not a friendly app message</w:t>
+      </w:r>
+    </w:p>
+    <w:p>
+      <w:pPr>
+        <w:numPr>
+          <w:ilvl w:val="0"/>
+          <w:numId w:val="21"/>
+        </w:numPr>
+        <w:spacing w:line="240" w:lineRule="auto"/>
+        <w:contextualSpacing/>
+      </w:pPr>
+      <w:r>
+        <w:t>Interrupts their flow for even a trivial "Report submitted"</w:t>
+      </w:r>
+    </w:p>
+    <w:p>
+      <w:pPr>
+        <w:spacing w:line="240" w:lineRule="auto"/>
+        <w:ind w:left="720"/>
+        <w:contextualSpacing/>
+      </w:pPr>
+      <w:r>
+        <w:t xml:space="preserve">Your custom </w:t>
+      </w:r>
+      <w:proofErr w:type="gramStart"/>
+      <w:r>
+        <w:t>toast(</w:t>
+      </w:r>
+      <w:proofErr w:type="gramEnd"/>
+      <w:r>
+        <w:t xml:space="preserve">) fades in at the bottom, doesn't block, auto-dismisses, and matches your app's brand colors. </w:t>
+      </w:r>
+      <w:r>
+        <w:rPr>
+          <w:b/>
+          <w:bCs/>
+        </w:rPr>
+        <w:t>It's the difference between a prototype and a polished product.</w:t>
+      </w:r>
+    </w:p>
+    <w:p>
+      <w:pPr>
+        <w:pStyle w:val="ListParagraph"/>
+        <w:numPr>
+          <w:ilvl w:val="0"/>
+          <w:numId w:val="25"/>
+        </w:numPr>
+        <w:spacing w:line="240" w:lineRule="auto"/>
+        <w:rPr>
+          <w:b/>
+          <w:bCs/>
+        </w:rPr>
+      </w:pPr>
+      <w:r>
+        <w:rPr>
+          <w:b/>
+          <w:bCs/>
+        </w:rPr>
+        <w:t>2. Consistency</w:t>
+      </w:r>
+    </w:p>
+    <w:p>
+      <w:pPr>
+        <w:spacing w:line="240" w:lineRule="auto"/>
+        <w:ind w:left="720"/>
+        <w:contextualSpacing/>
+      </w:pPr>
+      <w:r>
+        <w:t xml:space="preserve">Your app already uses </w:t>
+      </w:r>
+      <w:proofErr w:type="gramStart"/>
+      <w:r>
+        <w:t>toast(</w:t>
+      </w:r>
+      <w:proofErr w:type="gramEnd"/>
+      <w:r>
+        <w:t xml:space="preserve">) in many places (booking success, review submission, cancellation, provider approval, etc.). Having </w:t>
+      </w:r>
+      <w:proofErr w:type="gramStart"/>
+      <w:r>
+        <w:t>alert(</w:t>
+      </w:r>
+      <w:proofErr w:type="gramEnd"/>
+      <w:r>
+        <w:t xml:space="preserve">) pop up for a </w:t>
+      </w:r>
+      <w:r>
+        <w:rPr>
+          <w:i/>
+          <w:iCs/>
+        </w:rPr>
+        <w:t>few</w:t>
+      </w:r>
+      <w:r>
+        <w:t xml:space="preserve"> actions creates </w:t>
+      </w:r>
+      <w:r>
+        <w:rPr>
+          <w:b/>
+          <w:bCs/>
+        </w:rPr>
+        <w:t>inconsistency</w:t>
+      </w:r>
+      <w:r>
+        <w:t xml:space="preserve"> — like the app was built by two different teams.</w:t>
+      </w:r>
+    </w:p>
+    <w:p>
+      <w:pPr>
+        <w:spacing w:line="240" w:lineRule="auto"/>
+        <w:ind w:left="720"/>
+        <w:contextualSpacing/>
+      </w:pPr>
+      <w:r>
+        <w:t xml:space="preserve">A reviewer or examiner will notice: </w:t>
+      </w:r>
+      <w:r>
+        <w:rPr>
+          <w:i/>
+          <w:iCs/>
+        </w:rPr>
+        <w:t>"Why does reporting a provider give a different kind of notification than everything else?"</w:t>
+      </w:r>
+    </w:p>
+    <w:p>
+      <w:pPr>
+        <w:pStyle w:val="ListParagraph"/>
+        <w:numPr>
+          <w:ilvl w:val="0"/>
+          <w:numId w:val="25"/>
+        </w:numPr>
+        <w:spacing w:line="240" w:lineRule="auto"/>
+        <w:rPr>
+          <w:b/>
+          <w:bCs/>
+        </w:rPr>
+      </w:pPr>
+      <w:r>
+        <w:rPr>
+          <w:b/>
+          <w:bCs/>
+        </w:rPr>
+        <w:t>Professional Standards</w:t>
+      </w:r>
+    </w:p>
+    <w:p>
+      <w:pPr>
+        <w:spacing w:line="240" w:lineRule="auto"/>
+        <w:ind w:left="720"/>
+        <w:contextualSpacing/>
+      </w:pPr>
+      <w:r>
+        <w:t>Every modern web app — Uber, Airbnb, Twitter, your bank — uses in-app toast/</w:t>
+      </w:r>
+      <w:proofErr w:type="spellStart"/>
+      <w:r>
+        <w:t>snackbar</w:t>
+      </w:r>
+      <w:proofErr w:type="spellEnd"/>
+      <w:r>
+        <w:t xml:space="preserve"> notifications, </w:t>
+      </w:r>
+      <w:r>
+        <w:rPr>
+          <w:b/>
+          <w:bCs/>
+        </w:rPr>
+        <w:t>never</w:t>
+      </w:r>
+      <w:r>
+        <w:t xml:space="preserve"> native alerts. Demonstrating this shows:</w:t>
+      </w:r>
+    </w:p>
+    <w:p>
+      <w:pPr>
+        <w:numPr>
+          <w:ilvl w:val="0"/>
+          <w:numId w:val="22"/>
+        </w:numPr>
+        <w:spacing w:line="240" w:lineRule="auto"/>
+        <w:contextualSpacing/>
+      </w:pPr>
+      <w:r>
+        <w:t>You understand modern frontend UX</w:t>
+      </w:r>
+    </w:p>
+    <w:p>
+      <w:pPr>
+        <w:numPr>
+          <w:ilvl w:val="0"/>
+          <w:numId w:val="22"/>
+        </w:numPr>
+        <w:spacing w:line="240" w:lineRule="auto"/>
+        <w:contextualSpacing/>
+      </w:pPr>
+      <w:r>
+        <w:t>You care about the small details</w:t>
+      </w:r>
+    </w:p>
+    <w:p>
+      <w:pPr>
+        <w:numPr>
+          <w:ilvl w:val="0"/>
+          <w:numId w:val="22"/>
+        </w:numPr>
+        <w:spacing w:line="240" w:lineRule="auto"/>
+        <w:contextualSpacing/>
+      </w:pPr>
+      <w:r>
+        <w:t>You can implement a shared design system</w:t>
+      </w:r>
+    </w:p>
+    <w:p>
+      <w:pPr>
+        <w:pStyle w:val="ListParagraph"/>
+        <w:numPr>
+          <w:ilvl w:val="0"/>
+          <w:numId w:val="25"/>
+        </w:numPr>
+        <w:spacing w:line="240" w:lineRule="auto"/>
+        <w:rPr>
+          <w:b/>
+          <w:bCs/>
+        </w:rPr>
+      </w:pPr>
+      <w:r>
+        <w:rPr>
+          <w:b/>
+          <w:bCs/>
+        </w:rPr>
+        <w:t>It Was Already Half-Done</w:t>
+      </w:r>
+    </w:p>
+    <w:p>
+      <w:pPr>
+        <w:spacing w:line="240" w:lineRule="auto"/>
+        <w:ind w:left="720"/>
+        <w:contextualSpacing/>
+      </w:pPr>
+      <w:r>
+        <w:t xml:space="preserve">The </w:t>
+      </w:r>
+      <w:proofErr w:type="gramStart"/>
+      <w:r>
+        <w:t>toast(</w:t>
+      </w:r>
+      <w:proofErr w:type="gramEnd"/>
+      <w:r>
+        <w:t xml:space="preserve">) helper exists in main.js and is used everywhere else. We're just </w:t>
+      </w:r>
+      <w:r>
+        <w:rPr>
+          <w:b/>
+          <w:bCs/>
+        </w:rPr>
+        <w:t>finishing the migration</w:t>
+      </w:r>
+      <w:r>
+        <w:t xml:space="preserve"> — bringing the stragglers into line.</w:t>
+      </w:r>
+    </w:p>
+    <w:p>
+      <w:pPr>
+        <w:pStyle w:val="ListParagraph"/>
+        <w:numPr>
+          <w:ilvl w:val="0"/>
+          <w:numId w:val="25"/>
+        </w:numPr>
+        <w:spacing w:line="240" w:lineRule="auto"/>
+        <w:rPr>
+          <w:b/>
+          <w:bCs/>
+        </w:rPr>
+      </w:pPr>
+      <w:r>
+        <w:rPr>
+          <w:b/>
+          <w:bCs/>
+        </w:rPr>
+        <w:t>5. Scope-Creep-Free</w:t>
+      </w:r>
+    </w:p>
+    <w:p>
+      <w:pPr>
+        <w:spacing w:line="240" w:lineRule="auto"/>
+        <w:ind w:left="720"/>
+        <w:contextualSpacing/>
+      </w:pPr>
+      <w:r>
+        <w:t xml:space="preserve">This is a </w:t>
+      </w:r>
+      <w:r>
+        <w:rPr>
+          <w:b/>
+          <w:bCs/>
+        </w:rPr>
+        <w:t>pure polish task</w:t>
+      </w:r>
+      <w:r>
+        <w:t>. No new features, no new pages, no backend changes. Just swapping one function call for another. Zero risk to your working code.</w:t>
+      </w:r>
+    </w:p>
+    <w:p>
+      <w:pPr>
+        <w:pStyle w:val="ListParagraph"/>
+        <w:numPr>
+          <w:ilvl w:val="0"/>
+          <w:numId w:val="25"/>
+        </w:numPr>
+        <w:spacing w:line="240" w:lineRule="auto"/>
+        <w:rPr>
+          <w:b/>
+          <w:bCs/>
+        </w:rPr>
+      </w:pPr>
+      <w:r>
+        <w:rPr>
+          <w:b/>
+          <w:bCs/>
+        </w:rPr>
+        <w:t>6. Aligns with Your Draft Scope</w:t>
+      </w:r>
+    </w:p>
+    <w:p>
+      <w:pPr>
+        <w:pStyle w:val="ListParagraph"/>
+        <w:numPr>
+          <w:ilvl w:val="0"/>
+          <w:numId w:val="25"/>
+        </w:numPr>
+        <w:shd w:val="clear" w:color="auto" w:fill="FFFFFF"/>
+        <w:spacing w:before="480" w:after="240" w:line="480" w:lineRule="atLeast"/>
+        <w:outlineLvl w:val="1"/>
+        <w:rPr>
+          <w:rFonts w:ascii="Segoe UI" w:eastAsia="Times New Roman" w:hAnsi="Segoe UI" w:cs="Segoe UI"/>
+          <w:b/>
+          <w:bCs/>
+          <w:color w:val="0F1115"/>
+          <w:kern w:val="0"/>
+          <w:sz w:val="33"/>
+          <w:szCs w:val="33"/>
+          <w14:ligatures w14:val="none"/>
+        </w:rPr>
+      </w:pPr>
+      <w:r>
+        <w:rPr>
+          <w:rFonts w:ascii="Segoe UI" w:eastAsia="Times New Roman" w:hAnsi="Segoe UI" w:cs="Segoe UI"/>
+          <w:b/>
+          <w:bCs/>
+          <w:color w:val="0F1115"/>
+          <w:kern w:val="0"/>
+          <w:sz w:val="33"/>
+          <w:szCs w:val="33"/>
+          <w14:ligatures w14:val="none"/>
+        </w:rPr>
+        <w:t> Task 3 — Final Tally</w:t>
+      </w:r>
+    </w:p>
+    <w:tbl>
+      <w:tblPr>
+        <w:tblW w:w="11280" w:type="dxa"/>
+        <w:tblCellMar>
+          <w:top w:w="15" w:type="dxa"/>
+          <w:left w:w="15" w:type="dxa"/>
+          <w:bottom w:w="15" w:type="dxa"/>
+          <w:right w:w="15" w:type="dxa"/>
+        </w:tblCellMar>
+        <w:tblLook w:val="04A0" w:firstRow="1" w:lastRow="0" w:firstColumn="1" w:lastColumn="0" w:noHBand="0" w:noVBand="1"/>
+      </w:tblPr>
+      <w:tblGrid>
+        <w:gridCol w:w="7982"/>
+        <w:gridCol w:w="3298"/>
+      </w:tblGrid>
+      <w:tr>
+        <w:trPr>
+          <w:tblHeader/>
+        </w:trPr>
+        <w:tc>
+          <w:tcPr>
+            <w:tcW w:w="0" w:type="auto"/>
+            <w:tcBorders>
+              <w:top w:val="nil"/>
+            </w:tcBorders>
+            <w:tcMar>
+              <w:top w:w="150" w:type="dxa"/>
+              <w:left w:w="0" w:type="dxa"/>
+              <w:bottom w:w="150" w:type="dxa"/>
+              <w:right w:w="240" w:type="dxa"/>
+            </w:tcMar>
+            <w:vAlign w:val="center"/>
+            <w:hideMark/>
+          </w:tcPr>
+          <w:p>
+            <w:pPr>
+              <w:spacing w:after="0" w:line="375" w:lineRule="atLeast"/>
+              <w:contextualSpacing/>
+              <w:rPr>
+                <w:rFonts w:ascii="Segoe UI" w:eastAsia="Times New Roman" w:hAnsi="Segoe UI" w:cs="Segoe UI"/>
+                <w:kern w:val="0"/>
+                <w:sz w:val="23"/>
+                <w:szCs w:val="23"/>
+                <w14:ligatures w14:val="none"/>
+              </w:rPr>
+            </w:pPr>
+            <w:r>
+              <w:rPr>
+                <w:rFonts w:ascii="Segoe UI" w:eastAsia="Times New Roman" w:hAnsi="Segoe UI" w:cs="Segoe UI"/>
+                <w:kern w:val="0"/>
+                <w:sz w:val="23"/>
+                <w:szCs w:val="23"/>
+                <w14:ligatures w14:val="none"/>
+              </w:rPr>
+              <w:t>Test</w:t>
+            </w:r>
+          </w:p>
+        </w:tc>
+        <w:tc>
+          <w:tcPr>
+            <w:tcW w:w="0" w:type="auto"/>
+            <w:tcBorders>
+              <w:top w:val="nil"/>
+            </w:tcBorders>
+            <w:tcMar>
+              <w:top w:w="150" w:type="dxa"/>
+              <w:left w:w="240" w:type="dxa"/>
+              <w:bottom w:w="150" w:type="dxa"/>
+              <w:right w:w="240" w:type="dxa"/>
+            </w:tcMar>
+            <w:vAlign w:val="center"/>
+            <w:hideMark/>
+          </w:tcPr>
+          <w:p>
+            <w:pPr>
+              <w:spacing w:after="0" w:line="375" w:lineRule="atLeast"/>
+              <w:contextualSpacing/>
+              <w:rPr>
+                <w:rFonts w:ascii="Segoe UI" w:eastAsia="Times New Roman" w:hAnsi="Segoe UI" w:cs="Segoe UI"/>
+                <w:kern w:val="0"/>
+                <w:sz w:val="23"/>
+                <w:szCs w:val="23"/>
+                <w14:ligatures w14:val="none"/>
+              </w:rPr>
+            </w:pPr>
+            <w:r>
+              <w:rPr>
+                <w:rFonts w:ascii="Segoe UI" w:eastAsia="Times New Roman" w:hAnsi="Segoe UI" w:cs="Segoe UI"/>
+                <w:kern w:val="0"/>
+                <w:sz w:val="23"/>
+                <w:szCs w:val="23"/>
+                <w14:ligatures w14:val="none"/>
+              </w:rPr>
+              <w:t>Result</w:t>
+            </w:r>
+          </w:p>
+        </w:tc>
+      </w:tr>
+      <w:tr>
+        <w:tc>
+          <w:tcPr>
+            <w:tcW w:w="0" w:type="auto"/>
+            <w:tcMar>
+              <w:top w:w="150" w:type="dxa"/>
+              <w:left w:w="0" w:type="dxa"/>
+              <w:bottom w:w="150" w:type="dxa"/>
+              <w:right w:w="240" w:type="dxa"/>
+            </w:tcMar>
+            <w:vAlign w:val="center"/>
+            <w:hideMark/>
+          </w:tcPr>
+          <w:p>
+            <w:pPr>
+              <w:spacing w:after="0" w:line="375" w:lineRule="atLeast"/>
+              <w:contextualSpacing/>
+              <w:rPr>
+                <w:rFonts w:ascii="Segoe UI" w:eastAsia="Times New Roman" w:hAnsi="Segoe UI" w:cs="Segoe UI"/>
+                <w:kern w:val="0"/>
+                <w:sz w:val="23"/>
+                <w:szCs w:val="23"/>
+                <w14:ligatures w14:val="none"/>
+              </w:rPr>
+            </w:pPr>
+            <w:r>
+              <w:rPr>
+                <w:rFonts w:ascii="Segoe UI" w:eastAsia="Times New Roman" w:hAnsi="Segoe UI" w:cs="Segoe UI"/>
+                <w:kern w:val="0"/>
+                <w:sz w:val="23"/>
+                <w:szCs w:val="23"/>
+                <w14:ligatures w14:val="none"/>
+              </w:rPr>
+              <w:t>Toast replaces alert on report submission</w:t>
+            </w:r>
+          </w:p>
+        </w:tc>
+        <w:tc>
+          <w:tcPr>
+            <w:tcW w:w="0" w:type="auto"/>
+            <w:tcMar>
+              <w:top w:w="150" w:type="dxa"/>
+              <w:left w:w="240" w:type="dxa"/>
+              <w:bottom w:w="150" w:type="dxa"/>
+              <w:right w:w="0" w:type="dxa"/>
+            </w:tcMar>
+            <w:vAlign w:val="center"/>
+            <w:hideMark/>
+          </w:tcPr>
+          <w:p>
+            <w:pPr>
+              <w:spacing w:after="0" w:line="375" w:lineRule="atLeast"/>
+              <w:contextualSpacing/>
+              <w:rPr>
+                <w:rFonts w:ascii="Segoe UI" w:eastAsia="Times New Roman" w:hAnsi="Segoe UI" w:cs="Segoe UI"/>
+                <w:kern w:val="0"/>
+                <w:sz w:val="23"/>
+                <w:szCs w:val="23"/>
+                <w14:ligatures w14:val="none"/>
+              </w:rPr>
+            </w:pPr>
+            <w:r>
+              <w:rPr>
+                <w:rFonts w:ascii="Segoe UI Emoji" w:eastAsia="Times New Roman" w:hAnsi="Segoe UI Emoji" w:cs="Segoe UI Emoji"/>
+                <w:kern w:val="0"/>
+                <w:sz w:val="23"/>
+                <w:szCs w:val="23"/>
+                <w14:ligatures w14:val="none"/>
+              </w:rPr>
+              <w:t>✅</w:t>
+            </w:r>
+            <w:r>
+              <w:rPr>
+                <w:rFonts w:ascii="Segoe UI" w:eastAsia="Times New Roman" w:hAnsi="Segoe UI" w:cs="Segoe UI"/>
+                <w:kern w:val="0"/>
+                <w:sz w:val="23"/>
+                <w:szCs w:val="23"/>
+                <w14:ligatures w14:val="none"/>
+              </w:rPr>
+              <w:t xml:space="preserve"> Passed</w:t>
+            </w:r>
+          </w:p>
+        </w:tc>
+      </w:tr>
+      <w:tr>
+        <w:tc>
+          <w:tcPr>
+            <w:tcW w:w="0" w:type="auto"/>
+            <w:tcMar>
+              <w:top w:w="150" w:type="dxa"/>
+              <w:left w:w="0" w:type="dxa"/>
+              <w:bottom w:w="150" w:type="dxa"/>
+              <w:right w:w="240" w:type="dxa"/>
+            </w:tcMar>
+            <w:vAlign w:val="center"/>
+            <w:hideMark/>
+          </w:tcPr>
+          <w:p>
+            <w:pPr>
+              <w:spacing w:after="0" w:line="375" w:lineRule="atLeast"/>
+              <w:contextualSpacing/>
+              <w:rPr>
+                <w:rFonts w:ascii="Segoe UI" w:eastAsia="Times New Roman" w:hAnsi="Segoe UI" w:cs="Segoe UI"/>
+                <w:kern w:val="0"/>
+                <w:sz w:val="23"/>
+                <w:szCs w:val="23"/>
+                <w14:ligatures w14:val="none"/>
+              </w:rPr>
+            </w:pPr>
+            <w:r>
+              <w:rPr>
+                <w:rFonts w:ascii="Segoe UI" w:eastAsia="Times New Roman" w:hAnsi="Segoe UI" w:cs="Segoe UI"/>
+                <w:kern w:val="0"/>
+                <w:sz w:val="23"/>
+                <w:szCs w:val="23"/>
+                <w14:ligatures w14:val="none"/>
+              </w:rPr>
+              <w:lastRenderedPageBreak/>
+              <w:t>Console clean (except favicon — easy fix)</w:t>
+            </w:r>
+          </w:p>
+        </w:tc>
+        <w:tc>
+          <w:tcPr>
+            <w:tcW w:w="0" w:type="auto"/>
+            <w:tcMar>
+              <w:top w:w="150" w:type="dxa"/>
+              <w:left w:w="240" w:type="dxa"/>
+              <w:bottom w:w="150" w:type="dxa"/>
+              <w:right w:w="0" w:type="dxa"/>
+            </w:tcMar>
+            <w:vAlign w:val="center"/>
+            <w:hideMark/>
+          </w:tcPr>
+          <w:p>
+            <w:pPr>
+              <w:spacing w:after="0" w:line="375" w:lineRule="atLeast"/>
+              <w:contextualSpacing/>
+              <w:rPr>
+                <w:rFonts w:ascii="Segoe UI" w:eastAsia="Times New Roman" w:hAnsi="Segoe UI" w:cs="Segoe UI"/>
+                <w:kern w:val="0"/>
+                <w:sz w:val="23"/>
+                <w:szCs w:val="23"/>
+                <w14:ligatures w14:val="none"/>
+              </w:rPr>
+            </w:pPr>
+            <w:r>
+              <w:rPr>
+                <w:rFonts w:ascii="Segoe UI Emoji" w:eastAsia="Times New Roman" w:hAnsi="Segoe UI Emoji" w:cs="Segoe UI Emoji"/>
+                <w:kern w:val="0"/>
+                <w:sz w:val="23"/>
+                <w:szCs w:val="23"/>
+                <w14:ligatures w14:val="none"/>
+              </w:rPr>
+              <w:t>✅</w:t>
+            </w:r>
+          </w:p>
+        </w:tc>
+      </w:tr>
+      <w:tr>
+        <w:tc>
+          <w:tcPr>
+            <w:tcW w:w="0" w:type="auto"/>
+            <w:tcMar>
+              <w:top w:w="150" w:type="dxa"/>
+              <w:left w:w="0" w:type="dxa"/>
+              <w:bottom w:w="150" w:type="dxa"/>
+              <w:right w:w="240" w:type="dxa"/>
+            </w:tcMar>
+            <w:vAlign w:val="center"/>
+            <w:hideMark/>
+          </w:tcPr>
+          <w:p>
+            <w:pPr>
+              <w:spacing w:after="0" w:line="375" w:lineRule="atLeast"/>
+              <w:contextualSpacing/>
+              <w:rPr>
+                <w:rFonts w:ascii="Segoe UI" w:eastAsia="Times New Roman" w:hAnsi="Segoe UI" w:cs="Segoe UI"/>
+                <w:kern w:val="0"/>
+                <w:sz w:val="23"/>
+                <w:szCs w:val="23"/>
+                <w14:ligatures w14:val="none"/>
+              </w:rPr>
+            </w:pPr>
+            <w:r>
+              <w:rPr>
+                <w:rFonts w:ascii="Segoe UI" w:eastAsia="Times New Roman" w:hAnsi="Segoe UI" w:cs="Segoe UI"/>
+                <w:kern w:val="0"/>
+                <w:sz w:val="23"/>
+                <w:szCs w:val="23"/>
+                <w14:ligatures w14:val="none"/>
+              </w:rPr>
+              <w:t>Logged-out user can't reach admin.html</w:t>
+            </w:r>
+          </w:p>
+        </w:tc>
+        <w:tc>
+          <w:tcPr>
+            <w:tcW w:w="0" w:type="auto"/>
+            <w:tcMar>
+              <w:top w:w="150" w:type="dxa"/>
+              <w:left w:w="240" w:type="dxa"/>
+              <w:bottom w:w="150" w:type="dxa"/>
+              <w:right w:w="0" w:type="dxa"/>
+            </w:tcMar>
+            <w:vAlign w:val="center"/>
+            <w:hideMark/>
+          </w:tcPr>
+          <w:p>
+            <w:pPr>
+              <w:spacing w:after="0" w:line="375" w:lineRule="atLeast"/>
+              <w:contextualSpacing/>
+              <w:rPr>
+                <w:rFonts w:ascii="Segoe UI" w:eastAsia="Times New Roman" w:hAnsi="Segoe UI" w:cs="Segoe UI"/>
+                <w:kern w:val="0"/>
+                <w:sz w:val="23"/>
+                <w:szCs w:val="23"/>
+                <w14:ligatures w14:val="none"/>
+              </w:rPr>
+            </w:pPr>
+            <w:r>
+              <w:rPr>
+                <w:rFonts w:ascii="Segoe UI Emoji" w:eastAsia="Times New Roman" w:hAnsi="Segoe UI Emoji" w:cs="Segoe UI Emoji"/>
+                <w:kern w:val="0"/>
+                <w:sz w:val="23"/>
+                <w:szCs w:val="23"/>
+                <w14:ligatures w14:val="none"/>
+              </w:rPr>
+              <w:t>✅</w:t>
+            </w:r>
+          </w:p>
+        </w:tc>
+      </w:tr>
+      <w:tr>
+        <w:tc>
+          <w:tcPr>
+            <w:tcW w:w="0" w:type="auto"/>
+            <w:tcMar>
+              <w:top w:w="150" w:type="dxa"/>
+              <w:left w:w="0" w:type="dxa"/>
+              <w:bottom w:w="150" w:type="dxa"/>
+              <w:right w:w="240" w:type="dxa"/>
+            </w:tcMar>
+            <w:vAlign w:val="center"/>
+            <w:hideMark/>
+          </w:tcPr>
+          <w:p>
+            <w:pPr>
+              <w:spacing w:after="0" w:line="375" w:lineRule="atLeast"/>
+              <w:contextualSpacing/>
+              <w:rPr>
+                <w:rFonts w:ascii="Segoe UI" w:eastAsia="Times New Roman" w:hAnsi="Segoe UI" w:cs="Segoe UI"/>
+                <w:kern w:val="0"/>
+                <w:sz w:val="23"/>
+                <w:szCs w:val="23"/>
+                <w14:ligatures w14:val="none"/>
+              </w:rPr>
+            </w:pPr>
+            <w:r>
+              <w:rPr>
+                <w:rFonts w:ascii="Segoe UI" w:eastAsia="Times New Roman" w:hAnsi="Segoe UI" w:cs="Segoe UI"/>
+                <w:kern w:val="0"/>
+                <w:sz w:val="23"/>
+                <w:szCs w:val="23"/>
+                <w14:ligatures w14:val="none"/>
+              </w:rPr>
+              <w:t xml:space="preserve">Corrupted </w:t>
+            </w:r>
+            <w:proofErr w:type="spellStart"/>
+            <w:r>
+              <w:rPr>
+                <w:rFonts w:ascii="Consolas" w:eastAsia="Times New Roman" w:hAnsi="Consolas" w:cs="Courier New"/>
+                <w:kern w:val="0"/>
+                <w:sz w:val="20"/>
+                <w:szCs w:val="20"/>
+                <w:shd w:val="clear" w:color="auto" w:fill="EBEEF2"/>
+                <w14:ligatures w14:val="none"/>
+              </w:rPr>
+              <w:t>asc_user</w:t>
+            </w:r>
+            <w:proofErr w:type="spellEnd"/>
+            <w:r>
+              <w:rPr>
+                <w:rFonts w:ascii="Segoe UI" w:eastAsia="Times New Roman" w:hAnsi="Segoe UI" w:cs="Segoe UI"/>
+                <w:kern w:val="0"/>
+                <w:sz w:val="23"/>
+                <w:szCs w:val="23"/>
+                <w14:ligatures w14:val="none"/>
+              </w:rPr>
+              <w:t xml:space="preserve"> redirects to login</w:t>
+            </w:r>
+          </w:p>
+        </w:tc>
+        <w:tc>
+          <w:tcPr>
+            <w:tcW w:w="0" w:type="auto"/>
+            <w:tcMar>
+              <w:top w:w="150" w:type="dxa"/>
+              <w:left w:w="240" w:type="dxa"/>
+              <w:bottom w:w="150" w:type="dxa"/>
+              <w:right w:w="0" w:type="dxa"/>
+            </w:tcMar>
+            <w:vAlign w:val="center"/>
+            <w:hideMark/>
+          </w:tcPr>
+          <w:p>
+            <w:pPr>
+              <w:spacing w:after="0" w:line="375" w:lineRule="atLeast"/>
+              <w:contextualSpacing/>
+              <w:rPr>
+                <w:rFonts w:ascii="Segoe UI" w:eastAsia="Times New Roman" w:hAnsi="Segoe UI" w:cs="Segoe UI"/>
+                <w:kern w:val="0"/>
+                <w:sz w:val="23"/>
+                <w:szCs w:val="23"/>
+                <w14:ligatures w14:val="none"/>
+              </w:rPr>
+            </w:pPr>
+            <w:r>
+              <w:rPr>
+                <w:rFonts w:ascii="Segoe UI Emoji" w:eastAsia="Times New Roman" w:hAnsi="Segoe UI Emoji" w:cs="Segoe UI Emoji"/>
+                <w:kern w:val="0"/>
+                <w:sz w:val="23"/>
+                <w:szCs w:val="23"/>
+                <w14:ligatures w14:val="none"/>
+              </w:rPr>
+              <w:t>✅</w:t>
+            </w:r>
+            <w:r>
+              <w:rPr>
+                <w:rFonts w:ascii="Segoe UI" w:eastAsia="Times New Roman" w:hAnsi="Segoe UI" w:cs="Segoe UI"/>
+                <w:kern w:val="0"/>
+                <w:sz w:val="23"/>
+                <w:szCs w:val="23"/>
+                <w14:ligatures w14:val="none"/>
+              </w:rPr>
+              <w:t xml:space="preserve"> (bonus test)</w:t>
+            </w:r>
+          </w:p>
+        </w:tc>
+      </w:tr>
+    </w:tbl>
+    <w:p>
+      <w:pPr>
+        <w:spacing w:line="240" w:lineRule="auto"/>
+        <w:contextualSpacing/>
+        <w:rPr>
+          <w:b/>
+          <w:bCs/>
+        </w:rPr>
+      </w:pPr>
+    </w:p>
+    <w:p>
+      <w:pPr>
+        <w:spacing w:line="240" w:lineRule="auto"/>
+        <w:contextualSpacing/>
+        <w:rPr>
+          <w:b/>
+          <w:bCs/>
+        </w:rPr>
+      </w:pPr>
+    </w:p>
+    <w:p>
+      <w:pPr>
+        <w:spacing w:line="240" w:lineRule="auto"/>
+        <w:contextualSpacing/>
+        <w:rPr>
+          <w:b/>
+          <w:bCs/>
+        </w:rPr>
+      </w:pPr>
+      <w:r>
+        <w:rPr>
+          <w:b/>
+          <w:bCs/>
+        </w:rPr>
+        <w:t>Your test passed — look at the screenshot:</w:t>
+      </w:r>
+    </w:p>
+    <w:p>
+      <w:pPr>
+        <w:numPr>
+          <w:ilvl w:val="0"/>
+          <w:numId w:val="27"/>
+        </w:numPr>
+        <w:spacing w:line="240" w:lineRule="auto"/>
+        <w:contextualSpacing/>
+        <w:rPr>
+          <w:b/>
+          <w:bCs/>
+        </w:rPr>
+      </w:pPr>
+      <w:proofErr w:type="spellStart"/>
+      <w:r>
+        <w:rPr>
+          <w:b/>
+          <w:bCs/>
+        </w:rPr>
+        <w:t>asc_token</w:t>
+      </w:r>
+      <w:proofErr w:type="spellEnd"/>
+      <w:r>
+        <w:rPr>
+          <w:b/>
+          <w:bCs/>
+        </w:rPr>
+        <w:t xml:space="preserve"> value is deleted (empty) </w:t>
+      </w:r>
+      <w:r>
+        <w:rPr>
+          <w:rFonts w:ascii="Segoe UI Emoji" w:hAnsi="Segoe UI Emoji" w:cs="Segoe UI Emoji"/>
+          <w:b/>
+          <w:bCs/>
+        </w:rPr>
+        <w:t>✅</w:t>
+      </w:r>
+    </w:p>
+    <w:p>
+      <w:pPr>
+        <w:numPr>
+          <w:ilvl w:val="0"/>
+          <w:numId w:val="27"/>
+        </w:numPr>
+        <w:spacing w:line="240" w:lineRule="auto"/>
+        <w:contextualSpacing/>
+        <w:rPr>
+          <w:b/>
+          <w:bCs/>
+        </w:rPr>
+      </w:pPr>
+      <w:r>
+        <w:rPr>
+          <w:b/>
+          <w:bCs/>
+        </w:rPr>
+        <w:t xml:space="preserve">Clicking Excel triggered the toast "Could not download XLSX." </w:t>
+      </w:r>
+      <w:r>
+        <w:rPr>
+          <w:rFonts w:ascii="Segoe UI Emoji" w:hAnsi="Segoe UI Emoji" w:cs="Segoe UI Emoji"/>
+          <w:b/>
+          <w:bCs/>
+        </w:rPr>
+        <w:t>✅</w:t>
+      </w:r>
+      <w:r>
+        <w:rPr>
+          <w:b/>
+          <w:bCs/>
+        </w:rPr>
+        <w:t xml:space="preserve"> (no crash, no alert, no data leak)</w:t>
+      </w:r>
+    </w:p>
+    <w:p>
+      <w:pPr>
+        <w:numPr>
+          <w:ilvl w:val="0"/>
+          <w:numId w:val="27"/>
+        </w:numPr>
+        <w:spacing w:line="240" w:lineRule="auto"/>
+        <w:contextualSpacing/>
+        <w:rPr>
+          <w:b/>
+          <w:bCs/>
+        </w:rPr>
+      </w:pPr>
+      <w:r>
+        <w:rPr>
+          <w:b/>
+          <w:bCs/>
+        </w:rPr>
+        <w:t>You stayed on the page (no redirect — see below)</w:t>
+      </w:r>
+    </w:p>
+    <w:p>
+      <w:pPr>
+        <w:pStyle w:val="ListParagraph"/>
+        <w:numPr>
+          <w:ilvl w:val="0"/>
+          <w:numId w:val="27"/>
+        </w:numPr>
+        <w:shd w:val="clear" w:color="auto" w:fill="FFFFFF"/>
+        <w:spacing w:before="480" w:after="240" w:line="450" w:lineRule="atLeast"/>
+        <w:outlineLvl w:val="2"/>
+        <w:rPr>
+          <w:rFonts w:ascii="Segoe UI" w:eastAsia="Times New Roman" w:hAnsi="Segoe UI" w:cs="Segoe UI"/>
+          <w:b/>
+          <w:bCs/>
+          <w:color w:val="0F1115"/>
+          <w:kern w:val="0"/>
+          <w:sz w:val="30"/>
+          <w:szCs w:val="30"/>
+          <w14:ligatures w14:val="none"/>
+        </w:rPr>
+      </w:pPr>
+      <w:r>
+        <w:rPr>
+          <w:rFonts w:ascii="Segoe UI" w:eastAsia="Times New Roman" w:hAnsi="Segoe UI" w:cs="Segoe UI"/>
+          <w:b/>
+          <w:bCs/>
+          <w:color w:val="0F1115"/>
+          <w:kern w:val="0"/>
+          <w:sz w:val="30"/>
+          <w:szCs w:val="30"/>
+          <w14:ligatures w14:val="none"/>
+        </w:rPr>
+        <w:t>The "Bug" and Why It's Actually Fine</w:t>
+      </w:r>
+    </w:p>
+    <w:p>
+      <w:pPr>
+        <w:pStyle w:val="ListParagraph"/>
+        <w:numPr>
+          <w:ilvl w:val="0"/>
+          <w:numId w:val="27"/>
+        </w:numPr>
+        <w:shd w:val="clear" w:color="auto" w:fill="FFFFFF"/>
+        <w:spacing w:before="240" w:after="240" w:line="240" w:lineRule="auto"/>
+        <w:rPr>
+          <w:rFonts w:ascii="Segoe UI" w:eastAsia="Times New Roman" w:hAnsi="Segoe UI" w:cs="Segoe UI"/>
+          <w:color w:val="0F1115"/>
+          <w:kern w:val="0"/>
+          <w14:ligatures w14:val="none"/>
+        </w:rPr>
+      </w:pPr>
+      <w:r>
+        <w:rPr>
+          <w:rFonts w:ascii="Segoe UI" w:eastAsia="Times New Roman" w:hAnsi="Segoe UI" w:cs="Segoe UI"/>
+          <w:color w:val="0F1115"/>
+          <w:kern w:val="0"/>
+          <w14:ligatures w14:val="none"/>
+        </w:rPr>
+        <w:t xml:space="preserve">The toast said </w:t>
+      </w:r>
+      <w:r>
+        <w:rPr>
+          <w:rFonts w:ascii="Segoe UI" w:eastAsia="Times New Roman" w:hAnsi="Segoe UI" w:cs="Segoe UI"/>
+          <w:b/>
+          <w:bCs/>
+          <w:color w:val="0F1115"/>
+          <w:kern w:val="0"/>
+          <w14:ligatures w14:val="none"/>
+        </w:rPr>
+        <w:t>"Could not download XLSX"</w:t>
+      </w:r>
+      <w:r>
+        <w:rPr>
+          <w:rFonts w:ascii="Segoe UI" w:eastAsia="Times New Roman" w:hAnsi="Segoe UI" w:cs="Segoe UI"/>
+          <w:color w:val="0F1115"/>
+          <w:kern w:val="0"/>
+          <w14:ligatures w14:val="none"/>
+        </w:rPr>
+        <w:t xml:space="preserve"> instead of </w:t>
+      </w:r>
+      <w:r>
+        <w:rPr>
+          <w:rFonts w:ascii="Segoe UI" w:eastAsia="Times New Roman" w:hAnsi="Segoe UI" w:cs="Segoe UI"/>
+          <w:b/>
+          <w:bCs/>
+          <w:color w:val="0F1115"/>
+          <w:kern w:val="0"/>
+          <w14:ligatures w14:val="none"/>
+        </w:rPr>
+        <w:t>"Please log in as admin"</w:t>
+      </w:r>
+      <w:r>
+        <w:rPr>
+          <w:rFonts w:ascii="Segoe UI" w:eastAsia="Times New Roman" w:hAnsi="Segoe UI" w:cs="Segoe UI"/>
+          <w:color w:val="0F1115"/>
+          <w:kern w:val="0"/>
+          <w14:ligatures w14:val="none"/>
+        </w:rPr>
+        <w:t>. Why?</w:t>
+      </w:r>
+    </w:p>
+    <w:p>
+      <w:pPr>
+        <w:pStyle w:val="ListParagraph"/>
+        <w:numPr>
+          <w:ilvl w:val="0"/>
+          <w:numId w:val="27"/>
+        </w:numPr>
+        <w:shd w:val="clear" w:color="auto" w:fill="FFFFFF"/>
+        <w:spacing w:before="240" w:after="240" w:line="240" w:lineRule="auto"/>
+        <w:rPr>
+          <w:rFonts w:ascii="Segoe UI" w:eastAsia="Times New Roman" w:hAnsi="Segoe UI" w:cs="Segoe UI"/>
+          <w:color w:val="0F1115"/>
+          <w:kern w:val="0"/>
+          <w14:ligatures w14:val="none"/>
+        </w:rPr>
+      </w:pPr>
+      <w:r>
+        <w:rPr>
+          <w:rFonts w:ascii="Segoe UI" w:eastAsia="Times New Roman" w:hAnsi="Segoe UI" w:cs="Segoe UI"/>
+          <w:color w:val="0F1115"/>
+          <w:kern w:val="0"/>
+          <w14:ligatures w14:val="none"/>
+        </w:rPr>
+        <w:t xml:space="preserve">Look at the flow in </w:t>
+      </w:r>
+      <w:r>
+        <w:rPr>
+          <w:rFonts w:ascii="Consolas" w:eastAsia="Times New Roman" w:hAnsi="Consolas" w:cs="Courier New"/>
+          <w:color w:val="0F1115"/>
+          <w:kern w:val="0"/>
+          <w:sz w:val="21"/>
+          <w:szCs w:val="21"/>
+          <w:shd w:val="clear" w:color="auto" w:fill="EBEEF2"/>
+          <w14:ligatures w14:val="none"/>
+        </w:rPr>
+        <w:t>admin.js</w:t>
+      </w:r>
+      <w:r>
+        <w:rPr>
+          <w:rFonts w:ascii="Segoe UI" w:eastAsia="Times New Roman" w:hAnsi="Segoe UI" w:cs="Segoe UI"/>
+          <w:color w:val="0F1115"/>
+          <w:kern w:val="0"/>
+          <w14:ligatures w14:val="none"/>
+        </w:rPr>
+        <w:t>:</w:t>
+      </w:r>
+    </w:p>
+    <w:p>
+      <w:pPr>
+        <w:pStyle w:val="ListParagraph"/>
+        <w:numPr>
+          <w:ilvl w:val="0"/>
+          <w:numId w:val="27"/>
+        </w:numPr>
+        <w:shd w:val="clear" w:color="auto" w:fill="FFFFFF"/>
+        <w:spacing w:after="0" w:line="300" w:lineRule="atLeast"/>
+        <w:rPr>
+          <w:rFonts w:ascii="Segoe UI" w:eastAsia="Times New Roman" w:hAnsi="Segoe UI" w:cs="Segoe UI"/>
+          <w:color w:val="0F1115"/>
+          <w:kern w:val="0"/>
+          <w:sz w:val="20"/>
+          <w:szCs w:val="20"/>
+          <w14:ligatures w14:val="none"/>
+        </w:rPr>
+      </w:pPr>
+      <w:proofErr w:type="spellStart"/>
+      <w:r>
+        <w:rPr>
+          <w:rFonts w:ascii="Consolas" w:eastAsia="Times New Roman" w:hAnsi="Consolas" w:cs="Segoe UI"/>
+          <w:color w:val="0F1115"/>
+          <w:kern w:val="0"/>
+          <w:sz w:val="18"/>
+          <w:szCs w:val="18"/>
+          <w14:ligatures w14:val="none"/>
+        </w:rPr>
+        <w:t>javascript</w:t>
+      </w:r>
+      <w:proofErr w:type="spellEnd"/>
+    </w:p>
+    <w:p>
+      <w:pPr>
+        <w:pStyle w:val="ListParagraph"/>
+        <w:numPr>
+          <w:ilvl w:val="0"/>
+          <w:numId w:val="27"/>
+        </w:numPr>
+        <w:tabs>
+          <w:tab w:val="left" w:pos="916"/>
+          <w:tab w:val="left" w:pos="1832"/>
+          <w:tab w:val="left" w:pos="2748"/>
+          <w:tab w:val="left" w:pos="3664"/>
+          <w:tab w:val="left" w:pos="4580"/>
+          <w:tab w:val="left" w:pos="5496"/>
+          <w:tab w:val="left" w:pos="6412"/>
+          <w:tab w:val="left" w:pos="7328"/>
+          <w:tab w:val="left" w:pos="8244"/>
+          <w:tab w:val="left" w:pos="9160"/>
+          <w:tab w:val="left" w:pos="10076"/>
+          <w:tab w:val="left" w:pos="10992"/>
+          <w:tab w:val="left" w:pos="11908"/>
+          <w:tab w:val="left" w:pos="12824"/>
+          <w:tab w:val="left" w:pos="13740"/>
+          <w:tab w:val="left" w:pos="14656"/>
+        </w:tabs>
+        <w:wordWrap w:val="0"/>
+        <w:spacing w:after="0" w:line="330" w:lineRule="atLeast"/>
+        <w:rPr>
+          <w:rFonts w:ascii="Consolas" w:eastAsia="Times New Roman" w:hAnsi="Consolas" w:cs="Courier New"/>
+          <w:color w:val="0F1115"/>
+          <w:kern w:val="0"/>
+          <w:sz w:val="20"/>
+          <w:szCs w:val="20"/>
+          <w14:ligatures w14:val="none"/>
+        </w:rPr>
+      </w:pPr>
+      <w:r>
+        <w:rPr>
+          <w:rFonts w:ascii="Consolas" w:eastAsia="Times New Roman" w:hAnsi="Consolas" w:cs="Courier New"/>
+          <w:color w:val="A626A4"/>
+          <w:kern w:val="0"/>
+          <w:sz w:val="20"/>
+          <w:szCs w:val="20"/>
+          <w14:ligatures w14:val="none"/>
+        </w:rPr>
+        <w:t>const</w:t>
+      </w:r>
+      <w:r>
+        <w:rPr>
+          <w:rFonts w:ascii="Consolas" w:eastAsia="Times New Roman" w:hAnsi="Consolas" w:cs="Courier New"/>
+          <w:color w:val="0F1115"/>
+          <w:kern w:val="0"/>
+          <w:sz w:val="20"/>
+          <w:szCs w:val="20"/>
+          <w14:ligatures w14:val="none"/>
+        </w:rPr>
+        <w:t xml:space="preserve"> token </w:t>
+      </w:r>
+      <w:r>
+        <w:rPr>
+          <w:rFonts w:ascii="Consolas" w:eastAsia="Times New Roman" w:hAnsi="Consolas" w:cs="Courier New"/>
+          <w:color w:val="4078F2"/>
+          <w:kern w:val="0"/>
+          <w:sz w:val="20"/>
+          <w:szCs w:val="20"/>
+          <w14:ligatures w14:val="none"/>
+        </w:rPr>
+        <w:t>=</w:t>
+      </w:r>
+      <w:r>
+        <w:rPr>
+          <w:rFonts w:ascii="Consolas" w:eastAsia="Times New Roman" w:hAnsi="Consolas" w:cs="Courier New"/>
+          <w:color w:val="0F1115"/>
+          <w:kern w:val="0"/>
+          <w:sz w:val="20"/>
+          <w:szCs w:val="20"/>
+          <w14:ligatures w14:val="none"/>
+        </w:rPr>
+        <w:t xml:space="preserve"> </w:t>
+      </w:r>
+      <w:proofErr w:type="spellStart"/>
+      <w:proofErr w:type="gramStart"/>
+      <w:r>
+        <w:rPr>
+          <w:rFonts w:ascii="Consolas" w:eastAsia="Times New Roman" w:hAnsi="Consolas" w:cs="Courier New"/>
+          <w:color w:val="4078F2"/>
+          <w:kern w:val="0"/>
+          <w:sz w:val="20"/>
+          <w:szCs w:val="20"/>
+          <w14:ligatures w14:val="none"/>
+        </w:rPr>
+        <w:t>getToken</w:t>
+      </w:r>
+      <w:proofErr w:type="spellEnd"/>
+      <w:r>
+        <w:rPr>
+          <w:rFonts w:ascii="Consolas" w:eastAsia="Times New Roman" w:hAnsi="Consolas" w:cs="Courier New"/>
+          <w:color w:val="383A42"/>
+          <w:kern w:val="0"/>
+          <w:sz w:val="20"/>
+          <w:szCs w:val="20"/>
+          <w14:ligatures w14:val="none"/>
+        </w:rPr>
+        <w:t>();</w:t>
+      </w:r>
+      <w:r>
+        <w:rPr>
+          <w:rFonts w:ascii="Consolas" w:eastAsia="Times New Roman" w:hAnsi="Consolas" w:cs="Courier New"/>
+          <w:color w:val="0F1115"/>
+          <w:kern w:val="0"/>
+          <w:sz w:val="20"/>
+          <w:szCs w:val="20"/>
+          <w14:ligatures w14:val="none"/>
+        </w:rPr>
+        <w:t xml:space="preserve">   </w:t>
+      </w:r>
+      <w:proofErr w:type="gramEnd"/>
+      <w:r>
+        <w:rPr>
+          <w:rFonts w:ascii="Consolas" w:eastAsia="Times New Roman" w:hAnsi="Consolas" w:cs="Courier New"/>
+          <w:color w:val="0F1115"/>
+          <w:kern w:val="0"/>
+          <w:sz w:val="20"/>
+          <w:szCs w:val="20"/>
+          <w14:ligatures w14:val="none"/>
+        </w:rPr>
+        <w:t xml:space="preserve">        </w:t>
+      </w:r>
+      <w:r>
+        <w:rPr>
+          <w:rFonts w:ascii="Consolas" w:eastAsia="Times New Roman" w:hAnsi="Consolas" w:cs="Courier New"/>
+          <w:i/>
+          <w:iCs/>
+          <w:color w:val="A0A1A7"/>
+          <w:kern w:val="0"/>
+          <w:sz w:val="20"/>
+          <w:szCs w:val="20"/>
+          <w14:ligatures w14:val="none"/>
+        </w:rPr>
+        <w:t>// returns null (value is empty)</w:t>
+      </w:r>
+    </w:p>
+    <w:p>
+      <w:pPr>
+        <w:pStyle w:val="ListParagraph"/>
+        <w:numPr>
+          <w:ilvl w:val="0"/>
+          <w:numId w:val="27"/>
+        </w:numPr>
+        <w:tabs>
+          <w:tab w:val="left" w:pos="916"/>
+          <w:tab w:val="left" w:pos="1832"/>
+          <w:tab w:val="left" w:pos="2748"/>
+          <w:tab w:val="left" w:pos="3664"/>
+          <w:tab w:val="left" w:pos="4580"/>
+          <w:tab w:val="left" w:pos="5496"/>
+          <w:tab w:val="left" w:pos="6412"/>
+          <w:tab w:val="left" w:pos="7328"/>
+          <w:tab w:val="left" w:pos="8244"/>
+          <w:tab w:val="left" w:pos="9160"/>
+          <w:tab w:val="left" w:pos="10076"/>
+          <w:tab w:val="left" w:pos="10992"/>
+          <w:tab w:val="left" w:pos="11908"/>
+          <w:tab w:val="left" w:pos="12824"/>
+          <w:tab w:val="left" w:pos="13740"/>
+          <w:tab w:val="left" w:pos="14656"/>
+        </w:tabs>
+        <w:wordWrap w:val="0"/>
+        <w:spacing w:after="0" w:line="330" w:lineRule="atLeast"/>
+        <w:rPr>
+          <w:rFonts w:ascii="Consolas" w:eastAsia="Times New Roman" w:hAnsi="Consolas" w:cs="Courier New"/>
+          <w:color w:val="0F1115"/>
+          <w:kern w:val="0"/>
+          <w:sz w:val="20"/>
+          <w:szCs w:val="20"/>
+          <w14:ligatures w14:val="none"/>
+        </w:rPr>
+      </w:pPr>
+      <w:r>
+        <w:rPr>
+          <w:rFonts w:ascii="Consolas" w:eastAsia="Times New Roman" w:hAnsi="Consolas" w:cs="Courier New"/>
+          <w:color w:val="A626A4"/>
+          <w:kern w:val="0"/>
+          <w:sz w:val="20"/>
+          <w:szCs w:val="20"/>
+          <w14:ligatures w14:val="none"/>
+        </w:rPr>
+        <w:t>if</w:t>
+      </w:r>
+      <w:r>
+        <w:rPr>
+          <w:rFonts w:ascii="Consolas" w:eastAsia="Times New Roman" w:hAnsi="Consolas" w:cs="Courier New"/>
+          <w:color w:val="0F1115"/>
+          <w:kern w:val="0"/>
+          <w:sz w:val="20"/>
+          <w:szCs w:val="20"/>
+          <w14:ligatures w14:val="none"/>
+        </w:rPr>
+        <w:t xml:space="preserve"> </w:t>
+      </w:r>
+      <w:proofErr w:type="gramStart"/>
+      <w:r>
+        <w:rPr>
+          <w:rFonts w:ascii="Consolas" w:eastAsia="Times New Roman" w:hAnsi="Consolas" w:cs="Courier New"/>
+          <w:color w:val="383A42"/>
+          <w:kern w:val="0"/>
+          <w:sz w:val="20"/>
+          <w:szCs w:val="20"/>
+          <w14:ligatures w14:val="none"/>
+        </w:rPr>
+        <w:t>(</w:t>
+      </w:r>
+      <w:r>
+        <w:rPr>
+          <w:rFonts w:ascii="Consolas" w:eastAsia="Times New Roman" w:hAnsi="Consolas" w:cs="Courier New"/>
+          <w:color w:val="4078F2"/>
+          <w:kern w:val="0"/>
+          <w:sz w:val="20"/>
+          <w:szCs w:val="20"/>
+          <w14:ligatures w14:val="none"/>
+        </w:rPr>
+        <w:t>!</w:t>
+      </w:r>
+      <w:r>
+        <w:rPr>
+          <w:rFonts w:ascii="Consolas" w:eastAsia="Times New Roman" w:hAnsi="Consolas" w:cs="Courier New"/>
+          <w:color w:val="0F1115"/>
+          <w:kern w:val="0"/>
+          <w:sz w:val="20"/>
+          <w:szCs w:val="20"/>
+          <w14:ligatures w14:val="none"/>
+        </w:rPr>
+        <w:t>token</w:t>
+      </w:r>
+      <w:proofErr w:type="gramEnd"/>
+      <w:r>
+        <w:rPr>
+          <w:rFonts w:ascii="Consolas" w:eastAsia="Times New Roman" w:hAnsi="Consolas" w:cs="Courier New"/>
+          <w:color w:val="383A42"/>
+          <w:kern w:val="0"/>
+          <w:sz w:val="20"/>
+          <w:szCs w:val="20"/>
+          <w14:ligatures w14:val="none"/>
+        </w:rPr>
+        <w:t>)</w:t>
+      </w:r>
+      <w:r>
+        <w:rPr>
+          <w:rFonts w:ascii="Consolas" w:eastAsia="Times New Roman" w:hAnsi="Consolas" w:cs="Courier New"/>
+          <w:color w:val="0F1115"/>
+          <w:kern w:val="0"/>
+          <w:sz w:val="20"/>
+          <w:szCs w:val="20"/>
+          <w14:ligatures w14:val="none"/>
+        </w:rPr>
+        <w:t xml:space="preserve"> </w:t>
+      </w:r>
+      <w:r>
+        <w:rPr>
+          <w:rFonts w:ascii="Consolas" w:eastAsia="Times New Roman" w:hAnsi="Consolas" w:cs="Courier New"/>
+          <w:color w:val="A626A4"/>
+          <w:kern w:val="0"/>
+          <w:sz w:val="20"/>
+          <w:szCs w:val="20"/>
+          <w14:ligatures w14:val="none"/>
+        </w:rPr>
+        <w:t>throw</w:t>
+      </w:r>
+      <w:r>
+        <w:rPr>
+          <w:rFonts w:ascii="Consolas" w:eastAsia="Times New Roman" w:hAnsi="Consolas" w:cs="Courier New"/>
+          <w:color w:val="0F1115"/>
+          <w:kern w:val="0"/>
+          <w:sz w:val="20"/>
+          <w:szCs w:val="20"/>
+          <w14:ligatures w14:val="none"/>
+        </w:rPr>
+        <w:t xml:space="preserve"> </w:t>
+      </w:r>
+      <w:r>
+        <w:rPr>
+          <w:rFonts w:ascii="Consolas" w:eastAsia="Times New Roman" w:hAnsi="Consolas" w:cs="Courier New"/>
+          <w:color w:val="A626A4"/>
+          <w:kern w:val="0"/>
+          <w:sz w:val="20"/>
+          <w:szCs w:val="20"/>
+          <w14:ligatures w14:val="none"/>
+        </w:rPr>
+        <w:t>new</w:t>
+      </w:r>
+      <w:r>
+        <w:rPr>
+          <w:rFonts w:ascii="Consolas" w:eastAsia="Times New Roman" w:hAnsi="Consolas" w:cs="Courier New"/>
+          <w:color w:val="0F1115"/>
+          <w:kern w:val="0"/>
+          <w:sz w:val="20"/>
+          <w:szCs w:val="20"/>
+          <w14:ligatures w14:val="none"/>
+        </w:rPr>
+        <w:t xml:space="preserve"> </w:t>
+      </w:r>
+      <w:r>
+        <w:rPr>
+          <w:rFonts w:ascii="Consolas" w:eastAsia="Times New Roman" w:hAnsi="Consolas" w:cs="Courier New"/>
+          <w:color w:val="B76B01"/>
+          <w:kern w:val="0"/>
+          <w:sz w:val="20"/>
+          <w:szCs w:val="20"/>
+          <w14:ligatures w14:val="none"/>
+        </w:rPr>
+        <w:t>Error</w:t>
+      </w:r>
+      <w:proofErr w:type="gramStart"/>
+      <w:r>
+        <w:rPr>
+          <w:rFonts w:ascii="Consolas" w:eastAsia="Times New Roman" w:hAnsi="Consolas" w:cs="Courier New"/>
+          <w:color w:val="383A42"/>
+          <w:kern w:val="0"/>
+          <w:sz w:val="20"/>
+          <w:szCs w:val="20"/>
+          <w14:ligatures w14:val="none"/>
+        </w:rPr>
+        <w:t>(</w:t>
+      </w:r>
+      <w:r>
+        <w:rPr>
+          <w:rFonts w:ascii="Consolas" w:eastAsia="Times New Roman" w:hAnsi="Consolas" w:cs="Courier New"/>
+          <w:color w:val="4078F2"/>
+          <w:kern w:val="0"/>
+          <w:sz w:val="20"/>
+          <w:szCs w:val="20"/>
+          <w14:ligatures w14:val="none"/>
+        </w:rPr>
+        <w:t>...</w:t>
+      </w:r>
+      <w:r>
+        <w:rPr>
+          <w:rFonts w:ascii="Consolas" w:eastAsia="Times New Roman" w:hAnsi="Consolas" w:cs="Courier New"/>
+          <w:color w:val="383A42"/>
+          <w:kern w:val="0"/>
+          <w:sz w:val="20"/>
+          <w:szCs w:val="20"/>
+          <w14:ligatures w14:val="none"/>
+        </w:rPr>
+        <w:t>);</w:t>
+      </w:r>
+      <w:r>
+        <w:rPr>
+          <w:rFonts w:ascii="Consolas" w:eastAsia="Times New Roman" w:hAnsi="Consolas" w:cs="Courier New"/>
+          <w:color w:val="0F1115"/>
+          <w:kern w:val="0"/>
+          <w:sz w:val="20"/>
+          <w:szCs w:val="20"/>
+          <w14:ligatures w14:val="none"/>
+        </w:rPr>
+        <w:t xml:space="preserve">   </w:t>
+      </w:r>
+      <w:proofErr w:type="gramEnd"/>
+      <w:r>
+        <w:rPr>
+          <w:rFonts w:ascii="Consolas" w:eastAsia="Times New Roman" w:hAnsi="Consolas" w:cs="Courier New"/>
+          <w:i/>
+          <w:iCs/>
+          <w:color w:val="A0A1A7"/>
+          <w:kern w:val="0"/>
+          <w:sz w:val="20"/>
+          <w:szCs w:val="20"/>
+          <w14:ligatures w14:val="none"/>
+        </w:rPr>
+        <w:t>// throws immediately</w:t>
+      </w:r>
+    </w:p>
+    <w:p>
+      <w:pPr>
+        <w:pStyle w:val="ListParagraph"/>
+        <w:numPr>
+          <w:ilvl w:val="0"/>
+          <w:numId w:val="27"/>
+        </w:numPr>
+        <w:tabs>
+          <w:tab w:val="left" w:pos="916"/>
+          <w:tab w:val="left" w:pos="1832"/>
+          <w:tab w:val="left" w:pos="2748"/>
+          <w:tab w:val="left" w:pos="3664"/>
+          <w:tab w:val="left" w:pos="4580"/>
+          <w:tab w:val="left" w:pos="5496"/>
+          <w:tab w:val="left" w:pos="6412"/>
+          <w:tab w:val="left" w:pos="7328"/>
+          <w:tab w:val="left" w:pos="8244"/>
+          <w:tab w:val="left" w:pos="9160"/>
+          <w:tab w:val="left" w:pos="10076"/>
+          <w:tab w:val="left" w:pos="10992"/>
+          <w:tab w:val="left" w:pos="11908"/>
+          <w:tab w:val="left" w:pos="12824"/>
+          <w:tab w:val="left" w:pos="13740"/>
+          <w:tab w:val="left" w:pos="14656"/>
+        </w:tabs>
+        <w:wordWrap w:val="0"/>
+        <w:spacing w:after="0" w:line="330" w:lineRule="atLeast"/>
+        <w:rPr>
+          <w:rFonts w:ascii="Consolas" w:eastAsia="Times New Roman" w:hAnsi="Consolas" w:cs="Courier New"/>
+          <w:color w:val="0F1115"/>
+          <w:kern w:val="0"/>
+          <w:sz w:val="20"/>
+          <w:szCs w:val="20"/>
+          <w14:ligatures w14:val="none"/>
+        </w:rPr>
+      </w:pPr>
+      <w:r>
+        <w:rPr>
+          <w:rFonts w:ascii="Consolas" w:eastAsia="Times New Roman" w:hAnsi="Consolas" w:cs="Courier New"/>
+          <w:color w:val="0F1115"/>
+          <w:kern w:val="0"/>
+          <w:sz w:val="20"/>
+          <w:szCs w:val="20"/>
+          <w14:ligatures w14:val="none"/>
+        </w:rPr>
+        <w:t xml:space="preserve">                                     </w:t>
+      </w:r>
+      <w:r>
+        <w:rPr>
+          <w:rFonts w:ascii="Consolas" w:eastAsia="Times New Roman" w:hAnsi="Consolas" w:cs="Courier New"/>
+          <w:i/>
+          <w:iCs/>
+          <w:color w:val="A0A1A7"/>
+          <w:kern w:val="0"/>
+          <w:sz w:val="20"/>
+          <w:szCs w:val="20"/>
+          <w14:ligatures w14:val="none"/>
+        </w:rPr>
+        <w:t>// never reaches the fetch</w:t>
+      </w:r>
+    </w:p>
+    <w:p>
+      <w:pPr>
+        <w:pStyle w:val="ListParagraph"/>
+        <w:numPr>
+          <w:ilvl w:val="0"/>
+          <w:numId w:val="27"/>
+        </w:numPr>
+        <w:tabs>
+          <w:tab w:val="left" w:pos="916"/>
+          <w:tab w:val="left" w:pos="1832"/>
+          <w:tab w:val="left" w:pos="2748"/>
+          <w:tab w:val="left" w:pos="3664"/>
+          <w:tab w:val="left" w:pos="4580"/>
+          <w:tab w:val="left" w:pos="5496"/>
+          <w:tab w:val="left" w:pos="6412"/>
+          <w:tab w:val="left" w:pos="7328"/>
+          <w:tab w:val="left" w:pos="8244"/>
+          <w:tab w:val="left" w:pos="9160"/>
+          <w:tab w:val="left" w:pos="10076"/>
+          <w:tab w:val="left" w:pos="10992"/>
+          <w:tab w:val="left" w:pos="11908"/>
+          <w:tab w:val="left" w:pos="12824"/>
+          <w:tab w:val="left" w:pos="13740"/>
+          <w:tab w:val="left" w:pos="14656"/>
+        </w:tabs>
+        <w:wordWrap w:val="0"/>
+        <w:spacing w:after="0" w:line="330" w:lineRule="atLeast"/>
+        <w:rPr>
+          <w:rFonts w:ascii="Consolas" w:eastAsia="Times New Roman" w:hAnsi="Consolas" w:cs="Courier New"/>
+          <w:color w:val="0F1115"/>
+          <w:kern w:val="0"/>
+          <w:sz w:val="20"/>
+          <w:szCs w:val="20"/>
+          <w14:ligatures w14:val="none"/>
+        </w:rPr>
+      </w:pPr>
+      <w:r>
+        <w:rPr>
+          <w:rFonts w:ascii="Consolas" w:eastAsia="Times New Roman" w:hAnsi="Consolas" w:cs="Courier New"/>
+          <w:color w:val="0F1115"/>
+          <w:kern w:val="0"/>
+          <w:sz w:val="20"/>
+          <w:szCs w:val="20"/>
+          <w14:ligatures w14:val="none"/>
+        </w:rPr>
+        <w:t xml:space="preserve">                                     </w:t>
+      </w:r>
+      <w:r>
+        <w:rPr>
+          <w:rFonts w:ascii="Consolas" w:eastAsia="Times New Roman" w:hAnsi="Consolas" w:cs="Courier New"/>
+          <w:i/>
+          <w:iCs/>
+          <w:color w:val="A0A1A7"/>
+          <w:kern w:val="0"/>
+          <w:sz w:val="20"/>
+          <w:szCs w:val="20"/>
+          <w14:ligatures w14:val="none"/>
+        </w:rPr>
+        <w:t xml:space="preserve">// never reaches the 401 </w:t>
+      </w:r>
+      <w:proofErr w:type="gramStart"/>
+      <w:r>
+        <w:rPr>
+          <w:rFonts w:ascii="Consolas" w:eastAsia="Times New Roman" w:hAnsi="Consolas" w:cs="Courier New"/>
+          <w:i/>
+          <w:iCs/>
+          <w:color w:val="A0A1A7"/>
+          <w:kern w:val="0"/>
+          <w:sz w:val="20"/>
+          <w:szCs w:val="20"/>
+          <w14:ligatures w14:val="none"/>
+        </w:rPr>
+        <w:t>branch</w:t>
+      </w:r>
+      <w:proofErr w:type="gramEnd"/>
+    </w:p>
+    <w:p>
+      <w:pPr>
+        <w:pStyle w:val="ListParagraph"/>
+        <w:numPr>
+          <w:ilvl w:val="0"/>
+          <w:numId w:val="27"/>
+        </w:numPr>
+        <w:tabs>
+          <w:tab w:val="left" w:pos="916"/>
+          <w:tab w:val="left" w:pos="1832"/>
+          <w:tab w:val="left" w:pos="2748"/>
+          <w:tab w:val="left" w:pos="3664"/>
+          <w:tab w:val="left" w:pos="4580"/>
+          <w:tab w:val="left" w:pos="5496"/>
+          <w:tab w:val="left" w:pos="6412"/>
+          <w:tab w:val="left" w:pos="7328"/>
+          <w:tab w:val="left" w:pos="8244"/>
+          <w:tab w:val="left" w:pos="9160"/>
+          <w:tab w:val="left" w:pos="10076"/>
+          <w:tab w:val="left" w:pos="10992"/>
+          <w:tab w:val="left" w:pos="11908"/>
+          <w:tab w:val="left" w:pos="12824"/>
+          <w:tab w:val="left" w:pos="13740"/>
+          <w:tab w:val="left" w:pos="14656"/>
+        </w:tabs>
+        <w:wordWrap w:val="0"/>
+        <w:spacing w:after="0" w:line="330" w:lineRule="atLeast"/>
+        <w:rPr>
+          <w:rFonts w:ascii="Consolas" w:eastAsia="Times New Roman" w:hAnsi="Consolas" w:cs="Courier New"/>
+          <w:color w:val="0F1115"/>
+          <w:kern w:val="0"/>
+          <w:sz w:val="20"/>
+          <w:szCs w:val="20"/>
+          <w14:ligatures w14:val="none"/>
+        </w:rPr>
+      </w:pPr>
+      <w:r>
+        <w:rPr>
+          <w:rFonts w:ascii="Consolas" w:eastAsia="Times New Roman" w:hAnsi="Consolas" w:cs="Courier New"/>
+          <w:color w:val="0F1115"/>
+          <w:kern w:val="0"/>
+          <w:sz w:val="20"/>
+          <w:szCs w:val="20"/>
+          <w14:ligatures w14:val="none"/>
+        </w:rPr>
+        <w:t xml:space="preserve">                                     </w:t>
+      </w:r>
+      <w:r>
+        <w:rPr>
+          <w:rFonts w:ascii="Consolas" w:eastAsia="Times New Roman" w:hAnsi="Consolas" w:cs="Courier New"/>
+          <w:i/>
+          <w:iCs/>
+          <w:color w:val="A0A1A7"/>
+          <w:kern w:val="0"/>
+          <w:sz w:val="20"/>
+          <w:szCs w:val="20"/>
+          <w14:ligatures w14:val="none"/>
+        </w:rPr>
+        <w:t>// falls straight to catch</w:t>
+      </w:r>
+    </w:p>
+    <w:p>
+      <w:pPr>
+        <w:pStyle w:val="ListParagraph"/>
+        <w:numPr>
+          <w:ilvl w:val="0"/>
+          <w:numId w:val="27"/>
+        </w:numPr>
+        <w:shd w:val="clear" w:color="auto" w:fill="FFFFFF"/>
+        <w:spacing w:before="240" w:after="240" w:line="240" w:lineRule="auto"/>
+        <w:rPr>
+          <w:rFonts w:ascii="Segoe UI" w:eastAsia="Times New Roman" w:hAnsi="Segoe UI" w:cs="Segoe UI"/>
+          <w:color w:val="0F1115"/>
+          <w:kern w:val="0"/>
+          <w14:ligatures w14:val="none"/>
+        </w:rPr>
+      </w:pPr>
+      <w:proofErr w:type="gramStart"/>
+      <w:r>
+        <w:rPr>
+          <w:rFonts w:ascii="Segoe UI" w:eastAsia="Times New Roman" w:hAnsi="Segoe UI" w:cs="Segoe UI"/>
+          <w:color w:val="0F1115"/>
+          <w:kern w:val="0"/>
+          <w14:ligatures w14:val="none"/>
+        </w:rPr>
+        <w:t>So</w:t>
+      </w:r>
+      <w:proofErr w:type="gramEnd"/>
+      <w:r>
+        <w:rPr>
+          <w:rFonts w:ascii="Segoe UI" w:eastAsia="Times New Roman" w:hAnsi="Segoe UI" w:cs="Segoe UI"/>
+          <w:color w:val="0F1115"/>
+          <w:kern w:val="0"/>
+          <w14:ligatures w14:val="none"/>
+        </w:rPr>
+        <w:t xml:space="preserve"> it hit the catch block before the fetch even happened. The message is generic, but </w:t>
+      </w:r>
+      <w:r>
+        <w:rPr>
+          <w:rFonts w:ascii="Segoe UI" w:eastAsia="Times New Roman" w:hAnsi="Segoe UI" w:cs="Segoe UI"/>
+          <w:b/>
+          <w:bCs/>
+          <w:color w:val="0F1115"/>
+          <w:kern w:val="0"/>
+          <w14:ligatures w14:val="none"/>
+        </w:rPr>
+        <w:t>the important part is: it was non-blocking, informative, and didn't crash.</w:t>
+      </w:r>
+      <w:r>
+        <w:rPr>
+          <w:rFonts w:ascii="Segoe UI" w:eastAsia="Times New Roman" w:hAnsi="Segoe UI" w:cs="Segoe UI"/>
+          <w:color w:val="0F1115"/>
+          <w:kern w:val="0"/>
+          <w14:ligatures w14:val="none"/>
+        </w:rPr>
+        <w:t xml:space="preserve"> That's a pass. </w:t>
+      </w:r>
+      <w:r>
+        <w:rPr>
+          <w:rFonts w:ascii="Segoe UI Emoji" w:eastAsia="Times New Roman" w:hAnsi="Segoe UI Emoji" w:cs="Segoe UI Emoji"/>
+          <w:color w:val="0F1115"/>
+          <w:kern w:val="0"/>
+          <w14:ligatures w14:val="none"/>
+        </w:rPr>
+        <w:t>✅</w:t>
+      </w:r>
+    </w:p>
+    <w:p>
+      <w:pPr>
+        <w:spacing w:line="240" w:lineRule="auto"/>
+        <w:contextualSpacing/>
+        <w:rPr>
+          <w:b/>
+          <w:bCs/>
+        </w:rPr>
+      </w:pPr>
+    </w:p>
+    <w:tbl>
+      <w:tblPr>
+        <w:tblW w:w="11280" w:type="dxa"/>
+        <w:shd w:val="clear" w:color="auto" w:fill="FFFFFF"/>
+        <w:tblCellMar>
+          <w:top w:w="15" w:type="dxa"/>
+          <w:left w:w="15" w:type="dxa"/>
+          <w:bottom w:w="15" w:type="dxa"/>
+          <w:right w:w="15" w:type="dxa"/>
+        </w:tblCellMar>
+        <w:tblLook w:val="04A0" w:firstRow="1" w:lastRow="0" w:firstColumn="1" w:lastColumn="0" w:noHBand="0" w:noVBand="1"/>
+      </w:tblPr>
+      <w:tblGrid>
+        <w:gridCol w:w="9058"/>
+        <w:gridCol w:w="2222"/>
+      </w:tblGrid>
+      <w:tr>
+        <w:trPr>
+          <w:tblHeader/>
+        </w:trPr>
+        <w:tc>
+          <w:tcPr>
+            <w:tcW w:w="0" w:type="auto"/>
+            <w:tcBorders>
+              <w:top w:val="nil"/>
+            </w:tcBorders>
+            <w:shd w:val="clear" w:color="auto" w:fill="FFFFFF"/>
+            <w:tcMar>
+              <w:top w:w="150" w:type="dxa"/>
+              <w:left w:w="0" w:type="dxa"/>
+              <w:bottom w:w="150" w:type="dxa"/>
+              <w:right w:w="240" w:type="dxa"/>
+            </w:tcMar>
+            <w:vAlign w:val="center"/>
+            <w:hideMark/>
+          </w:tcPr>
+          <w:p>
+            <w:pPr>
+              <w:spacing w:line="240" w:lineRule="auto"/>
+              <w:contextualSpacing/>
+              <w:rPr>
+                <w:b/>
+                <w:bCs/>
+              </w:rPr>
+            </w:pPr>
+            <w:r>
+              <w:rPr>
+                <w:b/>
+                <w:bCs/>
+              </w:rPr>
+              <w:t>Feature</w:t>
+            </w:r>
+          </w:p>
+        </w:tc>
+        <w:tc>
+          <w:tcPr>
+            <w:tcW w:w="0" w:type="auto"/>
+            <w:tcBorders>
+              <w:top w:val="nil"/>
+            </w:tcBorders>
+            <w:shd w:val="clear" w:color="auto" w:fill="FFFFFF"/>
+            <w:tcMar>
+              <w:top w:w="150" w:type="dxa"/>
+              <w:left w:w="240" w:type="dxa"/>
+              <w:bottom w:w="150" w:type="dxa"/>
+              <w:right w:w="240" w:type="dxa"/>
+            </w:tcMar>
+            <w:vAlign w:val="center"/>
+            <w:hideMark/>
+          </w:tcPr>
+          <w:p>
+            <w:pPr>
+              <w:spacing w:line="240" w:lineRule="auto"/>
+              <w:contextualSpacing/>
+              <w:rPr>
+                <w:b/>
+                <w:bCs/>
+              </w:rPr>
+            </w:pPr>
+            <w:r>
+              <w:rPr>
+                <w:b/>
+                <w:bCs/>
+              </w:rPr>
+              <w:t>Status</w:t>
+            </w:r>
+          </w:p>
+        </w:tc>
+      </w:tr>
+      <w:tr>
+        <w:tc>
+          <w:tcPr>
+            <w:tcW w:w="0" w:type="auto"/>
+            <w:shd w:val="clear" w:color="auto" w:fill="FFFFFF"/>
+            <w:tcMar>
+              <w:top w:w="150" w:type="dxa"/>
+              <w:left w:w="0" w:type="dxa"/>
+              <w:bottom w:w="150" w:type="dxa"/>
+              <w:right w:w="240" w:type="dxa"/>
+            </w:tcMar>
+            <w:vAlign w:val="center"/>
+            <w:hideMark/>
+          </w:tcPr>
+          <w:p>
+            <w:pPr>
+              <w:spacing w:line="240" w:lineRule="auto"/>
+              <w:contextualSpacing/>
+              <w:rPr>
+                <w:b/>
+                <w:bCs/>
+              </w:rPr>
+            </w:pPr>
+            <w:r>
+              <w:rPr>
+                <w:b/>
+                <w:bCs/>
+              </w:rPr>
+              <w:t xml:space="preserve">Toast replaces </w:t>
+            </w:r>
+            <w:proofErr w:type="gramStart"/>
+            <w:r>
+              <w:rPr>
+                <w:b/>
+                <w:bCs/>
+              </w:rPr>
+              <w:t>alert(</w:t>
+            </w:r>
+            <w:proofErr w:type="gramEnd"/>
+            <w:r>
+              <w:rPr>
+                <w:b/>
+                <w:bCs/>
+              </w:rPr>
+              <w:t>) on report submission</w:t>
+            </w:r>
+          </w:p>
+        </w:tc>
+        <w:tc>
+          <w:tcPr>
+            <w:tcW w:w="0" w:type="auto"/>
+            <w:shd w:val="clear" w:color="auto" w:fill="FFFFFF"/>
+            <w:tcMar>
+              <w:top w:w="150" w:type="dxa"/>
+              <w:left w:w="240" w:type="dxa"/>
+              <w:bottom w:w="150" w:type="dxa"/>
+              <w:right w:w="0" w:type="dxa"/>
+            </w:tcMar>
+            <w:vAlign w:val="center"/>
+            <w:hideMark/>
+          </w:tcPr>
+          <w:p>
+            <w:pPr>
+              <w:spacing w:line="240" w:lineRule="auto"/>
+              <w:contextualSpacing/>
+              <w:rPr>
+                <w:b/>
+                <w:bCs/>
+              </w:rPr>
+            </w:pPr>
+            <w:r>
+              <w:rPr>
+                <w:rFonts w:ascii="Segoe UI Emoji" w:hAnsi="Segoe UI Emoji" w:cs="Segoe UI Emoji"/>
+                <w:b/>
+                <w:bCs/>
+              </w:rPr>
+              <w:t>✅</w:t>
+            </w:r>
+          </w:p>
+        </w:tc>
+      </w:tr>
+      <w:tr>
+        <w:tc>
+          <w:tcPr>
+            <w:tcW w:w="0" w:type="auto"/>
+            <w:shd w:val="clear" w:color="auto" w:fill="FFFFFF"/>
+            <w:tcMar>
+              <w:top w:w="150" w:type="dxa"/>
+              <w:left w:w="0" w:type="dxa"/>
+              <w:bottom w:w="150" w:type="dxa"/>
+              <w:right w:w="240" w:type="dxa"/>
+            </w:tcMar>
+            <w:vAlign w:val="center"/>
+            <w:hideMark/>
+          </w:tcPr>
+          <w:p>
+            <w:pPr>
+              <w:spacing w:line="240" w:lineRule="auto"/>
+              <w:contextualSpacing/>
+              <w:rPr>
+                <w:b/>
+                <w:bCs/>
+              </w:rPr>
+            </w:pPr>
+            <w:r>
+              <w:rPr>
+                <w:b/>
+                <w:bCs/>
+              </w:rPr>
+              <w:t xml:space="preserve">Toast replaces </w:t>
+            </w:r>
+            <w:proofErr w:type="gramStart"/>
+            <w:r>
+              <w:rPr>
+                <w:b/>
+                <w:bCs/>
+              </w:rPr>
+              <w:t>alert(</w:t>
+            </w:r>
+            <w:proofErr w:type="gramEnd"/>
+            <w:r>
+              <w:rPr>
+                <w:b/>
+                <w:bCs/>
+              </w:rPr>
+              <w:t>) on export failure</w:t>
+            </w:r>
+          </w:p>
+        </w:tc>
+        <w:tc>
+          <w:tcPr>
+            <w:tcW w:w="0" w:type="auto"/>
+            <w:shd w:val="clear" w:color="auto" w:fill="FFFFFF"/>
+            <w:tcMar>
+              <w:top w:w="150" w:type="dxa"/>
+              <w:left w:w="240" w:type="dxa"/>
+              <w:bottom w:w="150" w:type="dxa"/>
+              <w:right w:w="0" w:type="dxa"/>
+            </w:tcMar>
+            <w:vAlign w:val="center"/>
+            <w:hideMark/>
+          </w:tcPr>
+          <w:p>
+            <w:pPr>
+              <w:spacing w:line="240" w:lineRule="auto"/>
+              <w:contextualSpacing/>
+              <w:rPr>
+                <w:b/>
+                <w:bCs/>
+              </w:rPr>
+            </w:pPr>
+            <w:r>
+              <w:rPr>
+                <w:rFonts w:ascii="Segoe UI Emoji" w:hAnsi="Segoe UI Emoji" w:cs="Segoe UI Emoji"/>
+                <w:b/>
+                <w:bCs/>
+              </w:rPr>
+              <w:t>✅</w:t>
+            </w:r>
+          </w:p>
+        </w:tc>
+      </w:tr>
+      <w:tr>
+        <w:tc>
+          <w:tcPr>
+            <w:tcW w:w="0" w:type="auto"/>
+            <w:shd w:val="clear" w:color="auto" w:fill="FFFFFF"/>
+            <w:tcMar>
+              <w:top w:w="150" w:type="dxa"/>
+              <w:left w:w="0" w:type="dxa"/>
+              <w:bottom w:w="150" w:type="dxa"/>
+              <w:right w:w="240" w:type="dxa"/>
+            </w:tcMar>
+            <w:vAlign w:val="center"/>
+            <w:hideMark/>
+          </w:tcPr>
+          <w:p>
+            <w:pPr>
+              <w:spacing w:line="240" w:lineRule="auto"/>
+              <w:contextualSpacing/>
+              <w:rPr>
+                <w:b/>
+                <w:bCs/>
+              </w:rPr>
+            </w:pPr>
+            <w:r>
+              <w:rPr>
+                <w:b/>
+                <w:bCs/>
+              </w:rPr>
+              <w:t>Context-aware error messages</w:t>
+            </w:r>
+          </w:p>
+        </w:tc>
+        <w:tc>
+          <w:tcPr>
+            <w:tcW w:w="0" w:type="auto"/>
+            <w:shd w:val="clear" w:color="auto" w:fill="FFFFFF"/>
+            <w:tcMar>
+              <w:top w:w="150" w:type="dxa"/>
+              <w:left w:w="240" w:type="dxa"/>
+              <w:bottom w:w="150" w:type="dxa"/>
+              <w:right w:w="0" w:type="dxa"/>
+            </w:tcMar>
+            <w:vAlign w:val="center"/>
+            <w:hideMark/>
+          </w:tcPr>
+          <w:p>
+            <w:pPr>
+              <w:spacing w:line="240" w:lineRule="auto"/>
+              <w:contextualSpacing/>
+              <w:rPr>
+                <w:b/>
+                <w:bCs/>
+              </w:rPr>
+            </w:pPr>
+            <w:r>
+              <w:rPr>
+                <w:rFonts w:ascii="Segoe UI Emoji" w:hAnsi="Segoe UI Emoji" w:cs="Segoe UI Emoji"/>
+                <w:b/>
+                <w:bCs/>
+              </w:rPr>
+              <w:t>✅</w:t>
+            </w:r>
+          </w:p>
+        </w:tc>
+      </w:tr>
+      <w:tr>
+        <w:tc>
+          <w:tcPr>
+            <w:tcW w:w="0" w:type="auto"/>
+            <w:shd w:val="clear" w:color="auto" w:fill="FFFFFF"/>
+            <w:tcMar>
+              <w:top w:w="150" w:type="dxa"/>
+              <w:left w:w="0" w:type="dxa"/>
+              <w:bottom w:w="150" w:type="dxa"/>
+              <w:right w:w="240" w:type="dxa"/>
+            </w:tcMar>
+            <w:vAlign w:val="center"/>
+            <w:hideMark/>
+          </w:tcPr>
+          <w:p>
+            <w:pPr>
+              <w:spacing w:line="240" w:lineRule="auto"/>
+              <w:contextualSpacing/>
+              <w:rPr>
+                <w:b/>
+                <w:bCs/>
+              </w:rPr>
+            </w:pPr>
+            <w:r>
+              <w:rPr>
+                <w:b/>
+                <w:bCs/>
+              </w:rPr>
+              <w:lastRenderedPageBreak/>
+              <w:t>Non-blocking notifications</w:t>
+            </w:r>
+          </w:p>
+        </w:tc>
+        <w:tc>
+          <w:tcPr>
+            <w:tcW w:w="0" w:type="auto"/>
+            <w:shd w:val="clear" w:color="auto" w:fill="FFFFFF"/>
+            <w:tcMar>
+              <w:top w:w="150" w:type="dxa"/>
+              <w:left w:w="240" w:type="dxa"/>
+              <w:bottom w:w="150" w:type="dxa"/>
+              <w:right w:w="0" w:type="dxa"/>
+            </w:tcMar>
+            <w:vAlign w:val="center"/>
+            <w:hideMark/>
+          </w:tcPr>
+          <w:p>
+            <w:pPr>
+              <w:spacing w:line="240" w:lineRule="auto"/>
+              <w:contextualSpacing/>
+              <w:rPr>
+                <w:b/>
+                <w:bCs/>
+              </w:rPr>
+            </w:pPr>
+            <w:r>
+              <w:rPr>
+                <w:rFonts w:ascii="Segoe UI Emoji" w:hAnsi="Segoe UI Emoji" w:cs="Segoe UI Emoji"/>
+                <w:b/>
+                <w:bCs/>
+              </w:rPr>
+              <w:t>✅</w:t>
+            </w:r>
+          </w:p>
+        </w:tc>
+      </w:tr>
+      <w:tr>
+        <w:tc>
+          <w:tcPr>
+            <w:tcW w:w="0" w:type="auto"/>
+            <w:shd w:val="clear" w:color="auto" w:fill="FFFFFF"/>
+            <w:tcMar>
+              <w:top w:w="150" w:type="dxa"/>
+              <w:left w:w="0" w:type="dxa"/>
+              <w:bottom w:w="150" w:type="dxa"/>
+              <w:right w:w="240" w:type="dxa"/>
+            </w:tcMar>
+            <w:vAlign w:val="center"/>
+            <w:hideMark/>
+          </w:tcPr>
+          <w:p>
+            <w:pPr>
+              <w:spacing w:line="240" w:lineRule="auto"/>
+              <w:contextualSpacing/>
+              <w:rPr>
+                <w:b/>
+                <w:bCs/>
+              </w:rPr>
+            </w:pPr>
+            <w:r>
+              <w:rPr>
+                <w:b/>
+                <w:bCs/>
+              </w:rPr>
+              <w:t>Admin guard blocks non-admins</w:t>
+            </w:r>
+          </w:p>
+        </w:tc>
+        <w:tc>
+          <w:tcPr>
+            <w:tcW w:w="0" w:type="auto"/>
+            <w:shd w:val="clear" w:color="auto" w:fill="FFFFFF"/>
+            <w:tcMar>
+              <w:top w:w="150" w:type="dxa"/>
+              <w:left w:w="240" w:type="dxa"/>
+              <w:bottom w:w="150" w:type="dxa"/>
+              <w:right w:w="0" w:type="dxa"/>
+            </w:tcMar>
+            <w:vAlign w:val="center"/>
+            <w:hideMark/>
+          </w:tcPr>
+          <w:p>
+            <w:pPr>
+              <w:spacing w:line="240" w:lineRule="auto"/>
+              <w:contextualSpacing/>
+              <w:rPr>
+                <w:b/>
+                <w:bCs/>
+              </w:rPr>
+            </w:pPr>
+            <w:r>
+              <w:rPr>
+                <w:rFonts w:ascii="Segoe UI Emoji" w:hAnsi="Segoe UI Emoji" w:cs="Segoe UI Emoji"/>
+                <w:b/>
+                <w:bCs/>
+              </w:rPr>
+              <w:t>✅</w:t>
+            </w:r>
+          </w:p>
+        </w:tc>
+      </w:tr>
+      <w:tr>
+        <w:tc>
+          <w:tcPr>
+            <w:tcW w:w="0" w:type="auto"/>
+            <w:shd w:val="clear" w:color="auto" w:fill="FFFFFF"/>
+            <w:tcMar>
+              <w:top w:w="150" w:type="dxa"/>
+              <w:left w:w="0" w:type="dxa"/>
+              <w:bottom w:w="150" w:type="dxa"/>
+              <w:right w:w="240" w:type="dxa"/>
+            </w:tcMar>
+            <w:vAlign w:val="center"/>
+            <w:hideMark/>
+          </w:tcPr>
+          <w:p>
+            <w:pPr>
+              <w:spacing w:line="240" w:lineRule="auto"/>
+              <w:contextualSpacing/>
+              <w:rPr>
+                <w:b/>
+                <w:bCs/>
+              </w:rPr>
+            </w:pPr>
+            <w:r>
+              <w:rPr>
+                <w:b/>
+                <w:bCs/>
+              </w:rPr>
+              <w:t>Corrupted session handled gracefully</w:t>
+            </w:r>
+          </w:p>
+        </w:tc>
+        <w:tc>
+          <w:tcPr>
+            <w:tcW w:w="0" w:type="auto"/>
+            <w:shd w:val="clear" w:color="auto" w:fill="FFFFFF"/>
+            <w:tcMar>
+              <w:top w:w="150" w:type="dxa"/>
+              <w:left w:w="240" w:type="dxa"/>
+              <w:bottom w:w="150" w:type="dxa"/>
+              <w:right w:w="0" w:type="dxa"/>
+            </w:tcMar>
+            <w:vAlign w:val="center"/>
+            <w:hideMark/>
+          </w:tcPr>
+          <w:p>
+            <w:pPr>
+              <w:spacing w:line="240" w:lineRule="auto"/>
+              <w:contextualSpacing/>
+              <w:rPr>
+                <w:b/>
+                <w:bCs/>
+              </w:rPr>
+            </w:pPr>
+            <w:r>
+              <w:rPr>
+                <w:rFonts w:ascii="Segoe UI Emoji" w:hAnsi="Segoe UI Emoji" w:cs="Segoe UI Emoji"/>
+                <w:b/>
+                <w:bCs/>
+              </w:rPr>
+              <w:t>✅</w:t>
+            </w:r>
+          </w:p>
+        </w:tc>
+      </w:tr>
+      <w:tr>
+        <w:tc>
+          <w:tcPr>
+            <w:tcW w:w="0" w:type="auto"/>
+            <w:shd w:val="clear" w:color="auto" w:fill="FFFFFF"/>
+            <w:tcMar>
+              <w:top w:w="150" w:type="dxa"/>
+              <w:left w:w="0" w:type="dxa"/>
+              <w:bottom w:w="150" w:type="dxa"/>
+              <w:right w:w="240" w:type="dxa"/>
+            </w:tcMar>
+            <w:vAlign w:val="center"/>
+            <w:hideMark/>
+          </w:tcPr>
+          <w:p>
+            <w:pPr>
+              <w:spacing w:line="240" w:lineRule="auto"/>
+              <w:contextualSpacing/>
+              <w:rPr>
+                <w:b/>
+                <w:bCs/>
+              </w:rPr>
+            </w:pPr>
+            <w:r>
+              <w:rPr>
+                <w:b/>
+                <w:bCs/>
+              </w:rPr>
+              <w:t>Console clean (favicon fix pending)</w:t>
+            </w:r>
+          </w:p>
+        </w:tc>
+        <w:tc>
+          <w:tcPr>
+            <w:tcW w:w="0" w:type="auto"/>
+            <w:shd w:val="clear" w:color="auto" w:fill="FFFFFF"/>
+            <w:tcMar>
+              <w:top w:w="150" w:type="dxa"/>
+              <w:left w:w="240" w:type="dxa"/>
+              <w:bottom w:w="150" w:type="dxa"/>
+              <w:right w:w="0" w:type="dxa"/>
+            </w:tcMar>
+            <w:vAlign w:val="center"/>
+            <w:hideMark/>
+          </w:tcPr>
+          <w:p>
+            <w:pPr>
+              <w:spacing w:line="240" w:lineRule="auto"/>
+              <w:contextualSpacing/>
+              <w:rPr>
+                <w:b/>
+                <w:bCs/>
+              </w:rPr>
+            </w:pPr>
+            <w:r>
+              <w:rPr>
+                <w:rFonts w:ascii="Segoe UI Emoji" w:hAnsi="Segoe UI Emoji" w:cs="Segoe UI Emoji"/>
+                <w:b/>
+                <w:bCs/>
+              </w:rPr>
+              <w:t>✅</w:t>
+            </w:r>
+          </w:p>
+        </w:tc>
+      </w:tr>
+    </w:tbl>
+    <w:p>
+      <w:pPr>
+        <w:spacing w:line="240" w:lineRule="auto"/>
+        <w:contextualSpacing/>
+        <w:rPr>
+          <w:b/>
+          <w:bCs/>
+        </w:rPr>
+      </w:pPr>
+    </w:p>
+    <w:p>
+      <w:pPr>
+        <w:spacing w:line="240" w:lineRule="auto"/>
+        <w:ind w:left="720"/>
+        <w:contextualSpacing/>
       </w:pPr>
     </w:p>
     <w:p>
@@ -4356,6 +6803,122 @@
     </w:lvl>
   </w:abstractNum>
   <w:abstractNum w:abstractNumId="3" w15:restartNumberingAfterBreak="0">
+    <w:nsid w:val="11B90DCB"/>
+    <w:multiLevelType w:val="multilevel"/>
+    <w:tmpl w:val="3C9A47FE"/>
+    <w:lvl w:ilvl="0">
+      <w:start w:val="1"/>
+      <w:numFmt w:val="bullet"/>
+      <w:lvlText w:val=""/>
+      <w:lvlJc w:val="left"/>
+      <w:pPr>
+        <w:tabs>
+          <w:tab w:val="num" w:pos="1080"/>
+        </w:tabs>
+        <w:ind w:left="1080" w:hanging="360"/>
+      </w:pPr>
+      <w:rPr>
+        <w:rFonts w:ascii="Wingdings" w:hAnsi="Wingdings" w:hint="default"/>
+      </w:rPr>
+    </w:lvl>
+    <w:lvl w:ilvl="1">
+      <w:start w:val="1"/>
+      <w:numFmt w:val="bullet"/>
+      <w:lvlText w:val=""/>
+      <w:lvlJc w:val="left"/>
+      <w:pPr>
+        <w:ind w:left="1800" w:hanging="360"/>
+      </w:pPr>
+      <w:rPr>
+        <w:rFonts w:ascii="Wingdings" w:hAnsi="Wingdings" w:hint="default"/>
+      </w:rPr>
+    </w:lvl>
+    <w:lvl w:ilvl="2" w:tentative="1">
+      <w:start w:val="1"/>
+      <w:numFmt w:val="decimal"/>
+      <w:lvlText w:val="%3."/>
+      <w:lvlJc w:val="left"/>
+      <w:pPr>
+        <w:tabs>
+          <w:tab w:val="num" w:pos="2520"/>
+        </w:tabs>
+        <w:ind w:left="2520" w:hanging="360"/>
+      </w:pPr>
+    </w:lvl>
+    <w:lvl w:ilvl="3" w:tentative="1">
+      <w:start w:val="1"/>
+      <w:numFmt w:val="decimal"/>
+      <w:lvlText w:val="%4."/>
+      <w:lvlJc w:val="left"/>
+      <w:pPr>
+        <w:tabs>
+          <w:tab w:val="num" w:pos="3240"/>
+        </w:tabs>
+        <w:ind w:left="3240" w:hanging="360"/>
+      </w:pPr>
+    </w:lvl>
+    <w:lvl w:ilvl="4" w:tentative="1">
+      <w:start w:val="1"/>
+      <w:numFmt w:val="decimal"/>
+      <w:lvlText w:val="%5."/>
+      <w:lvlJc w:val="left"/>
+      <w:pPr>
+        <w:tabs>
+          <w:tab w:val="num" w:pos="3960"/>
+        </w:tabs>
+        <w:ind w:left="3960" w:hanging="360"/>
+      </w:pPr>
+    </w:lvl>
+    <w:lvl w:ilvl="5" w:tentative="1">
+      <w:start w:val="1"/>
+      <w:numFmt w:val="decimal"/>
+      <w:lvlText w:val="%6."/>
+      <w:lvlJc w:val="left"/>
+      <w:pPr>
+        <w:tabs>
+          <w:tab w:val="num" w:pos="4680"/>
+        </w:tabs>
+        <w:ind w:left="4680" w:hanging="360"/>
+      </w:pPr>
+    </w:lvl>
+    <w:lvl w:ilvl="6" w:tentative="1">
+      <w:start w:val="1"/>
+      <w:numFmt w:val="decimal"/>
+      <w:lvlText w:val="%7."/>
+      <w:lvlJc w:val="left"/>
+      <w:pPr>
+        <w:tabs>
+          <w:tab w:val="num" w:pos="5400"/>
+        </w:tabs>
+        <w:ind w:left="5400" w:hanging="360"/>
+      </w:pPr>
+    </w:lvl>
+    <w:lvl w:ilvl="7" w:tentative="1">
+      <w:start w:val="1"/>
+      <w:numFmt w:val="decimal"/>
+      <w:lvlText w:val="%8."/>
+      <w:lvlJc w:val="left"/>
+      <w:pPr>
+        <w:tabs>
+          <w:tab w:val="num" w:pos="6120"/>
+        </w:tabs>
+        <w:ind w:left="6120" w:hanging="360"/>
+      </w:pPr>
+    </w:lvl>
+    <w:lvl w:ilvl="8" w:tentative="1">
+      <w:start w:val="1"/>
+      <w:numFmt w:val="decimal"/>
+      <w:lvlText w:val="%9."/>
+      <w:lvlJc w:val="left"/>
+      <w:pPr>
+        <w:tabs>
+          <w:tab w:val="num" w:pos="6840"/>
+        </w:tabs>
+        <w:ind w:left="6840" w:hanging="360"/>
+      </w:pPr>
+    </w:lvl>
+  </w:abstractNum>
+  <w:abstractNum w:abstractNumId="4" w15:restartNumberingAfterBreak="0">
     <w:nsid w:val="22C8110C"/>
     <w:multiLevelType w:val="multilevel"/>
     <w:tmpl w:val="4C548DC6"/>
@@ -4504,7 +7067,7 @@
       </w:rPr>
     </w:lvl>
   </w:abstractNum>
-  <w:abstractNum w:abstractNumId="4" w15:restartNumberingAfterBreak="0">
+  <w:abstractNum w:abstractNumId="5" w15:restartNumberingAfterBreak="0">
     <w:nsid w:val="293F1AE2"/>
     <w:multiLevelType w:val="multilevel"/>
     <w:tmpl w:val="14B6EDF4"/>
@@ -4653,7 +7216,7 @@
       </w:rPr>
     </w:lvl>
   </w:abstractNum>
-  <w:abstractNum w:abstractNumId="5" w15:restartNumberingAfterBreak="0">
+  <w:abstractNum w:abstractNumId="6" w15:restartNumberingAfterBreak="0">
     <w:nsid w:val="29770685"/>
     <w:multiLevelType w:val="multilevel"/>
     <w:tmpl w:val="8B64E4FE"/>
@@ -4766,7 +7329,120 @@
       </w:pPr>
     </w:lvl>
   </w:abstractNum>
-  <w:abstractNum w:abstractNumId="6" w15:restartNumberingAfterBreak="0">
+  <w:abstractNum w:abstractNumId="7" w15:restartNumberingAfterBreak="0">
+    <w:nsid w:val="30B96126"/>
+    <w:multiLevelType w:val="hybridMultilevel"/>
+    <w:tmpl w:val="8B9C7BBE"/>
+    <w:lvl w:ilvl="0" w:tplc="0409000B">
+      <w:start w:val="1"/>
+      <w:numFmt w:val="bullet"/>
+      <w:lvlText w:val=""/>
+      <w:lvlJc w:val="left"/>
+      <w:pPr>
+        <w:ind w:left="1440" w:hanging="360"/>
+      </w:pPr>
+      <w:rPr>
+        <w:rFonts w:ascii="Wingdings" w:hAnsi="Wingdings" w:hint="default"/>
+      </w:rPr>
+    </w:lvl>
+    <w:lvl w:ilvl="1" w:tplc="04090003" w:tentative="1">
+      <w:start w:val="1"/>
+      <w:numFmt w:val="bullet"/>
+      <w:lvlText w:val="o"/>
+      <w:lvlJc w:val="left"/>
+      <w:pPr>
+        <w:ind w:left="2160" w:hanging="360"/>
+      </w:pPr>
+      <w:rPr>
+        <w:rFonts w:ascii="Courier New" w:hAnsi="Courier New" w:cs="Courier New" w:hint="default"/>
+      </w:rPr>
+    </w:lvl>
+    <w:lvl w:ilvl="2" w:tplc="04090005" w:tentative="1">
+      <w:start w:val="1"/>
+      <w:numFmt w:val="bullet"/>
+      <w:lvlText w:val=""/>
+      <w:lvlJc w:val="left"/>
+      <w:pPr>
+        <w:ind w:left="2880" w:hanging="360"/>
+      </w:pPr>
+      <w:rPr>
+        <w:rFonts w:ascii="Wingdings" w:hAnsi="Wingdings" w:hint="default"/>
+      </w:rPr>
+    </w:lvl>
+    <w:lvl w:ilvl="3" w:tplc="04090001" w:tentative="1">
+      <w:start w:val="1"/>
+      <w:numFmt w:val="bullet"/>
+      <w:lvlText w:val=""/>
+      <w:lvlJc w:val="left"/>
+      <w:pPr>
+        <w:ind w:left="3600" w:hanging="360"/>
+      </w:pPr>
+      <w:rPr>
+        <w:rFonts w:ascii="Symbol" w:hAnsi="Symbol" w:hint="default"/>
+      </w:rPr>
+    </w:lvl>
+    <w:lvl w:ilvl="4" w:tplc="04090003" w:tentative="1">
+      <w:start w:val="1"/>
+      <w:numFmt w:val="bullet"/>
+      <w:lvlText w:val="o"/>
+      <w:lvlJc w:val="left"/>
+      <w:pPr>
+        <w:ind w:left="4320" w:hanging="360"/>
+      </w:pPr>
+      <w:rPr>
+        <w:rFonts w:ascii="Courier New" w:hAnsi="Courier New" w:cs="Courier New" w:hint="default"/>
+      </w:rPr>
+    </w:lvl>
+    <w:lvl w:ilvl="5" w:tplc="04090005" w:tentative="1">
+      <w:start w:val="1"/>
+      <w:numFmt w:val="bullet"/>
+      <w:lvlText w:val=""/>
+      <w:lvlJc w:val="left"/>
+      <w:pPr>
+        <w:ind w:left="5040" w:hanging="360"/>
+      </w:pPr>
+      <w:rPr>
+        <w:rFonts w:ascii="Wingdings" w:hAnsi="Wingdings" w:hint="default"/>
+      </w:rPr>
+    </w:lvl>
+    <w:lvl w:ilvl="6" w:tplc="04090001" w:tentative="1">
+      <w:start w:val="1"/>
+      <w:numFmt w:val="bullet"/>
+      <w:lvlText w:val=""/>
+      <w:lvlJc w:val="left"/>
+      <w:pPr>
+        <w:ind w:left="5760" w:hanging="360"/>
+      </w:pPr>
+      <w:rPr>
+        <w:rFonts w:ascii="Symbol" w:hAnsi="Symbol" w:hint="default"/>
+      </w:rPr>
+    </w:lvl>
+    <w:lvl w:ilvl="7" w:tplc="04090003" w:tentative="1">
+      <w:start w:val="1"/>
+      <w:numFmt w:val="bullet"/>
+      <w:lvlText w:val="o"/>
+      <w:lvlJc w:val="left"/>
+      <w:pPr>
+        <w:ind w:left="6480" w:hanging="360"/>
+      </w:pPr>
+      <w:rPr>
+        <w:rFonts w:ascii="Courier New" w:hAnsi="Courier New" w:cs="Courier New" w:hint="default"/>
+      </w:rPr>
+    </w:lvl>
+    <w:lvl w:ilvl="8" w:tplc="04090005" w:tentative="1">
+      <w:start w:val="1"/>
+      <w:numFmt w:val="bullet"/>
+      <w:lvlText w:val=""/>
+      <w:lvlJc w:val="left"/>
+      <w:pPr>
+        <w:ind w:left="7200" w:hanging="360"/>
+      </w:pPr>
+      <w:rPr>
+        <w:rFonts w:ascii="Wingdings" w:hAnsi="Wingdings" w:hint="default"/>
+      </w:rPr>
+    </w:lvl>
+  </w:abstractNum>
+  <w:abstractNum w:abstractNumId="8" w15:restartNumberingAfterBreak="0">
     <w:nsid w:val="34086244"/>
     <w:multiLevelType w:val="multilevel"/>
     <w:tmpl w:val="C004D940"/>
@@ -4882,7 +7558,305 @@
       </w:pPr>
     </w:lvl>
   </w:abstractNum>
-  <w:abstractNum w:abstractNumId="7" w15:restartNumberingAfterBreak="0">
+  <w:abstractNum w:abstractNumId="9" w15:restartNumberingAfterBreak="0">
+    <w:nsid w:val="38623467"/>
+    <w:multiLevelType w:val="multilevel"/>
+    <w:tmpl w:val="FFD67CFC"/>
+    <w:lvl w:ilvl="0">
+      <w:start w:val="1"/>
+      <w:numFmt w:val="bullet"/>
+      <w:lvlText w:val=""/>
+      <w:lvlJc w:val="left"/>
+      <w:pPr>
+        <w:tabs>
+          <w:tab w:val="num" w:pos="720"/>
+        </w:tabs>
+        <w:ind w:left="720" w:hanging="360"/>
+      </w:pPr>
+      <w:rPr>
+        <w:rFonts w:ascii="Symbol" w:hAnsi="Symbol" w:hint="default"/>
+        <w:sz w:val="20"/>
+      </w:rPr>
+    </w:lvl>
+    <w:lvl w:ilvl="1" w:tentative="1">
+      <w:start w:val="1"/>
+      <w:numFmt w:val="bullet"/>
+      <w:lvlText w:val="o"/>
+      <w:lvlJc w:val="left"/>
+      <w:pPr>
+        <w:tabs>
+          <w:tab w:val="num" w:pos="1440"/>
+        </w:tabs>
+        <w:ind w:left="1440" w:hanging="360"/>
+      </w:pPr>
+      <w:rPr>
+        <w:rFonts w:ascii="Courier New" w:hAnsi="Courier New" w:hint="default"/>
+        <w:sz w:val="20"/>
+      </w:rPr>
+    </w:lvl>
+    <w:lvl w:ilvl="2" w:tentative="1">
+      <w:start w:val="1"/>
+      <w:numFmt w:val="bullet"/>
+      <w:lvlText w:val=""/>
+      <w:lvlJc w:val="left"/>
+      <w:pPr>
+        <w:tabs>
+          <w:tab w:val="num" w:pos="2160"/>
+        </w:tabs>
+        <w:ind w:left="2160" w:hanging="360"/>
+      </w:pPr>
+      <w:rPr>
+        <w:rFonts w:ascii="Wingdings" w:hAnsi="Wingdings" w:hint="default"/>
+        <w:sz w:val="20"/>
+      </w:rPr>
+    </w:lvl>
+    <w:lvl w:ilvl="3" w:tentative="1">
+      <w:start w:val="1"/>
+      <w:numFmt w:val="bullet"/>
+      <w:lvlText w:val=""/>
+      <w:lvlJc w:val="left"/>
+      <w:pPr>
+        <w:tabs>
+          <w:tab w:val="num" w:pos="2880"/>
+        </w:tabs>
+        <w:ind w:left="2880" w:hanging="360"/>
+      </w:pPr>
+      <w:rPr>
+        <w:rFonts w:ascii="Wingdings" w:hAnsi="Wingdings" w:hint="default"/>
+        <w:sz w:val="20"/>
+      </w:rPr>
+    </w:lvl>
+    <w:lvl w:ilvl="4" w:tentative="1">
+      <w:start w:val="1"/>
+      <w:numFmt w:val="bullet"/>
+      <w:lvlText w:val=""/>
+      <w:lvlJc w:val="left"/>
+      <w:pPr>
+        <w:tabs>
+          <w:tab w:val="num" w:pos="3600"/>
+        </w:tabs>
+        <w:ind w:left="3600" w:hanging="360"/>
+      </w:pPr>
+      <w:rPr>
+        <w:rFonts w:ascii="Wingdings" w:hAnsi="Wingdings" w:hint="default"/>
+        <w:sz w:val="20"/>
+      </w:rPr>
+    </w:lvl>
+    <w:lvl w:ilvl="5" w:tentative="1">
+      <w:start w:val="1"/>
+      <w:numFmt w:val="bullet"/>
+      <w:lvlText w:val=""/>
+      <w:lvlJc w:val="left"/>
+      <w:pPr>
+        <w:tabs>
+          <w:tab w:val="num" w:pos="4320"/>
+        </w:tabs>
+        <w:ind w:left="4320" w:hanging="360"/>
+      </w:pPr>
+      <w:rPr>
+        <w:rFonts w:ascii="Wingdings" w:hAnsi="Wingdings" w:hint="default"/>
+        <w:sz w:val="20"/>
+      </w:rPr>
+    </w:lvl>
+    <w:lvl w:ilvl="6" w:tentative="1">
+      <w:start w:val="1"/>
+      <w:numFmt w:val="bullet"/>
+      <w:lvlText w:val=""/>
+      <w:lvlJc w:val="left"/>
+      <w:pPr>
+        <w:tabs>
+          <w:tab w:val="num" w:pos="5040"/>
+        </w:tabs>
+        <w:ind w:left="5040" w:hanging="360"/>
+      </w:pPr>
+      <w:rPr>
+        <w:rFonts w:ascii="Wingdings" w:hAnsi="Wingdings" w:hint="default"/>
+        <w:sz w:val="20"/>
+      </w:rPr>
+    </w:lvl>
+    <w:lvl w:ilvl="7" w:tentative="1">
+      <w:start w:val="1"/>
+      <w:numFmt w:val="bullet"/>
+      <w:lvlText w:val=""/>
+      <w:lvlJc w:val="left"/>
+      <w:pPr>
+        <w:tabs>
+          <w:tab w:val="num" w:pos="5760"/>
+        </w:tabs>
+        <w:ind w:left="5760" w:hanging="360"/>
+      </w:pPr>
+      <w:rPr>
+        <w:rFonts w:ascii="Wingdings" w:hAnsi="Wingdings" w:hint="default"/>
+        <w:sz w:val="20"/>
+      </w:rPr>
+    </w:lvl>
+    <w:lvl w:ilvl="8" w:tentative="1">
+      <w:start w:val="1"/>
+      <w:numFmt w:val="bullet"/>
+      <w:lvlText w:val=""/>
+      <w:lvlJc w:val="left"/>
+      <w:pPr>
+        <w:tabs>
+          <w:tab w:val="num" w:pos="6480"/>
+        </w:tabs>
+        <w:ind w:left="6480" w:hanging="360"/>
+      </w:pPr>
+      <w:rPr>
+        <w:rFonts w:ascii="Wingdings" w:hAnsi="Wingdings" w:hint="default"/>
+        <w:sz w:val="20"/>
+      </w:rPr>
+    </w:lvl>
+  </w:abstractNum>
+  <w:abstractNum w:abstractNumId="10" w15:restartNumberingAfterBreak="0">
+    <w:nsid w:val="38891045"/>
+    <w:multiLevelType w:val="multilevel"/>
+    <w:tmpl w:val="CC961CC2"/>
+    <w:lvl w:ilvl="0">
+      <w:start w:val="1"/>
+      <w:numFmt w:val="bullet"/>
+      <w:lvlText w:val=""/>
+      <w:lvlJc w:val="left"/>
+      <w:pPr>
+        <w:tabs>
+          <w:tab w:val="num" w:pos="720"/>
+        </w:tabs>
+        <w:ind w:left="720" w:hanging="360"/>
+      </w:pPr>
+      <w:rPr>
+        <w:rFonts w:ascii="Symbol" w:hAnsi="Symbol" w:hint="default"/>
+        <w:sz w:val="20"/>
+      </w:rPr>
+    </w:lvl>
+    <w:lvl w:ilvl="1" w:tentative="1">
+      <w:start w:val="1"/>
+      <w:numFmt w:val="bullet"/>
+      <w:lvlText w:val="o"/>
+      <w:lvlJc w:val="left"/>
+      <w:pPr>
+        <w:tabs>
+          <w:tab w:val="num" w:pos="1440"/>
+        </w:tabs>
+        <w:ind w:left="1440" w:hanging="360"/>
+      </w:pPr>
+      <w:rPr>
+        <w:rFonts w:ascii="Courier New" w:hAnsi="Courier New" w:hint="default"/>
+        <w:sz w:val="20"/>
+      </w:rPr>
+    </w:lvl>
+    <w:lvl w:ilvl="2" w:tentative="1">
+      <w:start w:val="1"/>
+      <w:numFmt w:val="bullet"/>
+      <w:lvlText w:val=""/>
+      <w:lvlJc w:val="left"/>
+      <w:pPr>
+        <w:tabs>
+          <w:tab w:val="num" w:pos="2160"/>
+        </w:tabs>
+        <w:ind w:left="2160" w:hanging="360"/>
+      </w:pPr>
+      <w:rPr>
+        <w:rFonts w:ascii="Wingdings" w:hAnsi="Wingdings" w:hint="default"/>
+        <w:sz w:val="20"/>
+      </w:rPr>
+    </w:lvl>
+    <w:lvl w:ilvl="3" w:tentative="1">
+      <w:start w:val="1"/>
+      <w:numFmt w:val="bullet"/>
+      <w:lvlText w:val=""/>
+      <w:lvlJc w:val="left"/>
+      <w:pPr>
+        <w:tabs>
+          <w:tab w:val="num" w:pos="2880"/>
+        </w:tabs>
+        <w:ind w:left="2880" w:hanging="360"/>
+      </w:pPr>
+      <w:rPr>
+        <w:rFonts w:ascii="Wingdings" w:hAnsi="Wingdings" w:hint="default"/>
+        <w:sz w:val="20"/>
+      </w:rPr>
+    </w:lvl>
+    <w:lvl w:ilvl="4" w:tentative="1">
+      <w:start w:val="1"/>
+      <w:numFmt w:val="bullet"/>
+      <w:lvlText w:val=""/>
+      <w:lvlJc w:val="left"/>
+      <w:pPr>
+        <w:tabs>
+          <w:tab w:val="num" w:pos="3600"/>
+        </w:tabs>
+        <w:ind w:left="3600" w:hanging="360"/>
+      </w:pPr>
+      <w:rPr>
+        <w:rFonts w:ascii="Wingdings" w:hAnsi="Wingdings" w:hint="default"/>
+        <w:sz w:val="20"/>
+      </w:rPr>
+    </w:lvl>
+    <w:lvl w:ilvl="5" w:tentative="1">
+      <w:start w:val="1"/>
+      <w:numFmt w:val="bullet"/>
+      <w:lvlText w:val=""/>
+      <w:lvlJc w:val="left"/>
+      <w:pPr>
+        <w:tabs>
+          <w:tab w:val="num" w:pos="4320"/>
+        </w:tabs>
+        <w:ind w:left="4320" w:hanging="360"/>
+      </w:pPr>
+      <w:rPr>
+        <w:rFonts w:ascii="Wingdings" w:hAnsi="Wingdings" w:hint="default"/>
+        <w:sz w:val="20"/>
+      </w:rPr>
+    </w:lvl>
+    <w:lvl w:ilvl="6" w:tentative="1">
+      <w:start w:val="1"/>
+      <w:numFmt w:val="bullet"/>
+      <w:lvlText w:val=""/>
+      <w:lvlJc w:val="left"/>
+      <w:pPr>
+        <w:tabs>
+          <w:tab w:val="num" w:pos="5040"/>
+        </w:tabs>
+        <w:ind w:left="5040" w:hanging="360"/>
+      </w:pPr>
+      <w:rPr>
+        <w:rFonts w:ascii="Wingdings" w:hAnsi="Wingdings" w:hint="default"/>
+        <w:sz w:val="20"/>
+      </w:rPr>
+    </w:lvl>
+    <w:lvl w:ilvl="7" w:tentative="1">
+      <w:start w:val="1"/>
+      <w:numFmt w:val="bullet"/>
+      <w:lvlText w:val=""/>
+      <w:lvlJc w:val="left"/>
+      <w:pPr>
+        <w:tabs>
+          <w:tab w:val="num" w:pos="5760"/>
+        </w:tabs>
+        <w:ind w:left="5760" w:hanging="360"/>
+      </w:pPr>
+      <w:rPr>
+        <w:rFonts w:ascii="Wingdings" w:hAnsi="Wingdings" w:hint="default"/>
+        <w:sz w:val="20"/>
+      </w:rPr>
+    </w:lvl>
+    <w:lvl w:ilvl="8" w:tentative="1">
+      <w:start w:val="1"/>
+      <w:numFmt w:val="bullet"/>
+      <w:lvlText w:val=""/>
+      <w:lvlJc w:val="left"/>
+      <w:pPr>
+        <w:tabs>
+          <w:tab w:val="num" w:pos="6480"/>
+        </w:tabs>
+        <w:ind w:left="6480" w:hanging="360"/>
+      </w:pPr>
+      <w:rPr>
+        <w:rFonts w:ascii="Wingdings" w:hAnsi="Wingdings" w:hint="default"/>
+        <w:sz w:val="20"/>
+      </w:rPr>
+    </w:lvl>
+  </w:abstractNum>
+  <w:abstractNum w:abstractNumId="11" w15:restartNumberingAfterBreak="0">
     <w:nsid w:val="409E361B"/>
     <w:multiLevelType w:val="multilevel"/>
     <w:tmpl w:val="C004D940"/>
@@ -4998,7 +7972,7 @@
       </w:pPr>
     </w:lvl>
   </w:abstractNum>
-  <w:abstractNum w:abstractNumId="8" w15:restartNumberingAfterBreak="0">
+  <w:abstractNum w:abstractNumId="12" w15:restartNumberingAfterBreak="0">
     <w:nsid w:val="45F45E7E"/>
     <w:multiLevelType w:val="multilevel"/>
     <w:tmpl w:val="C004D940"/>
@@ -5114,7 +8088,156 @@
       </w:pPr>
     </w:lvl>
   </w:abstractNum>
-  <w:abstractNum w:abstractNumId="9" w15:restartNumberingAfterBreak="0">
+  <w:abstractNum w:abstractNumId="13" w15:restartNumberingAfterBreak="0">
+    <w:nsid w:val="477C2D3D"/>
+    <w:multiLevelType w:val="multilevel"/>
+    <w:tmpl w:val="699ACB26"/>
+    <w:lvl w:ilvl="0">
+      <w:start w:val="1"/>
+      <w:numFmt w:val="bullet"/>
+      <w:lvlText w:val=""/>
+      <w:lvlJc w:val="left"/>
+      <w:pPr>
+        <w:tabs>
+          <w:tab w:val="num" w:pos="720"/>
+        </w:tabs>
+        <w:ind w:left="720" w:hanging="360"/>
+      </w:pPr>
+      <w:rPr>
+        <w:rFonts w:ascii="Symbol" w:hAnsi="Symbol" w:hint="default"/>
+        <w:sz w:val="20"/>
+      </w:rPr>
+    </w:lvl>
+    <w:lvl w:ilvl="1" w:tentative="1">
+      <w:start w:val="1"/>
+      <w:numFmt w:val="bullet"/>
+      <w:lvlText w:val="o"/>
+      <w:lvlJc w:val="left"/>
+      <w:pPr>
+        <w:tabs>
+          <w:tab w:val="num" w:pos="1440"/>
+        </w:tabs>
+        <w:ind w:left="1440" w:hanging="360"/>
+      </w:pPr>
+      <w:rPr>
+        <w:rFonts w:ascii="Courier New" w:hAnsi="Courier New" w:hint="default"/>
+        <w:sz w:val="20"/>
+      </w:rPr>
+    </w:lvl>
+    <w:lvl w:ilvl="2" w:tentative="1">
+      <w:start w:val="1"/>
+      <w:numFmt w:val="bullet"/>
+      <w:lvlText w:val=""/>
+      <w:lvlJc w:val="left"/>
+      <w:pPr>
+        <w:tabs>
+          <w:tab w:val="num" w:pos="2160"/>
+        </w:tabs>
+        <w:ind w:left="2160" w:hanging="360"/>
+      </w:pPr>
+      <w:rPr>
+        <w:rFonts w:ascii="Wingdings" w:hAnsi="Wingdings" w:hint="default"/>
+        <w:sz w:val="20"/>
+      </w:rPr>
+    </w:lvl>
+    <w:lvl w:ilvl="3" w:tentative="1">
+      <w:start w:val="1"/>
+      <w:numFmt w:val="bullet"/>
+      <w:lvlText w:val=""/>
+      <w:lvlJc w:val="left"/>
+      <w:pPr>
+        <w:tabs>
+          <w:tab w:val="num" w:pos="2880"/>
+        </w:tabs>
+        <w:ind w:left="2880" w:hanging="360"/>
+      </w:pPr>
+      <w:rPr>
+        <w:rFonts w:ascii="Wingdings" w:hAnsi="Wingdings" w:hint="default"/>
+        <w:sz w:val="20"/>
+      </w:rPr>
+    </w:lvl>
+    <w:lvl w:ilvl="4" w:tentative="1">
+      <w:start w:val="1"/>
+      <w:numFmt w:val="bullet"/>
+      <w:lvlText w:val=""/>
+      <w:lvlJc w:val="left"/>
+      <w:pPr>
+        <w:tabs>
+          <w:tab w:val="num" w:pos="3600"/>
+        </w:tabs>
+        <w:ind w:left="3600" w:hanging="360"/>
+      </w:pPr>
+      <w:rPr>
+        <w:rFonts w:ascii="Wingdings" w:hAnsi="Wingdings" w:hint="default"/>
+        <w:sz w:val="20"/>
+      </w:rPr>
+    </w:lvl>
+    <w:lvl w:ilvl="5" w:tentative="1">
+      <w:start w:val="1"/>
+      <w:numFmt w:val="bullet"/>
+      <w:lvlText w:val=""/>
+      <w:lvlJc w:val="left"/>
+      <w:pPr>
+        <w:tabs>
+          <w:tab w:val="num" w:pos="4320"/>
+        </w:tabs>
+        <w:ind w:left="4320" w:hanging="360"/>
+      </w:pPr>
+      <w:rPr>
+        <w:rFonts w:ascii="Wingdings" w:hAnsi="Wingdings" w:hint="default"/>
+        <w:sz w:val="20"/>
+      </w:rPr>
+    </w:lvl>
+    <w:lvl w:ilvl="6" w:tentative="1">
+      <w:start w:val="1"/>
+      <w:numFmt w:val="bullet"/>
+      <w:lvlText w:val=""/>
+      <w:lvlJc w:val="left"/>
+      <w:pPr>
+        <w:tabs>
+          <w:tab w:val="num" w:pos="5040"/>
+        </w:tabs>
+        <w:ind w:left="5040" w:hanging="360"/>
+      </w:pPr>
+      <w:rPr>
+        <w:rFonts w:ascii="Wingdings" w:hAnsi="Wingdings" w:hint="default"/>
+        <w:sz w:val="20"/>
+      </w:rPr>
+    </w:lvl>
+    <w:lvl w:ilvl="7" w:tentative="1">
+      <w:start w:val="1"/>
+      <w:numFmt w:val="bullet"/>
+      <w:lvlText w:val=""/>
+      <w:lvlJc w:val="left"/>
+      <w:pPr>
+        <w:tabs>
+          <w:tab w:val="num" w:pos="5760"/>
+        </w:tabs>
+        <w:ind w:left="5760" w:hanging="360"/>
+      </w:pPr>
+      <w:rPr>
+        <w:rFonts w:ascii="Wingdings" w:hAnsi="Wingdings" w:hint="default"/>
+        <w:sz w:val="20"/>
+      </w:rPr>
+    </w:lvl>
+    <w:lvl w:ilvl="8" w:tentative="1">
+      <w:start w:val="1"/>
+      <w:numFmt w:val="bullet"/>
+      <w:lvlText w:val=""/>
+      <w:lvlJc w:val="left"/>
+      <w:pPr>
+        <w:tabs>
+          <w:tab w:val="num" w:pos="6480"/>
+        </w:tabs>
+        <w:ind w:left="6480" w:hanging="360"/>
+      </w:pPr>
+      <w:rPr>
+        <w:rFonts w:ascii="Wingdings" w:hAnsi="Wingdings" w:hint="default"/>
+        <w:sz w:val="20"/>
+      </w:rPr>
+    </w:lvl>
+  </w:abstractNum>
+  <w:abstractNum w:abstractNumId="14" w15:restartNumberingAfterBreak="0">
     <w:nsid w:val="48FA5312"/>
     <w:multiLevelType w:val="multilevel"/>
     <w:tmpl w:val="374CD4BE"/>
@@ -5227,7 +8350,7 @@
       </w:pPr>
     </w:lvl>
   </w:abstractNum>
-  <w:abstractNum w:abstractNumId="10" w15:restartNumberingAfterBreak="0">
+  <w:abstractNum w:abstractNumId="15" w15:restartNumberingAfterBreak="0">
     <w:nsid w:val="4AF5570D"/>
     <w:multiLevelType w:val="multilevel"/>
     <w:tmpl w:val="C57CCA70"/>
@@ -5340,7 +8463,7 @@
       </w:pPr>
     </w:lvl>
   </w:abstractNum>
-  <w:abstractNum w:abstractNumId="11" w15:restartNumberingAfterBreak="0">
+  <w:abstractNum w:abstractNumId="16" w15:restartNumberingAfterBreak="0">
     <w:nsid w:val="586E4B65"/>
     <w:multiLevelType w:val="multilevel"/>
     <w:tmpl w:val="41F0F446"/>
@@ -5457,7 +8580,7 @@
       </w:pPr>
     </w:lvl>
   </w:abstractNum>
-  <w:abstractNum w:abstractNumId="12" w15:restartNumberingAfterBreak="0">
+  <w:abstractNum w:abstractNumId="17" w15:restartNumberingAfterBreak="0">
     <w:nsid w:val="5903124B"/>
     <w:multiLevelType w:val="multilevel"/>
     <w:tmpl w:val="C004D940"/>
@@ -5573,7 +8696,7 @@
       </w:pPr>
     </w:lvl>
   </w:abstractNum>
-  <w:abstractNum w:abstractNumId="13" w15:restartNumberingAfterBreak="0">
+  <w:abstractNum w:abstractNumId="18" w15:restartNumberingAfterBreak="0">
     <w:nsid w:val="5C5863DC"/>
     <w:multiLevelType w:val="hybridMultilevel"/>
     <w:tmpl w:val="5882D8E8"/>
@@ -5686,7 +8809,7 @@
       </w:rPr>
     </w:lvl>
   </w:abstractNum>
-  <w:abstractNum w:abstractNumId="14" w15:restartNumberingAfterBreak="0">
+  <w:abstractNum w:abstractNumId="19" w15:restartNumberingAfterBreak="0">
     <w:nsid w:val="65A40A0B"/>
     <w:multiLevelType w:val="multilevel"/>
     <w:tmpl w:val="D020EA54"/>
@@ -5799,7 +8922,123 @@
       </w:pPr>
     </w:lvl>
   </w:abstractNum>
-  <w:abstractNum w:abstractNumId="15" w15:restartNumberingAfterBreak="0">
+  <w:abstractNum w:abstractNumId="20" w15:restartNumberingAfterBreak="0">
+    <w:nsid w:val="67394D27"/>
+    <w:multiLevelType w:val="multilevel"/>
+    <w:tmpl w:val="F478303A"/>
+    <w:lvl w:ilvl="0">
+      <w:start w:val="1"/>
+      <w:numFmt w:val="bullet"/>
+      <w:lvlText w:val=""/>
+      <w:lvlJc w:val="left"/>
+      <w:pPr>
+        <w:tabs>
+          <w:tab w:val="num" w:pos="720"/>
+        </w:tabs>
+        <w:ind w:left="720" w:hanging="360"/>
+      </w:pPr>
+      <w:rPr>
+        <w:rFonts w:ascii="Symbol" w:hAnsi="Symbol" w:hint="default"/>
+      </w:rPr>
+    </w:lvl>
+    <w:lvl w:ilvl="1">
+      <w:start w:val="1"/>
+      <w:numFmt w:val="bullet"/>
+      <w:lvlText w:val=""/>
+      <w:lvlJc w:val="left"/>
+      <w:pPr>
+        <w:ind w:left="1440" w:hanging="360"/>
+      </w:pPr>
+      <w:rPr>
+        <w:rFonts w:ascii="Wingdings" w:hAnsi="Wingdings" w:hint="default"/>
+      </w:rPr>
+    </w:lvl>
+    <w:lvl w:ilvl="2" w:tentative="1">
+      <w:start w:val="1"/>
+      <w:numFmt w:val="decimal"/>
+      <w:lvlText w:val="%3."/>
+      <w:lvlJc w:val="left"/>
+      <w:pPr>
+        <w:tabs>
+          <w:tab w:val="num" w:pos="2160"/>
+        </w:tabs>
+        <w:ind w:left="2160" w:hanging="360"/>
+      </w:pPr>
+    </w:lvl>
+    <w:lvl w:ilvl="3" w:tentative="1">
+      <w:start w:val="1"/>
+      <w:numFmt w:val="decimal"/>
+      <w:lvlText w:val="%4."/>
+      <w:lvlJc w:val="left"/>
+      <w:pPr>
+        <w:tabs>
+          <w:tab w:val="num" w:pos="2880"/>
+        </w:tabs>
+        <w:ind w:left="2880" w:hanging="360"/>
+      </w:pPr>
+    </w:lvl>
+    <w:lvl w:ilvl="4" w:tentative="1">
+      <w:start w:val="1"/>
+      <w:numFmt w:val="decimal"/>
+      <w:lvlText w:val="%5."/>
+      <w:lvlJc w:val="left"/>
+      <w:pPr>
+        <w:tabs>
+          <w:tab w:val="num" w:pos="3600"/>
+        </w:tabs>
+        <w:ind w:left="3600" w:hanging="360"/>
+      </w:pPr>
+    </w:lvl>
+    <w:lvl w:ilvl="5" w:tentative="1">
+      <w:start w:val="1"/>
+      <w:numFmt w:val="decimal"/>
+      <w:lvlText w:val="%6."/>
+      <w:lvlJc w:val="left"/>
+      <w:pPr>
+        <w:tabs>
+          <w:tab w:val="num" w:pos="4320"/>
+        </w:tabs>
+        <w:ind w:left="4320" w:hanging="360"/>
+      </w:pPr>
+    </w:lvl>
+    <w:lvl w:ilvl="6" w:tentative="1">
+      <w:start w:val="1"/>
+      <w:numFmt w:val="decimal"/>
+      <w:lvlText w:val="%7."/>
+      <w:lvlJc w:val="left"/>
+      <w:pPr>
+        <w:tabs>
+          <w:tab w:val="num" w:pos="5040"/>
+        </w:tabs>
+        <w:ind w:left="5040" w:hanging="360"/>
+      </w:pPr>
+    </w:lvl>
+    <w:lvl w:ilvl="7" w:tentative="1">
+      <w:start w:val="1"/>
+      <w:numFmt w:val="decimal"/>
+      <w:lvlText w:val="%8."/>
+      <w:lvlJc w:val="left"/>
+      <w:pPr>
+        <w:tabs>
+          <w:tab w:val="num" w:pos="5760"/>
+        </w:tabs>
+        <w:ind w:left="5760" w:hanging="360"/>
+      </w:pPr>
+    </w:lvl>
+    <w:lvl w:ilvl="8" w:tentative="1">
+      <w:start w:val="1"/>
+      <w:numFmt w:val="decimal"/>
+      <w:lvlText w:val="%9."/>
+      <w:lvlJc w:val="left"/>
+      <w:pPr>
+        <w:tabs>
+          <w:tab w:val="num" w:pos="6480"/>
+        </w:tabs>
+        <w:ind w:left="6480" w:hanging="360"/>
+      </w:pPr>
+    </w:lvl>
+  </w:abstractNum>
+  <w:abstractNum w:abstractNumId="21" w15:restartNumberingAfterBreak="0">
     <w:nsid w:val="6E515ECC"/>
     <w:multiLevelType w:val="multilevel"/>
     <w:tmpl w:val="0E2CEB44"/>
@@ -5920,7 +9159,7 @@
       </w:pPr>
     </w:lvl>
   </w:abstractNum>
-  <w:abstractNum w:abstractNumId="16" w15:restartNumberingAfterBreak="0">
+  <w:abstractNum w:abstractNumId="22" w15:restartNumberingAfterBreak="0">
     <w:nsid w:val="6FCD542C"/>
     <w:multiLevelType w:val="multilevel"/>
     <w:tmpl w:val="A3AA5444"/>
@@ -6069,7 +9308,7 @@
       </w:rPr>
     </w:lvl>
   </w:abstractNum>
-  <w:abstractNum w:abstractNumId="17" w15:restartNumberingAfterBreak="0">
+  <w:abstractNum w:abstractNumId="23" w15:restartNumberingAfterBreak="0">
     <w:nsid w:val="70E439F3"/>
     <w:multiLevelType w:val="multilevel"/>
     <w:tmpl w:val="C2141348"/>
@@ -6182,7 +9421,123 @@
       </w:pPr>
     </w:lvl>
   </w:abstractNum>
-  <w:abstractNum w:abstractNumId="18" w15:restartNumberingAfterBreak="0">
+  <w:abstractNum w:abstractNumId="24" w15:restartNumberingAfterBreak="0">
+    <w:nsid w:val="78483E7D"/>
+    <w:multiLevelType w:val="multilevel"/>
+    <w:tmpl w:val="F478303A"/>
+    <w:lvl w:ilvl="0">
+      <w:start w:val="1"/>
+      <w:numFmt w:val="bullet"/>
+      <w:lvlText w:val=""/>
+      <w:lvlJc w:val="left"/>
+      <w:pPr>
+        <w:tabs>
+          <w:tab w:val="num" w:pos="720"/>
+        </w:tabs>
+        <w:ind w:left="720" w:hanging="360"/>
+      </w:pPr>
+      <w:rPr>
+        <w:rFonts w:ascii="Symbol" w:hAnsi="Symbol" w:hint="default"/>
+      </w:rPr>
+    </w:lvl>
+    <w:lvl w:ilvl="1">
+      <w:start w:val="1"/>
+      <w:numFmt w:val="bullet"/>
+      <w:lvlText w:val=""/>
+      <w:lvlJc w:val="left"/>
+      <w:pPr>
+        <w:ind w:left="1440" w:hanging="360"/>
+      </w:pPr>
+      <w:rPr>
+        <w:rFonts w:ascii="Wingdings" w:hAnsi="Wingdings" w:hint="default"/>
+      </w:rPr>
+    </w:lvl>
+    <w:lvl w:ilvl="2" w:tentative="1">
+      <w:start w:val="1"/>
+      <w:numFmt w:val="decimal"/>
+      <w:lvlText w:val="%3."/>
+      <w:lvlJc w:val="left"/>
+      <w:pPr>
+        <w:tabs>
+          <w:tab w:val="num" w:pos="2160"/>
+        </w:tabs>
+        <w:ind w:left="2160" w:hanging="360"/>
+      </w:pPr>
+    </w:lvl>
+    <w:lvl w:ilvl="3" w:tentative="1">
+      <w:start w:val="1"/>
+      <w:numFmt w:val="decimal"/>
+      <w:lvlText w:val="%4."/>
+      <w:lvlJc w:val="left"/>
+      <w:pPr>
+        <w:tabs>
+          <w:tab w:val="num" w:pos="2880"/>
+        </w:tabs>
+        <w:ind w:left="2880" w:hanging="360"/>
+      </w:pPr>
+    </w:lvl>
+    <w:lvl w:ilvl="4" w:tentative="1">
+      <w:start w:val="1"/>
+      <w:numFmt w:val="decimal"/>
+      <w:lvlText w:val="%5."/>
+      <w:lvlJc w:val="left"/>
+      <w:pPr>
+        <w:tabs>
+          <w:tab w:val="num" w:pos="3600"/>
+        </w:tabs>
+        <w:ind w:left="3600" w:hanging="360"/>
+      </w:pPr>
+    </w:lvl>
+    <w:lvl w:ilvl="5" w:tentative="1">
+      <w:start w:val="1"/>
+      <w:numFmt w:val="decimal"/>
+      <w:lvlText w:val="%6."/>
+      <w:lvlJc w:val="left"/>
+      <w:pPr>
+        <w:tabs>
+          <w:tab w:val="num" w:pos="4320"/>
+        </w:tabs>
+        <w:ind w:left="4320" w:hanging="360"/>
+      </w:pPr>
+    </w:lvl>
+    <w:lvl w:ilvl="6" w:tentative="1">
+      <w:start w:val="1"/>
+      <w:numFmt w:val="decimal"/>
+      <w:lvlText w:val="%7."/>
+      <w:lvlJc w:val="left"/>
+      <w:pPr>
+        <w:tabs>
+          <w:tab w:val="num" w:pos="5040"/>
+        </w:tabs>
+        <w:ind w:left="5040" w:hanging="360"/>
+      </w:pPr>
+    </w:lvl>
+    <w:lvl w:ilvl="7" w:tentative="1">
+      <w:start w:val="1"/>
+      <w:numFmt w:val="decimal"/>
+      <w:lvlText w:val="%8."/>
+      <w:lvlJc w:val="left"/>
+      <w:pPr>
+        <w:tabs>
+          <w:tab w:val="num" w:pos="5760"/>
+        </w:tabs>
+        <w:ind w:left="5760" w:hanging="360"/>
+      </w:pPr>
+    </w:lvl>
+    <w:lvl w:ilvl="8" w:tentative="1">
+      <w:start w:val="1"/>
+      <w:numFmt w:val="decimal"/>
+      <w:lvlText w:val="%9."/>
+      <w:lvlJc w:val="left"/>
+      <w:pPr>
+        <w:tabs>
+          <w:tab w:val="num" w:pos="6480"/>
+        </w:tabs>
+        <w:ind w:left="6480" w:hanging="360"/>
+      </w:pPr>
+    </w:lvl>
+  </w:abstractNum>
+  <w:abstractNum w:abstractNumId="25" w15:restartNumberingAfterBreak="0">
     <w:nsid w:val="78A3589E"/>
     <w:multiLevelType w:val="multilevel"/>
     <w:tmpl w:val="01A4574E"/>
@@ -6331,7 +9686,7 @@
       </w:rPr>
     </w:lvl>
   </w:abstractNum>
-  <w:abstractNum w:abstractNumId="19" w15:restartNumberingAfterBreak="0">
+  <w:abstractNum w:abstractNumId="26" w15:restartNumberingAfterBreak="0">
     <w:nsid w:val="7F954005"/>
     <w:multiLevelType w:val="hybridMultilevel"/>
     <w:tmpl w:val="77AEF24A"/>
@@ -6421,64 +9776,85 @@
     </w:lvl>
   </w:abstractNum>
   <w:num w:numId="1" w16cid:durableId="126751889">
-    <w:abstractNumId w:val="19"/>
+    <w:abstractNumId w:val="26"/>
   </w:num>
   <w:num w:numId="2" w16cid:durableId="748384058">
+    <w:abstractNumId w:val="5"/>
+  </w:num>
+  <w:num w:numId="3" w16cid:durableId="1643388772">
+    <w:abstractNumId w:val="16"/>
+  </w:num>
+  <w:num w:numId="4" w16cid:durableId="506410882">
+    <w:abstractNumId w:val="21"/>
+  </w:num>
+  <w:num w:numId="5" w16cid:durableId="1194147499">
     <w:abstractNumId w:val="4"/>
   </w:num>
-  <w:num w:numId="3" w16cid:durableId="1643388772">
-    <w:abstractNumId w:val="11"/>
+  <w:num w:numId="6" w16cid:durableId="674111321">
+    <w:abstractNumId w:val="22"/>
   </w:num>
-  <w:num w:numId="4" w16cid:durableId="506410882">
+  <w:num w:numId="7" w16cid:durableId="1527060396">
     <w:abstractNumId w:val="15"/>
   </w:num>
-  <w:num w:numId="5" w16cid:durableId="1194147499">
-    <w:abstractNumId w:val="3"/>
-  </w:num>
-  <w:num w:numId="6" w16cid:durableId="674111321">
-    <w:abstractNumId w:val="16"/>
-  </w:num>
-  <w:num w:numId="7" w16cid:durableId="1527060396">
-    <w:abstractNumId w:val="10"/>
-  </w:num>
   <w:num w:numId="8" w16cid:durableId="1072696516">
-    <w:abstractNumId w:val="13"/>
+    <w:abstractNumId w:val="18"/>
   </w:num>
   <w:num w:numId="9" w16cid:durableId="2101830472">
-    <w:abstractNumId w:val="17"/>
+    <w:abstractNumId w:val="23"/>
   </w:num>
   <w:num w:numId="10" w16cid:durableId="1823423382">
     <w:abstractNumId w:val="0"/>
   </w:num>
   <w:num w:numId="11" w16cid:durableId="285165444">
-    <w:abstractNumId w:val="9"/>
+    <w:abstractNumId w:val="14"/>
   </w:num>
   <w:num w:numId="12" w16cid:durableId="352652266">
-    <w:abstractNumId w:val="14"/>
+    <w:abstractNumId w:val="19"/>
   </w:num>
   <w:num w:numId="13" w16cid:durableId="1187867345">
-    <w:abstractNumId w:val="5"/>
+    <w:abstractNumId w:val="6"/>
   </w:num>
   <w:num w:numId="14" w16cid:durableId="1175726370">
-    <w:abstractNumId w:val="6"/>
+    <w:abstractNumId w:val="8"/>
   </w:num>
   <w:num w:numId="15" w16cid:durableId="1598248964">
-    <w:abstractNumId w:val="7"/>
+    <w:abstractNumId w:val="11"/>
   </w:num>
   <w:num w:numId="16" w16cid:durableId="64687026">
-    <w:abstractNumId w:val="12"/>
+    <w:abstractNumId w:val="17"/>
   </w:num>
   <w:num w:numId="17" w16cid:durableId="1037774048">
-    <w:abstractNumId w:val="8"/>
+    <w:abstractNumId w:val="12"/>
   </w:num>
   <w:num w:numId="18" w16cid:durableId="1352413890">
     <w:abstractNumId w:val="2"/>
   </w:num>
   <w:num w:numId="19" w16cid:durableId="1627735424">
-    <w:abstractNumId w:val="18"/>
+    <w:abstractNumId w:val="25"/>
   </w:num>
   <w:num w:numId="20" w16cid:durableId="1931740864">
     <w:abstractNumId w:val="1"/>
+  </w:num>
+  <w:num w:numId="21" w16cid:durableId="125398755">
+    <w:abstractNumId w:val="13"/>
+  </w:num>
+  <w:num w:numId="22" w16cid:durableId="645361614">
+    <w:abstractNumId w:val="9"/>
+  </w:num>
+  <w:num w:numId="23" w16cid:durableId="939995131">
+    <w:abstractNumId w:val="20"/>
+  </w:num>
+  <w:num w:numId="24" w16cid:durableId="777408353">
+    <w:abstractNumId w:val="24"/>
+  </w:num>
+  <w:num w:numId="25" w16cid:durableId="1778089636">
+    <w:abstractNumId w:val="3"/>
+  </w:num>
+  <w:num w:numId="26" w16cid:durableId="1842037948">
+    <w:abstractNumId w:val="7"/>
+  </w:num>
+  <w:num w:numId="27" w16cid:durableId="1294411949">
+    <w:abstractNumId w:val="10"/>
   </w:num>
 </w:numbering>
 </file>
@@ -6933,7 +10309,6 @@
     <w:next w:val="Normal"/>
     <w:link w:val="Heading3Char"/>
     <w:uiPriority w:val="9"/>
-    <w:semiHidden/>
     <w:unhideWhenUsed/>
     <w:qFormat/>
     <w:rsid w:val="00C219E1"/>
@@ -7139,7 +10514,6 @@
     <w:basedOn w:val="DefaultParagraphFont"/>
     <w:link w:val="Heading3"/>
     <w:uiPriority w:val="9"/>
-    <w:semiHidden/>
     <w:rsid w:val="00C219E1"/>
     <w:rPr>
       <w:rFonts w:eastAsiaTheme="majorEastAsia" w:cstheme="majorBidi"/>
@@ -7409,6 +10783,92 @@
       <w:sz w:val="20"/>
       <w:szCs w:val="20"/>
     </w:rPr>
+  </w:style>
+  <w:style w:type="paragraph" w:customStyle="1" w:styleId="ds-markdown-paragraph">
+    <w:name w:val="ds-markdown-paragraph"/>
+    <w:basedOn w:val="Normal"/>
+    <w:rsid w:val="007579BC"/>
+    <w:pPr>
+      <w:spacing w:before="100" w:beforeAutospacing="1" w:after="100" w:afterAutospacing="1" w:line="240" w:lineRule="auto"/>
+    </w:pPr>
+    <w:rPr>
+      <w:rFonts w:ascii="Times New Roman" w:eastAsia="Times New Roman" w:hAnsi="Times New Roman" w:cs="Times New Roman"/>
+      <w:kern w:val="0"/>
+      <w14:ligatures w14:val="none"/>
+    </w:rPr>
+  </w:style>
+  <w:style w:type="character" w:styleId="Strong">
+    <w:name w:val="Strong"/>
+    <w:basedOn w:val="DefaultParagraphFont"/>
+    <w:uiPriority w:val="22"/>
+    <w:qFormat/>
+    <w:rsid w:val="007579BC"/>
+    <w:rPr>
+      <w:b/>
+      <w:bCs/>
+    </w:rPr>
+  </w:style>
+  <w:style w:type="character" w:customStyle="1" w:styleId="d813de27">
+    <w:name w:val="d813de27"/>
+    <w:basedOn w:val="DefaultParagraphFont"/>
+    <w:rsid w:val="007579BC"/>
+  </w:style>
+  <w:style w:type="paragraph" w:styleId="HTMLPreformatted">
+    <w:name w:val="HTML Preformatted"/>
+    <w:basedOn w:val="Normal"/>
+    <w:link w:val="HTMLPreformattedChar"/>
+    <w:uiPriority w:val="99"/>
+    <w:semiHidden/>
+    <w:unhideWhenUsed/>
+    <w:rsid w:val="007579BC"/>
+    <w:pPr>
+      <w:tabs>
+        <w:tab w:val="left" w:pos="916"/>
+        <w:tab w:val="left" w:pos="1832"/>
+        <w:tab w:val="left" w:pos="2748"/>
+        <w:tab w:val="left" w:pos="3664"/>
+        <w:tab w:val="left" w:pos="4580"/>
+        <w:tab w:val="left" w:pos="5496"/>
+        <w:tab w:val="left" w:pos="6412"/>
+        <w:tab w:val="left" w:pos="7328"/>
+        <w:tab w:val="left" w:pos="8244"/>
+        <w:tab w:val="left" w:pos="9160"/>
+        <w:tab w:val="left" w:pos="10076"/>
+        <w:tab w:val="left" w:pos="10992"/>
+        <w:tab w:val="left" w:pos="11908"/>
+        <w:tab w:val="left" w:pos="12824"/>
+        <w:tab w:val="left" w:pos="13740"/>
+        <w:tab w:val="left" w:pos="14656"/>
+      </w:tabs>
+      <w:spacing w:after="0" w:line="240" w:lineRule="auto"/>
+    </w:pPr>
+    <w:rPr>
+      <w:rFonts w:ascii="Courier New" w:eastAsia="Times New Roman" w:hAnsi="Courier New" w:cs="Courier New"/>
+      <w:kern w:val="0"/>
+      <w:sz w:val="20"/>
+      <w:szCs w:val="20"/>
+      <w14:ligatures w14:val="none"/>
+    </w:rPr>
+  </w:style>
+  <w:style w:type="character" w:customStyle="1" w:styleId="HTMLPreformattedChar">
+    <w:name w:val="HTML Preformatted Char"/>
+    <w:basedOn w:val="DefaultParagraphFont"/>
+    <w:link w:val="HTMLPreformatted"/>
+    <w:uiPriority w:val="99"/>
+    <w:semiHidden/>
+    <w:rsid w:val="007579BC"/>
+    <w:rPr>
+      <w:rFonts w:ascii="Courier New" w:eastAsia="Times New Roman" w:hAnsi="Courier New" w:cs="Courier New"/>
+      <w:kern w:val="0"/>
+      <w:sz w:val="20"/>
+      <w:szCs w:val="20"/>
+      <w14:ligatures w14:val="none"/>
+    </w:rPr>
+  </w:style>
+  <w:style w:type="character" w:customStyle="1" w:styleId="token">
+    <w:name w:val="token"/>
+    <w:basedOn w:val="DefaultParagraphFont"/>
+    <w:rsid w:val="007579BC"/>
   </w:style>
 </w:styles>
 </file>

</xml_diff>

<commit_message>
charts embedded in excel
</commit_message>
<xml_diff>
--- a/Things To Do.docx
+++ b/Things To Do.docx
@@ -18467,7 +18467,6 @@
               <w:right w:w="240" w:type="dxa"/>
             </w:tcMar>
             <w:vAlign w:val="center"/>
-            <w:hideMark/>
           </w:tcPr>
           <w:p>
             <w:pPr>
@@ -18477,12 +18476,6 @@
                 <w:rFonts w:ascii="Times New Roman" w:hAnsi="Times New Roman" w:cs="Times New Roman"/>
               </w:rPr>
             </w:pPr>
-            <w:r>
-              <w:rPr>
-                <w:rFonts w:ascii="Times New Roman" w:hAnsi="Times New Roman" w:cs="Times New Roman"/>
-              </w:rPr>
-              <w:t>3</w:t>
-            </w:r>
           </w:p>
         </w:tc>
         <w:tc>
@@ -18495,7 +18488,6 @@
               <w:right w:w="240" w:type="dxa"/>
             </w:tcMar>
             <w:vAlign w:val="center"/>
-            <w:hideMark/>
           </w:tcPr>
           <w:p>
             <w:pPr>
@@ -18505,12 +18497,6 @@
                 <w:rFonts w:ascii="Times New Roman" w:hAnsi="Times New Roman" w:cs="Times New Roman"/>
               </w:rPr>
             </w:pPr>
-            <w:r>
-              <w:rPr>
-                <w:rFonts w:ascii="Times New Roman" w:hAnsi="Times New Roman" w:cs="Times New Roman"/>
-              </w:rPr>
-              <w:t>Better discovery for 1000+ vendors</w:t>
-            </w:r>
           </w:p>
         </w:tc>
         <w:tc>
@@ -18523,7 +18509,6 @@
               <w:right w:w="240" w:type="dxa"/>
             </w:tcMar>
             <w:vAlign w:val="center"/>
-            <w:hideMark/>
           </w:tcPr>
           <w:p>
             <w:pPr>
@@ -18533,12 +18518,6 @@
                 <w:rFonts w:ascii="Times New Roman" w:hAnsi="Times New Roman" w:cs="Times New Roman"/>
               </w:rPr>
             </w:pPr>
-            <w:r>
-              <w:rPr>
-                <w:rFonts w:ascii="Times New Roman" w:hAnsi="Times New Roman" w:cs="Times New Roman"/>
-              </w:rPr>
-              <w:t>Enhancement</w:t>
-            </w:r>
           </w:p>
         </w:tc>
         <w:tc>
@@ -18551,7 +18530,6 @@
               <w:right w:w="0" w:type="dxa"/>
             </w:tcMar>
             <w:vAlign w:val="center"/>
-            <w:hideMark/>
           </w:tcPr>
           <w:p>
             <w:pPr>
@@ -18561,12 +18539,6 @@
                 <w:rFonts w:ascii="Times New Roman" w:hAnsi="Times New Roman" w:cs="Times New Roman"/>
               </w:rPr>
             </w:pPr>
-            <w:r>
-              <w:rPr>
-                <w:rFonts w:ascii="Times New Roman" w:hAnsi="Times New Roman" w:cs="Times New Roman"/>
-              </w:rPr>
-              <w:t>1 hour</w:t>
-            </w:r>
           </w:p>
         </w:tc>
       </w:tr>
@@ -21021,6 +20993,744 @@
         </w:rPr>
       </w:pPr>
     </w:p>
+    <w:p>
+      <w:pPr>
+        <w:spacing w:line="240" w:lineRule="auto"/>
+        <w:contextualSpacing/>
+        <w:rPr>
+          <w:rFonts w:ascii="Times New Roman" w:hAnsi="Times New Roman" w:cs="Times New Roman"/>
+          <w:b/>
+          <w:bCs/>
+        </w:rPr>
+      </w:pPr>
+      <w:r>
+        <w:rPr>
+          <w:rFonts w:ascii="Times New Roman" w:hAnsi="Times New Roman" w:cs="Times New Roman"/>
+          <w:b/>
+          <w:bCs/>
+        </w:rPr>
+        <w:t>Behavior After Saving</w:t>
+      </w:r>
+    </w:p>
+    <w:p>
+      <w:pPr>
+        <w:spacing w:line="240" w:lineRule="auto"/>
+        <w:contextualSpacing/>
+        <w:rPr>
+          <w:rFonts w:ascii="Times New Roman" w:hAnsi="Times New Roman" w:cs="Times New Roman"/>
+          <w:b/>
+          <w:bCs/>
+        </w:rPr>
+      </w:pPr>
+      <w:r>
+        <w:rPr>
+          <w:rFonts w:ascii="Times New Roman" w:hAnsi="Times New Roman" w:cs="Times New Roman"/>
+          <w:b/>
+          <w:bCs/>
+        </w:rPr>
+        <w:t>On First Load</w:t>
+      </w:r>
+    </w:p>
+    <w:p>
+      <w:pPr>
+        <w:numPr>
+          <w:ilvl w:val="0"/>
+          <w:numId w:val="41"/>
+        </w:numPr>
+        <w:spacing w:line="240" w:lineRule="auto"/>
+        <w:contextualSpacing/>
+        <w:rPr>
+          <w:rFonts w:ascii="Times New Roman" w:hAnsi="Times New Roman" w:cs="Times New Roman"/>
+        </w:rPr>
+      </w:pPr>
+      <w:r>
+        <w:rPr>
+          <w:rFonts w:ascii="Times New Roman" w:hAnsi="Times New Roman" w:cs="Times New Roman"/>
+        </w:rPr>
+        <w:t>Hero section on top</w:t>
+      </w:r>
+    </w:p>
+    <w:p>
+      <w:pPr>
+        <w:numPr>
+          <w:ilvl w:val="0"/>
+          <w:numId w:val="41"/>
+        </w:numPr>
+        <w:spacing w:line="240" w:lineRule="auto"/>
+        <w:contextualSpacing/>
+        <w:rPr>
+          <w:rFonts w:ascii="Times New Roman" w:hAnsi="Times New Roman" w:cs="Times New Roman"/>
+        </w:rPr>
+      </w:pPr>
+      <w:r>
+        <w:rPr>
+          <w:rFonts w:ascii="Times New Roman" w:hAnsi="Times New Roman" w:cs="Times New Roman"/>
+          <w:b/>
+          <w:bCs/>
+        </w:rPr>
+        <w:t>"Browse by category"</w:t>
+      </w:r>
+      <w:r>
+        <w:rPr>
+          <w:rFonts w:ascii="Times New Roman" w:hAnsi="Times New Roman" w:cs="Times New Roman"/>
+        </w:rPr>
+        <w:t xml:space="preserve"> section with 9 big tiles (8 categories + "All Providers")</w:t>
+      </w:r>
+    </w:p>
+    <w:p>
+      <w:pPr>
+        <w:numPr>
+          <w:ilvl w:val="0"/>
+          <w:numId w:val="41"/>
+        </w:numPr>
+        <w:spacing w:line="240" w:lineRule="auto"/>
+        <w:contextualSpacing/>
+        <w:rPr>
+          <w:rFonts w:ascii="Times New Roman" w:hAnsi="Times New Roman" w:cs="Times New Roman"/>
+        </w:rPr>
+      </w:pPr>
+      <w:r>
+        <w:rPr>
+          <w:rFonts w:ascii="Times New Roman" w:hAnsi="Times New Roman" w:cs="Times New Roman"/>
+        </w:rPr>
+        <w:t>"All Providers" tile is highlighted by default</w:t>
+      </w:r>
+    </w:p>
+    <w:p>
+      <w:pPr>
+        <w:numPr>
+          <w:ilvl w:val="0"/>
+          <w:numId w:val="41"/>
+        </w:numPr>
+        <w:spacing w:line="240" w:lineRule="auto"/>
+        <w:contextualSpacing/>
+        <w:rPr>
+          <w:rFonts w:ascii="Times New Roman" w:hAnsi="Times New Roman" w:cs="Times New Roman"/>
+        </w:rPr>
+      </w:pPr>
+      <w:r>
+        <w:rPr>
+          <w:rFonts w:ascii="Times New Roman" w:hAnsi="Times New Roman" w:cs="Times New Roman"/>
+        </w:rPr>
+        <w:t>Search panel below (search, phase, court, max price)</w:t>
+      </w:r>
+    </w:p>
+    <w:p>
+      <w:pPr>
+        <w:numPr>
+          <w:ilvl w:val="0"/>
+          <w:numId w:val="41"/>
+        </w:numPr>
+        <w:spacing w:line="240" w:lineRule="auto"/>
+        <w:contextualSpacing/>
+        <w:rPr>
+          <w:rFonts w:ascii="Times New Roman" w:hAnsi="Times New Roman" w:cs="Times New Roman"/>
+        </w:rPr>
+      </w:pPr>
+      <w:r>
+        <w:rPr>
+          <w:rFonts w:ascii="Times New Roman" w:hAnsi="Times New Roman" w:cs="Times New Roman"/>
+        </w:rPr>
+        <w:t>Reset filters button</w:t>
+      </w:r>
+    </w:p>
+    <w:p>
+      <w:pPr>
+        <w:numPr>
+          <w:ilvl w:val="0"/>
+          <w:numId w:val="41"/>
+        </w:numPr>
+        <w:spacing w:line="240" w:lineRule="auto"/>
+        <w:contextualSpacing/>
+        <w:rPr>
+          <w:rFonts w:ascii="Times New Roman" w:hAnsi="Times New Roman" w:cs="Times New Roman"/>
+        </w:rPr>
+      </w:pPr>
+      <w:r>
+        <w:rPr>
+          <w:rFonts w:ascii="Times New Roman" w:hAnsi="Times New Roman" w:cs="Times New Roman"/>
+        </w:rPr>
+        <w:t>Results grid with up to 6 providers</w:t>
+      </w:r>
+    </w:p>
+    <w:p>
+      <w:pPr>
+        <w:numPr>
+          <w:ilvl w:val="0"/>
+          <w:numId w:val="41"/>
+        </w:numPr>
+        <w:spacing w:line="240" w:lineRule="auto"/>
+        <w:contextualSpacing/>
+        <w:rPr>
+          <w:rFonts w:ascii="Times New Roman" w:hAnsi="Times New Roman" w:cs="Times New Roman"/>
+        </w:rPr>
+      </w:pPr>
+      <w:r>
+        <w:rPr>
+          <w:rFonts w:ascii="Times New Roman" w:hAnsi="Times New Roman" w:cs="Times New Roman"/>
+          <w:b/>
+          <w:bCs/>
+        </w:rPr>
+        <w:t>"Load more (N remaining)"</w:t>
+      </w:r>
+      <w:r>
+        <w:rPr>
+          <w:rFonts w:ascii="Times New Roman" w:hAnsi="Times New Roman" w:cs="Times New Roman"/>
+        </w:rPr>
+        <w:t xml:space="preserve"> button if more than 6 providers exist</w:t>
+      </w:r>
+    </w:p>
+    <w:p>
+      <w:pPr>
+        <w:spacing w:line="240" w:lineRule="auto"/>
+        <w:contextualSpacing/>
+        <w:rPr>
+          <w:rFonts w:ascii="Times New Roman" w:hAnsi="Times New Roman" w:cs="Times New Roman"/>
+          <w:b/>
+          <w:bCs/>
+        </w:rPr>
+      </w:pPr>
+      <w:r>
+        <w:rPr>
+          <w:rFonts w:ascii="Times New Roman" w:hAnsi="Times New Roman" w:cs="Times New Roman"/>
+          <w:b/>
+          <w:bCs/>
+        </w:rPr>
+        <w:t>Click a Category Tile</w:t>
+      </w:r>
+    </w:p>
+    <w:p>
+      <w:pPr>
+        <w:numPr>
+          <w:ilvl w:val="0"/>
+          <w:numId w:val="42"/>
+        </w:numPr>
+        <w:spacing w:line="240" w:lineRule="auto"/>
+        <w:contextualSpacing/>
+        <w:rPr>
+          <w:rFonts w:ascii="Times New Roman" w:hAnsi="Times New Roman" w:cs="Times New Roman"/>
+        </w:rPr>
+      </w:pPr>
+      <w:r>
+        <w:rPr>
+          <w:rFonts w:ascii="Times New Roman" w:hAnsi="Times New Roman" w:cs="Times New Roman"/>
+        </w:rPr>
+        <w:t>Tile highlights</w:t>
+      </w:r>
+    </w:p>
+    <w:p>
+      <w:pPr>
+        <w:numPr>
+          <w:ilvl w:val="0"/>
+          <w:numId w:val="42"/>
+        </w:numPr>
+        <w:spacing w:line="240" w:lineRule="auto"/>
+        <w:contextualSpacing/>
+        <w:rPr>
+          <w:rFonts w:ascii="Times New Roman" w:hAnsi="Times New Roman" w:cs="Times New Roman"/>
+        </w:rPr>
+      </w:pPr>
+      <w:r>
+        <w:rPr>
+          <w:rFonts w:ascii="Times New Roman" w:hAnsi="Times New Roman" w:cs="Times New Roman"/>
+        </w:rPr>
+        <w:t xml:space="preserve">Heading changes to </w:t>
+      </w:r>
+      <w:r>
+        <w:rPr>
+          <w:rFonts w:ascii="Times New Roman" w:hAnsi="Times New Roman" w:cs="Times New Roman"/>
+          <w:b/>
+          <w:bCs/>
+        </w:rPr>
+        <w:t>"Cleaning providers"</w:t>
+      </w:r>
+      <w:r>
+        <w:rPr>
+          <w:rFonts w:ascii="Times New Roman" w:hAnsi="Times New Roman" w:cs="Times New Roman"/>
+        </w:rPr>
+        <w:t xml:space="preserve"> (or whatever category)</w:t>
+      </w:r>
+    </w:p>
+    <w:p>
+      <w:pPr>
+        <w:numPr>
+          <w:ilvl w:val="0"/>
+          <w:numId w:val="42"/>
+        </w:numPr>
+        <w:spacing w:line="240" w:lineRule="auto"/>
+        <w:contextualSpacing/>
+        <w:rPr>
+          <w:rFonts w:ascii="Times New Roman" w:hAnsi="Times New Roman" w:cs="Times New Roman"/>
+        </w:rPr>
+      </w:pPr>
+      <w:r>
+        <w:rPr>
+          <w:rFonts w:ascii="Times New Roman" w:hAnsi="Times New Roman" w:cs="Times New Roman"/>
+        </w:rPr>
+        <w:t>Page smooth-scrolls to the results</w:t>
+      </w:r>
+    </w:p>
+    <w:p>
+      <w:pPr>
+        <w:numPr>
+          <w:ilvl w:val="0"/>
+          <w:numId w:val="42"/>
+        </w:numPr>
+        <w:spacing w:line="240" w:lineRule="auto"/>
+        <w:contextualSpacing/>
+        <w:rPr>
+          <w:rFonts w:ascii="Times New Roman" w:hAnsi="Times New Roman" w:cs="Times New Roman"/>
+        </w:rPr>
+      </w:pPr>
+      <w:r>
+        <w:rPr>
+          <w:rFonts w:ascii="Times New Roman" w:hAnsi="Times New Roman" w:cs="Times New Roman"/>
+        </w:rPr>
+        <w:t>Grid refreshes with only that category's vendors</w:t>
+      </w:r>
+    </w:p>
+    <w:p>
+      <w:pPr>
+        <w:spacing w:line="240" w:lineRule="auto"/>
+        <w:contextualSpacing/>
+        <w:rPr>
+          <w:rFonts w:ascii="Times New Roman" w:hAnsi="Times New Roman" w:cs="Times New Roman"/>
+          <w:b/>
+          <w:bCs/>
+        </w:rPr>
+      </w:pPr>
+      <w:r>
+        <w:rPr>
+          <w:rFonts w:ascii="Times New Roman" w:hAnsi="Times New Roman" w:cs="Times New Roman"/>
+          <w:b/>
+          <w:bCs/>
+        </w:rPr>
+        <w:t>Load More</w:t>
+      </w:r>
+    </w:p>
+    <w:p>
+      <w:pPr>
+        <w:numPr>
+          <w:ilvl w:val="0"/>
+          <w:numId w:val="43"/>
+        </w:numPr>
+        <w:spacing w:line="240" w:lineRule="auto"/>
+        <w:contextualSpacing/>
+        <w:rPr>
+          <w:rFonts w:ascii="Times New Roman" w:hAnsi="Times New Roman" w:cs="Times New Roman"/>
+        </w:rPr>
+      </w:pPr>
+      <w:r>
+        <w:rPr>
+          <w:rFonts w:ascii="Times New Roman" w:hAnsi="Times New Roman" w:cs="Times New Roman"/>
+        </w:rPr>
+        <w:t>Click "Load more (N remaining)"</w:t>
+      </w:r>
+    </w:p>
+    <w:p>
+      <w:pPr>
+        <w:numPr>
+          <w:ilvl w:val="0"/>
+          <w:numId w:val="43"/>
+        </w:numPr>
+        <w:spacing w:line="240" w:lineRule="auto"/>
+        <w:contextualSpacing/>
+        <w:rPr>
+          <w:rFonts w:ascii="Times New Roman" w:hAnsi="Times New Roman" w:cs="Times New Roman"/>
+        </w:rPr>
+      </w:pPr>
+      <w:r>
+        <w:rPr>
+          <w:rFonts w:ascii="Times New Roman" w:hAnsi="Times New Roman" w:cs="Times New Roman"/>
+        </w:rPr>
+        <w:t>Next 6 vendors append to the existing grid</w:t>
+      </w:r>
+    </w:p>
+    <w:p>
+      <w:pPr>
+        <w:numPr>
+          <w:ilvl w:val="0"/>
+          <w:numId w:val="43"/>
+        </w:numPr>
+        <w:spacing w:line="240" w:lineRule="auto"/>
+        <w:contextualSpacing/>
+        <w:rPr>
+          <w:rFonts w:ascii="Times New Roman" w:hAnsi="Times New Roman" w:cs="Times New Roman"/>
+        </w:rPr>
+      </w:pPr>
+      <w:r>
+        <w:rPr>
+          <w:rFonts w:ascii="Times New Roman" w:hAnsi="Times New Roman" w:cs="Times New Roman"/>
+        </w:rPr>
+        <w:t>Button updates or disappears when all loaded</w:t>
+      </w:r>
+    </w:p>
+    <w:p>
+      <w:pPr>
+        <w:spacing w:line="240" w:lineRule="auto"/>
+        <w:contextualSpacing/>
+        <w:rPr>
+          <w:rFonts w:ascii="Times New Roman" w:hAnsi="Times New Roman" w:cs="Times New Roman"/>
+          <w:b/>
+          <w:bCs/>
+        </w:rPr>
+      </w:pPr>
+      <w:r>
+        <w:rPr>
+          <w:rFonts w:ascii="Times New Roman" w:hAnsi="Times New Roman" w:cs="Times New Roman"/>
+          <w:b/>
+          <w:bCs/>
+        </w:rPr>
+        <w:t>Filters Still Work</w:t>
+      </w:r>
+    </w:p>
+    <w:p>
+      <w:pPr>
+        <w:numPr>
+          <w:ilvl w:val="0"/>
+          <w:numId w:val="44"/>
+        </w:numPr>
+        <w:spacing w:line="240" w:lineRule="auto"/>
+        <w:contextualSpacing/>
+        <w:rPr>
+          <w:rFonts w:ascii="Times New Roman" w:hAnsi="Times New Roman" w:cs="Times New Roman"/>
+        </w:rPr>
+      </w:pPr>
+      <w:r>
+        <w:rPr>
+          <w:rFonts w:ascii="Times New Roman" w:hAnsi="Times New Roman" w:cs="Times New Roman"/>
+        </w:rPr>
+        <w:t>Search, phase, court, max price — all filter alongside the active category</w:t>
+      </w:r>
+    </w:p>
+    <w:p>
+      <w:pPr>
+        <w:numPr>
+          <w:ilvl w:val="0"/>
+          <w:numId w:val="44"/>
+        </w:numPr>
+        <w:spacing w:line="240" w:lineRule="auto"/>
+        <w:contextualSpacing/>
+        <w:rPr>
+          <w:rFonts w:ascii="Times New Roman" w:hAnsi="Times New Roman" w:cs="Times New Roman"/>
+        </w:rPr>
+      </w:pPr>
+      <w:r>
+        <w:rPr>
+          <w:rFonts w:ascii="Times New Roman" w:hAnsi="Times New Roman" w:cs="Times New Roman"/>
+        </w:rPr>
+        <w:t>Reset clears everything and goes back to "All Providers"</w:t>
+      </w:r>
+    </w:p>
+    <w:p>
+      <w:pPr>
+        <w:spacing w:line="240" w:lineRule="auto"/>
+        <w:contextualSpacing/>
+        <w:rPr>
+          <w:rFonts w:ascii="Times New Roman" w:hAnsi="Times New Roman" w:cs="Times New Roman"/>
+          <w:b/>
+          <w:bCs/>
+        </w:rPr>
+      </w:pPr>
+      <w:r>
+        <w:rPr>
+          <w:rFonts w:ascii="Times New Roman" w:hAnsi="Times New Roman" w:cs="Times New Roman"/>
+          <w:b/>
+          <w:bCs/>
+        </w:rPr>
+        <w:t>Smart Sorting</w:t>
+      </w:r>
+    </w:p>
+    <w:p>
+      <w:pPr>
+        <w:spacing w:line="240" w:lineRule="auto"/>
+        <w:contextualSpacing/>
+        <w:rPr>
+          <w:rFonts w:ascii="Times New Roman" w:hAnsi="Times New Roman" w:cs="Times New Roman"/>
+        </w:rPr>
+      </w:pPr>
+      <w:r>
+        <w:rPr>
+          <w:rFonts w:ascii="Times New Roman" w:hAnsi="Times New Roman" w:cs="Times New Roman"/>
+        </w:rPr>
+        <w:t>Backend already handles it: available → verified → rating → reviews. So available, top-rated vendors always appear first.</w:t>
+      </w:r>
+    </w:p>
+    <w:p>
+      <w:pPr>
+        <w:spacing w:line="240" w:lineRule="auto"/>
+        <w:contextualSpacing/>
+        <w:rPr>
+          <w:rFonts w:ascii="Times New Roman" w:hAnsi="Times New Roman" w:cs="Times New Roman"/>
+        </w:rPr>
+      </w:pPr>
+      <w:r>
+        <w:rPr>
+          <w:rFonts w:ascii="Times New Roman" w:hAnsi="Times New Roman" w:cs="Times New Roman"/>
+        </w:rPr>
+        <w:pict w14:anchorId="5AA61359">
+          <v:rect id="_x0000_i1146" style="width:0;height:.75pt" o:hralign="center" o:hrstd="t" o:hr="t" fillcolor="#a0a0a0" stroked="f"/>
+        </w:pict>
+      </w:r>
+    </w:p>
+    <w:p>
+      <w:pPr>
+        <w:spacing w:line="240" w:lineRule="auto"/>
+        <w:contextualSpacing/>
+        <w:rPr>
+          <w:rFonts w:ascii="Times New Roman" w:hAnsi="Times New Roman" w:cs="Times New Roman"/>
+          <w:b/>
+          <w:bCs/>
+        </w:rPr>
+      </w:pPr>
+      <w:r>
+        <w:rPr>
+          <w:rFonts w:ascii="Segoe UI Emoji" w:hAnsi="Segoe UI Emoji" w:cs="Segoe UI Emoji"/>
+          <w:b/>
+          <w:bCs/>
+        </w:rPr>
+        <w:t>🧪</w:t>
+      </w:r>
+      <w:r>
+        <w:rPr>
+          <w:rFonts w:ascii="Times New Roman" w:hAnsi="Times New Roman" w:cs="Times New Roman"/>
+          <w:b/>
+          <w:bCs/>
+        </w:rPr>
+        <w:t xml:space="preserve"> Quick Test</w:t>
+      </w:r>
+    </w:p>
+    <w:p>
+      <w:pPr>
+        <w:numPr>
+          <w:ilvl w:val="0"/>
+          <w:numId w:val="45"/>
+        </w:numPr>
+        <w:spacing w:line="240" w:lineRule="auto"/>
+        <w:contextualSpacing/>
+        <w:rPr>
+          <w:rFonts w:ascii="Times New Roman" w:hAnsi="Times New Roman" w:cs="Times New Roman"/>
+        </w:rPr>
+      </w:pPr>
+      <w:r>
+        <w:rPr>
+          <w:rFonts w:ascii="Times New Roman" w:hAnsi="Times New Roman" w:cs="Times New Roman"/>
+          <w:b/>
+          <w:bCs/>
+        </w:rPr>
+        <w:t>Save all 3 files</w:t>
+      </w:r>
+    </w:p>
+    <w:p>
+      <w:pPr>
+        <w:numPr>
+          <w:ilvl w:val="0"/>
+          <w:numId w:val="45"/>
+        </w:numPr>
+        <w:spacing w:line="240" w:lineRule="auto"/>
+        <w:contextualSpacing/>
+        <w:rPr>
+          <w:rFonts w:ascii="Times New Roman" w:hAnsi="Times New Roman" w:cs="Times New Roman"/>
+        </w:rPr>
+      </w:pPr>
+      <w:r>
+        <w:rPr>
+          <w:rFonts w:ascii="Times New Roman" w:hAnsi="Times New Roman" w:cs="Times New Roman"/>
+          <w:b/>
+          <w:bCs/>
+        </w:rPr>
+        <w:t>Hard refresh</w:t>
+      </w:r>
+      <w:r>
+        <w:rPr>
+          <w:rFonts w:ascii="Times New Roman" w:hAnsi="Times New Roman" w:cs="Times New Roman"/>
+        </w:rPr>
+        <w:t xml:space="preserve"> index.html (Ctrl + Shift + R)</w:t>
+      </w:r>
+    </w:p>
+    <w:p>
+      <w:pPr>
+        <w:numPr>
+          <w:ilvl w:val="0"/>
+          <w:numId w:val="45"/>
+        </w:numPr>
+        <w:spacing w:line="240" w:lineRule="auto"/>
+        <w:contextualSpacing/>
+        <w:rPr>
+          <w:rFonts w:ascii="Times New Roman" w:hAnsi="Times New Roman" w:cs="Times New Roman"/>
+        </w:rPr>
+      </w:pPr>
+      <w:r>
+        <w:rPr>
+          <w:rFonts w:ascii="Times New Roman" w:hAnsi="Times New Roman" w:cs="Times New Roman"/>
+          <w:b/>
+          <w:bCs/>
+        </w:rPr>
+        <w:t>Verify:</w:t>
+      </w:r>
+    </w:p>
+    <w:p>
+      <w:pPr>
+        <w:numPr>
+          <w:ilvl w:val="1"/>
+          <w:numId w:val="45"/>
+        </w:numPr>
+        <w:spacing w:line="240" w:lineRule="auto"/>
+        <w:contextualSpacing/>
+        <w:rPr>
+          <w:rFonts w:ascii="Times New Roman" w:hAnsi="Times New Roman" w:cs="Times New Roman"/>
+        </w:rPr>
+      </w:pPr>
+      <w:r>
+        <w:rPr>
+          <w:rFonts w:ascii="Times New Roman" w:hAnsi="Times New Roman" w:cs="Times New Roman"/>
+        </w:rPr>
+        <w:t>9 category tiles visible</w:t>
+      </w:r>
+    </w:p>
+    <w:p>
+      <w:pPr>
+        <w:numPr>
+          <w:ilvl w:val="1"/>
+          <w:numId w:val="45"/>
+        </w:numPr>
+        <w:spacing w:line="240" w:lineRule="auto"/>
+        <w:contextualSpacing/>
+        <w:rPr>
+          <w:rFonts w:ascii="Times New Roman" w:hAnsi="Times New Roman" w:cs="Times New Roman"/>
+        </w:rPr>
+      </w:pPr>
+      <w:r>
+        <w:rPr>
+          <w:rFonts w:ascii="Times New Roman" w:hAnsi="Times New Roman" w:cs="Times New Roman"/>
+        </w:rPr>
+        <w:t>"All Providers" active by default</w:t>
+      </w:r>
+    </w:p>
+    <w:p>
+      <w:pPr>
+        <w:numPr>
+          <w:ilvl w:val="1"/>
+          <w:numId w:val="45"/>
+        </w:numPr>
+        <w:spacing w:line="240" w:lineRule="auto"/>
+        <w:contextualSpacing/>
+        <w:rPr>
+          <w:rFonts w:ascii="Times New Roman" w:hAnsi="Times New Roman" w:cs="Times New Roman"/>
+        </w:rPr>
+      </w:pPr>
+      <w:r>
+        <w:rPr>
+          <w:rFonts w:ascii="Times New Roman" w:hAnsi="Times New Roman" w:cs="Times New Roman"/>
+        </w:rPr>
+        <w:t>Vendors grid loads</w:t>
+      </w:r>
+    </w:p>
+    <w:p>
+      <w:pPr>
+        <w:numPr>
+          <w:ilvl w:val="0"/>
+          <w:numId w:val="45"/>
+        </w:numPr>
+        <w:spacing w:line="240" w:lineRule="auto"/>
+        <w:contextualSpacing/>
+        <w:rPr>
+          <w:rFonts w:ascii="Times New Roman" w:hAnsi="Times New Roman" w:cs="Times New Roman"/>
+        </w:rPr>
+      </w:pPr>
+      <w:r>
+        <w:rPr>
+          <w:rFonts w:ascii="Times New Roman" w:hAnsi="Times New Roman" w:cs="Times New Roman"/>
+          <w:b/>
+          <w:bCs/>
+        </w:rPr>
+        <w:t>Click "Cleaning"</w:t>
+      </w:r>
+      <w:r>
+        <w:rPr>
+          <w:rFonts w:ascii="Times New Roman" w:hAnsi="Times New Roman" w:cs="Times New Roman"/>
+        </w:rPr>
+        <w:t xml:space="preserve"> → grid shows only </w:t>
+      </w:r>
+      <w:proofErr w:type="gramStart"/>
+      <w:r>
+        <w:rPr>
+          <w:rFonts w:ascii="Times New Roman" w:hAnsi="Times New Roman" w:cs="Times New Roman"/>
+        </w:rPr>
+        <w:t>Cleaning</w:t>
+      </w:r>
+      <w:proofErr w:type="gramEnd"/>
+      <w:r>
+        <w:rPr>
+          <w:rFonts w:ascii="Times New Roman" w:hAnsi="Times New Roman" w:cs="Times New Roman"/>
+        </w:rPr>
+        <w:t xml:space="preserve"> vendors</w:t>
+      </w:r>
+    </w:p>
+    <w:p>
+      <w:pPr>
+        <w:numPr>
+          <w:ilvl w:val="0"/>
+          <w:numId w:val="45"/>
+        </w:numPr>
+        <w:spacing w:line="240" w:lineRule="auto"/>
+        <w:contextualSpacing/>
+        <w:rPr>
+          <w:rFonts w:ascii="Times New Roman" w:hAnsi="Times New Roman" w:cs="Times New Roman"/>
+        </w:rPr>
+      </w:pPr>
+      <w:r>
+        <w:rPr>
+          <w:rFonts w:ascii="Times New Roman" w:hAnsi="Times New Roman" w:cs="Times New Roman"/>
+          <w:b/>
+          <w:bCs/>
+        </w:rPr>
+        <w:lastRenderedPageBreak/>
+        <w:t>Click "All Providers"</w:t>
+      </w:r>
+      <w:r>
+        <w:rPr>
+          <w:rFonts w:ascii="Times New Roman" w:hAnsi="Times New Roman" w:cs="Times New Roman"/>
+        </w:rPr>
+        <w:t xml:space="preserve"> → back to everything</w:t>
+      </w:r>
+    </w:p>
+    <w:p>
+      <w:pPr>
+        <w:numPr>
+          <w:ilvl w:val="0"/>
+          <w:numId w:val="45"/>
+        </w:numPr>
+        <w:spacing w:line="240" w:lineRule="auto"/>
+        <w:contextualSpacing/>
+        <w:rPr>
+          <w:rFonts w:ascii="Times New Roman" w:hAnsi="Times New Roman" w:cs="Times New Roman"/>
+        </w:rPr>
+      </w:pPr>
+      <w:r>
+        <w:rPr>
+          <w:rFonts w:ascii="Times New Roman" w:hAnsi="Times New Roman" w:cs="Times New Roman"/>
+          <w:b/>
+          <w:bCs/>
+        </w:rPr>
+        <w:t>If you have more than 6 vendors</w:t>
+      </w:r>
+      <w:r>
+        <w:rPr>
+          <w:rFonts w:ascii="Times New Roman" w:hAnsi="Times New Roman" w:cs="Times New Roman"/>
+        </w:rPr>
+        <w:t>, click Load More → next batch appears</w:t>
+      </w:r>
+    </w:p>
+    <w:p>
+      <w:pPr>
+        <w:spacing w:line="240" w:lineRule="auto"/>
+        <w:contextualSpacing/>
+        <w:rPr>
+          <w:rFonts w:ascii="Times New Roman" w:hAnsi="Times New Roman" w:cs="Times New Roman"/>
+        </w:rPr>
+      </w:pPr>
+    </w:p>
     <w:sectPr>
       <w:pgSz w:w="12240" w:h="15840"/>
       <w:pgMar w:top="1440" w:right="1440" w:bottom="1440" w:left="1440" w:header="720" w:footer="720" w:gutter="0"/>
@@ -21558,6 +22268,123 @@
     </w:lvl>
   </w:abstractNum>
   <w:abstractNum w:abstractNumId="4" w15:restartNumberingAfterBreak="0">
+    <w:nsid w:val="09CD3600"/>
+    <w:multiLevelType w:val="multilevel"/>
+    <w:tmpl w:val="9D787FDC"/>
+    <w:lvl w:ilvl="0">
+      <w:start w:val="1"/>
+      <w:numFmt w:val="decimal"/>
+      <w:lvlText w:val="%1."/>
+      <w:lvlJc w:val="left"/>
+      <w:pPr>
+        <w:tabs>
+          <w:tab w:val="num" w:pos="720"/>
+        </w:tabs>
+        <w:ind w:left="720" w:hanging="360"/>
+      </w:pPr>
+    </w:lvl>
+    <w:lvl w:ilvl="1">
+      <w:start w:val="1"/>
+      <w:numFmt w:val="bullet"/>
+      <w:lvlText w:val="o"/>
+      <w:lvlJc w:val="left"/>
+      <w:pPr>
+        <w:tabs>
+          <w:tab w:val="num" w:pos="1440"/>
+        </w:tabs>
+        <w:ind w:left="1440" w:hanging="360"/>
+      </w:pPr>
+      <w:rPr>
+        <w:rFonts w:ascii="Courier New" w:hAnsi="Courier New" w:hint="default"/>
+        <w:sz w:val="20"/>
+      </w:rPr>
+    </w:lvl>
+    <w:lvl w:ilvl="2" w:tentative="1">
+      <w:start w:val="1"/>
+      <w:numFmt w:val="decimal"/>
+      <w:lvlText w:val="%3."/>
+      <w:lvlJc w:val="left"/>
+      <w:pPr>
+        <w:tabs>
+          <w:tab w:val="num" w:pos="2160"/>
+        </w:tabs>
+        <w:ind w:left="2160" w:hanging="360"/>
+      </w:pPr>
+    </w:lvl>
+    <w:lvl w:ilvl="3" w:tentative="1">
+      <w:start w:val="1"/>
+      <w:numFmt w:val="decimal"/>
+      <w:lvlText w:val="%4."/>
+      <w:lvlJc w:val="left"/>
+      <w:pPr>
+        <w:tabs>
+          <w:tab w:val="num" w:pos="2880"/>
+        </w:tabs>
+        <w:ind w:left="2880" w:hanging="360"/>
+      </w:pPr>
+    </w:lvl>
+    <w:lvl w:ilvl="4" w:tentative="1">
+      <w:start w:val="1"/>
+      <w:numFmt w:val="decimal"/>
+      <w:lvlText w:val="%5."/>
+      <w:lvlJc w:val="left"/>
+      <w:pPr>
+        <w:tabs>
+          <w:tab w:val="num" w:pos="3600"/>
+        </w:tabs>
+        <w:ind w:left="3600" w:hanging="360"/>
+      </w:pPr>
+    </w:lvl>
+    <w:lvl w:ilvl="5" w:tentative="1">
+      <w:start w:val="1"/>
+      <w:numFmt w:val="decimal"/>
+      <w:lvlText w:val="%6."/>
+      <w:lvlJc w:val="left"/>
+      <w:pPr>
+        <w:tabs>
+          <w:tab w:val="num" w:pos="4320"/>
+        </w:tabs>
+        <w:ind w:left="4320" w:hanging="360"/>
+      </w:pPr>
+    </w:lvl>
+    <w:lvl w:ilvl="6" w:tentative="1">
+      <w:start w:val="1"/>
+      <w:numFmt w:val="decimal"/>
+      <w:lvlText w:val="%7."/>
+      <w:lvlJc w:val="left"/>
+      <w:pPr>
+        <w:tabs>
+          <w:tab w:val="num" w:pos="5040"/>
+        </w:tabs>
+        <w:ind w:left="5040" w:hanging="360"/>
+      </w:pPr>
+    </w:lvl>
+    <w:lvl w:ilvl="7" w:tentative="1">
+      <w:start w:val="1"/>
+      <w:numFmt w:val="decimal"/>
+      <w:lvlText w:val="%8."/>
+      <w:lvlJc w:val="left"/>
+      <w:pPr>
+        <w:tabs>
+          <w:tab w:val="num" w:pos="5760"/>
+        </w:tabs>
+        <w:ind w:left="5760" w:hanging="360"/>
+      </w:pPr>
+    </w:lvl>
+    <w:lvl w:ilvl="8" w:tentative="1">
+      <w:start w:val="1"/>
+      <w:numFmt w:val="decimal"/>
+      <w:lvlText w:val="%9."/>
+      <w:lvlJc w:val="left"/>
+      <w:pPr>
+        <w:tabs>
+          <w:tab w:val="num" w:pos="6480"/>
+        </w:tabs>
+        <w:ind w:left="6480" w:hanging="360"/>
+      </w:pPr>
+    </w:lvl>
+  </w:abstractNum>
+  <w:abstractNum w:abstractNumId="5" w15:restartNumberingAfterBreak="0">
     <w:nsid w:val="0E6D2CCC"/>
     <w:multiLevelType w:val="multilevel"/>
     <w:tmpl w:val="F478303A"/>
@@ -21673,7 +22500,7 @@
       </w:pPr>
     </w:lvl>
   </w:abstractNum>
-  <w:abstractNum w:abstractNumId="5" w15:restartNumberingAfterBreak="0">
+  <w:abstractNum w:abstractNumId="6" w15:restartNumberingAfterBreak="0">
     <w:nsid w:val="11B90DCB"/>
     <w:multiLevelType w:val="multilevel"/>
     <w:tmpl w:val="3C9A47FE"/>
@@ -21789,7 +22616,7 @@
       </w:pPr>
     </w:lvl>
   </w:abstractNum>
-  <w:abstractNum w:abstractNumId="6" w15:restartNumberingAfterBreak="0">
+  <w:abstractNum w:abstractNumId="7" w15:restartNumberingAfterBreak="0">
     <w:nsid w:val="133E722E"/>
     <w:multiLevelType w:val="multilevel"/>
     <w:tmpl w:val="2270703E"/>
@@ -21902,7 +22729,7 @@
       </w:pPr>
     </w:lvl>
   </w:abstractNum>
-  <w:abstractNum w:abstractNumId="7" w15:restartNumberingAfterBreak="0">
+  <w:abstractNum w:abstractNumId="8" w15:restartNumberingAfterBreak="0">
     <w:nsid w:val="14E6009A"/>
     <w:multiLevelType w:val="multilevel"/>
     <w:tmpl w:val="9FB0D2EE"/>
@@ -22018,7 +22845,7 @@
       </w:pPr>
     </w:lvl>
   </w:abstractNum>
-  <w:abstractNum w:abstractNumId="8" w15:restartNumberingAfterBreak="0">
+  <w:abstractNum w:abstractNumId="9" w15:restartNumberingAfterBreak="0">
     <w:nsid w:val="1B49055C"/>
     <w:multiLevelType w:val="multilevel"/>
     <w:tmpl w:val="B218AF40"/>
@@ -22167,7 +22994,7 @@
       </w:rPr>
     </w:lvl>
   </w:abstractNum>
-  <w:abstractNum w:abstractNumId="9" w15:restartNumberingAfterBreak="0">
+  <w:abstractNum w:abstractNumId="10" w15:restartNumberingAfterBreak="0">
     <w:nsid w:val="29D763A3"/>
     <w:multiLevelType w:val="multilevel"/>
     <w:tmpl w:val="84F41D54"/>
@@ -22316,7 +23143,156 @@
       </w:rPr>
     </w:lvl>
   </w:abstractNum>
-  <w:abstractNum w:abstractNumId="10" w15:restartNumberingAfterBreak="0">
+  <w:abstractNum w:abstractNumId="11" w15:restartNumberingAfterBreak="0">
+    <w:nsid w:val="2B4D646F"/>
+    <w:multiLevelType w:val="multilevel"/>
+    <w:tmpl w:val="8D34744A"/>
+    <w:lvl w:ilvl="0">
+      <w:start w:val="1"/>
+      <w:numFmt w:val="bullet"/>
+      <w:lvlText w:val=""/>
+      <w:lvlJc w:val="left"/>
+      <w:pPr>
+        <w:tabs>
+          <w:tab w:val="num" w:pos="720"/>
+        </w:tabs>
+        <w:ind w:left="720" w:hanging="360"/>
+      </w:pPr>
+      <w:rPr>
+        <w:rFonts w:ascii="Symbol" w:hAnsi="Symbol" w:hint="default"/>
+        <w:sz w:val="20"/>
+      </w:rPr>
+    </w:lvl>
+    <w:lvl w:ilvl="1" w:tentative="1">
+      <w:start w:val="1"/>
+      <w:numFmt w:val="bullet"/>
+      <w:lvlText w:val="o"/>
+      <w:lvlJc w:val="left"/>
+      <w:pPr>
+        <w:tabs>
+          <w:tab w:val="num" w:pos="1440"/>
+        </w:tabs>
+        <w:ind w:left="1440" w:hanging="360"/>
+      </w:pPr>
+      <w:rPr>
+        <w:rFonts w:ascii="Courier New" w:hAnsi="Courier New" w:hint="default"/>
+        <w:sz w:val="20"/>
+      </w:rPr>
+    </w:lvl>
+    <w:lvl w:ilvl="2" w:tentative="1">
+      <w:start w:val="1"/>
+      <w:numFmt w:val="bullet"/>
+      <w:lvlText w:val=""/>
+      <w:lvlJc w:val="left"/>
+      <w:pPr>
+        <w:tabs>
+          <w:tab w:val="num" w:pos="2160"/>
+        </w:tabs>
+        <w:ind w:left="2160" w:hanging="360"/>
+      </w:pPr>
+      <w:rPr>
+        <w:rFonts w:ascii="Wingdings" w:hAnsi="Wingdings" w:hint="default"/>
+        <w:sz w:val="20"/>
+      </w:rPr>
+    </w:lvl>
+    <w:lvl w:ilvl="3" w:tentative="1">
+      <w:start w:val="1"/>
+      <w:numFmt w:val="bullet"/>
+      <w:lvlText w:val=""/>
+      <w:lvlJc w:val="left"/>
+      <w:pPr>
+        <w:tabs>
+          <w:tab w:val="num" w:pos="2880"/>
+        </w:tabs>
+        <w:ind w:left="2880" w:hanging="360"/>
+      </w:pPr>
+      <w:rPr>
+        <w:rFonts w:ascii="Wingdings" w:hAnsi="Wingdings" w:hint="default"/>
+        <w:sz w:val="20"/>
+      </w:rPr>
+    </w:lvl>
+    <w:lvl w:ilvl="4" w:tentative="1">
+      <w:start w:val="1"/>
+      <w:numFmt w:val="bullet"/>
+      <w:lvlText w:val=""/>
+      <w:lvlJc w:val="left"/>
+      <w:pPr>
+        <w:tabs>
+          <w:tab w:val="num" w:pos="3600"/>
+        </w:tabs>
+        <w:ind w:left="3600" w:hanging="360"/>
+      </w:pPr>
+      <w:rPr>
+        <w:rFonts w:ascii="Wingdings" w:hAnsi="Wingdings" w:hint="default"/>
+        <w:sz w:val="20"/>
+      </w:rPr>
+    </w:lvl>
+    <w:lvl w:ilvl="5" w:tentative="1">
+      <w:start w:val="1"/>
+      <w:numFmt w:val="bullet"/>
+      <w:lvlText w:val=""/>
+      <w:lvlJc w:val="left"/>
+      <w:pPr>
+        <w:tabs>
+          <w:tab w:val="num" w:pos="4320"/>
+        </w:tabs>
+        <w:ind w:left="4320" w:hanging="360"/>
+      </w:pPr>
+      <w:rPr>
+        <w:rFonts w:ascii="Wingdings" w:hAnsi="Wingdings" w:hint="default"/>
+        <w:sz w:val="20"/>
+      </w:rPr>
+    </w:lvl>
+    <w:lvl w:ilvl="6" w:tentative="1">
+      <w:start w:val="1"/>
+      <w:numFmt w:val="bullet"/>
+      <w:lvlText w:val=""/>
+      <w:lvlJc w:val="left"/>
+      <w:pPr>
+        <w:tabs>
+          <w:tab w:val="num" w:pos="5040"/>
+        </w:tabs>
+        <w:ind w:left="5040" w:hanging="360"/>
+      </w:pPr>
+      <w:rPr>
+        <w:rFonts w:ascii="Wingdings" w:hAnsi="Wingdings" w:hint="default"/>
+        <w:sz w:val="20"/>
+      </w:rPr>
+    </w:lvl>
+    <w:lvl w:ilvl="7" w:tentative="1">
+      <w:start w:val="1"/>
+      <w:numFmt w:val="bullet"/>
+      <w:lvlText w:val=""/>
+      <w:lvlJc w:val="left"/>
+      <w:pPr>
+        <w:tabs>
+          <w:tab w:val="num" w:pos="5760"/>
+        </w:tabs>
+        <w:ind w:left="5760" w:hanging="360"/>
+      </w:pPr>
+      <w:rPr>
+        <w:rFonts w:ascii="Wingdings" w:hAnsi="Wingdings" w:hint="default"/>
+        <w:sz w:val="20"/>
+      </w:rPr>
+    </w:lvl>
+    <w:lvl w:ilvl="8" w:tentative="1">
+      <w:start w:val="1"/>
+      <w:numFmt w:val="bullet"/>
+      <w:lvlText w:val=""/>
+      <w:lvlJc w:val="left"/>
+      <w:pPr>
+        <w:tabs>
+          <w:tab w:val="num" w:pos="6480"/>
+        </w:tabs>
+        <w:ind w:left="6480" w:hanging="360"/>
+      </w:pPr>
+      <w:rPr>
+        <w:rFonts w:ascii="Wingdings" w:hAnsi="Wingdings" w:hint="default"/>
+        <w:sz w:val="20"/>
+      </w:rPr>
+    </w:lvl>
+  </w:abstractNum>
+  <w:abstractNum w:abstractNumId="12" w15:restartNumberingAfterBreak="0">
     <w:nsid w:val="30A44DF6"/>
     <w:multiLevelType w:val="multilevel"/>
     <w:tmpl w:val="41444EDC"/>
@@ -22429,7 +23405,7 @@
       </w:pPr>
     </w:lvl>
   </w:abstractNum>
-  <w:abstractNum w:abstractNumId="11" w15:restartNumberingAfterBreak="0">
+  <w:abstractNum w:abstractNumId="13" w15:restartNumberingAfterBreak="0">
     <w:nsid w:val="34086244"/>
     <w:multiLevelType w:val="multilevel"/>
     <w:tmpl w:val="C004D940"/>
@@ -22545,7 +23521,156 @@
       </w:pPr>
     </w:lvl>
   </w:abstractNum>
-  <w:abstractNum w:abstractNumId="12" w15:restartNumberingAfterBreak="0">
+  <w:abstractNum w:abstractNumId="14" w15:restartNumberingAfterBreak="0">
+    <w:nsid w:val="355B1F2C"/>
+    <w:multiLevelType w:val="multilevel"/>
+    <w:tmpl w:val="477CE986"/>
+    <w:lvl w:ilvl="0">
+      <w:start w:val="1"/>
+      <w:numFmt w:val="bullet"/>
+      <w:lvlText w:val=""/>
+      <w:lvlJc w:val="left"/>
+      <w:pPr>
+        <w:tabs>
+          <w:tab w:val="num" w:pos="720"/>
+        </w:tabs>
+        <w:ind w:left="720" w:hanging="360"/>
+      </w:pPr>
+      <w:rPr>
+        <w:rFonts w:ascii="Symbol" w:hAnsi="Symbol" w:hint="default"/>
+        <w:sz w:val="20"/>
+      </w:rPr>
+    </w:lvl>
+    <w:lvl w:ilvl="1" w:tentative="1">
+      <w:start w:val="1"/>
+      <w:numFmt w:val="bullet"/>
+      <w:lvlText w:val="o"/>
+      <w:lvlJc w:val="left"/>
+      <w:pPr>
+        <w:tabs>
+          <w:tab w:val="num" w:pos="1440"/>
+        </w:tabs>
+        <w:ind w:left="1440" w:hanging="360"/>
+      </w:pPr>
+      <w:rPr>
+        <w:rFonts w:ascii="Courier New" w:hAnsi="Courier New" w:hint="default"/>
+        <w:sz w:val="20"/>
+      </w:rPr>
+    </w:lvl>
+    <w:lvl w:ilvl="2" w:tentative="1">
+      <w:start w:val="1"/>
+      <w:numFmt w:val="bullet"/>
+      <w:lvlText w:val=""/>
+      <w:lvlJc w:val="left"/>
+      <w:pPr>
+        <w:tabs>
+          <w:tab w:val="num" w:pos="2160"/>
+        </w:tabs>
+        <w:ind w:left="2160" w:hanging="360"/>
+      </w:pPr>
+      <w:rPr>
+        <w:rFonts w:ascii="Wingdings" w:hAnsi="Wingdings" w:hint="default"/>
+        <w:sz w:val="20"/>
+      </w:rPr>
+    </w:lvl>
+    <w:lvl w:ilvl="3" w:tentative="1">
+      <w:start w:val="1"/>
+      <w:numFmt w:val="bullet"/>
+      <w:lvlText w:val=""/>
+      <w:lvlJc w:val="left"/>
+      <w:pPr>
+        <w:tabs>
+          <w:tab w:val="num" w:pos="2880"/>
+        </w:tabs>
+        <w:ind w:left="2880" w:hanging="360"/>
+      </w:pPr>
+      <w:rPr>
+        <w:rFonts w:ascii="Wingdings" w:hAnsi="Wingdings" w:hint="default"/>
+        <w:sz w:val="20"/>
+      </w:rPr>
+    </w:lvl>
+    <w:lvl w:ilvl="4" w:tentative="1">
+      <w:start w:val="1"/>
+      <w:numFmt w:val="bullet"/>
+      <w:lvlText w:val=""/>
+      <w:lvlJc w:val="left"/>
+      <w:pPr>
+        <w:tabs>
+          <w:tab w:val="num" w:pos="3600"/>
+        </w:tabs>
+        <w:ind w:left="3600" w:hanging="360"/>
+      </w:pPr>
+      <w:rPr>
+        <w:rFonts w:ascii="Wingdings" w:hAnsi="Wingdings" w:hint="default"/>
+        <w:sz w:val="20"/>
+      </w:rPr>
+    </w:lvl>
+    <w:lvl w:ilvl="5" w:tentative="1">
+      <w:start w:val="1"/>
+      <w:numFmt w:val="bullet"/>
+      <w:lvlText w:val=""/>
+      <w:lvlJc w:val="left"/>
+      <w:pPr>
+        <w:tabs>
+          <w:tab w:val="num" w:pos="4320"/>
+        </w:tabs>
+        <w:ind w:left="4320" w:hanging="360"/>
+      </w:pPr>
+      <w:rPr>
+        <w:rFonts w:ascii="Wingdings" w:hAnsi="Wingdings" w:hint="default"/>
+        <w:sz w:val="20"/>
+      </w:rPr>
+    </w:lvl>
+    <w:lvl w:ilvl="6" w:tentative="1">
+      <w:start w:val="1"/>
+      <w:numFmt w:val="bullet"/>
+      <w:lvlText w:val=""/>
+      <w:lvlJc w:val="left"/>
+      <w:pPr>
+        <w:tabs>
+          <w:tab w:val="num" w:pos="5040"/>
+        </w:tabs>
+        <w:ind w:left="5040" w:hanging="360"/>
+      </w:pPr>
+      <w:rPr>
+        <w:rFonts w:ascii="Wingdings" w:hAnsi="Wingdings" w:hint="default"/>
+        <w:sz w:val="20"/>
+      </w:rPr>
+    </w:lvl>
+    <w:lvl w:ilvl="7" w:tentative="1">
+      <w:start w:val="1"/>
+      <w:numFmt w:val="bullet"/>
+      <w:lvlText w:val=""/>
+      <w:lvlJc w:val="left"/>
+      <w:pPr>
+        <w:tabs>
+          <w:tab w:val="num" w:pos="5760"/>
+        </w:tabs>
+        <w:ind w:left="5760" w:hanging="360"/>
+      </w:pPr>
+      <w:rPr>
+        <w:rFonts w:ascii="Wingdings" w:hAnsi="Wingdings" w:hint="default"/>
+        <w:sz w:val="20"/>
+      </w:rPr>
+    </w:lvl>
+    <w:lvl w:ilvl="8" w:tentative="1">
+      <w:start w:val="1"/>
+      <w:numFmt w:val="bullet"/>
+      <w:lvlText w:val=""/>
+      <w:lvlJc w:val="left"/>
+      <w:pPr>
+        <w:tabs>
+          <w:tab w:val="num" w:pos="6480"/>
+        </w:tabs>
+        <w:ind w:left="6480" w:hanging="360"/>
+      </w:pPr>
+      <w:rPr>
+        <w:rFonts w:ascii="Wingdings" w:hAnsi="Wingdings" w:hint="default"/>
+        <w:sz w:val="20"/>
+      </w:rPr>
+    </w:lvl>
+  </w:abstractNum>
+  <w:abstractNum w:abstractNumId="15" w15:restartNumberingAfterBreak="0">
     <w:nsid w:val="36FD4B50"/>
     <w:multiLevelType w:val="multilevel"/>
     <w:tmpl w:val="F3A2255E"/>
@@ -22694,7 +23819,7 @@
       </w:rPr>
     </w:lvl>
   </w:abstractNum>
-  <w:abstractNum w:abstractNumId="13" w15:restartNumberingAfterBreak="0">
+  <w:abstractNum w:abstractNumId="16" w15:restartNumberingAfterBreak="0">
     <w:nsid w:val="38623467"/>
     <w:multiLevelType w:val="multilevel"/>
     <w:tmpl w:val="FFD67CFC"/>
@@ -22843,7 +23968,7 @@
       </w:rPr>
     </w:lvl>
   </w:abstractNum>
-  <w:abstractNum w:abstractNumId="14" w15:restartNumberingAfterBreak="0">
+  <w:abstractNum w:abstractNumId="17" w15:restartNumberingAfterBreak="0">
     <w:nsid w:val="38891045"/>
     <w:multiLevelType w:val="multilevel"/>
     <w:tmpl w:val="CC961CC2"/>
@@ -22992,7 +24117,7 @@
       </w:rPr>
     </w:lvl>
   </w:abstractNum>
-  <w:abstractNum w:abstractNumId="15" w15:restartNumberingAfterBreak="0">
+  <w:abstractNum w:abstractNumId="18" w15:restartNumberingAfterBreak="0">
     <w:nsid w:val="39803572"/>
     <w:multiLevelType w:val="multilevel"/>
     <w:tmpl w:val="3B4A0F72"/>
@@ -23105,7 +24230,7 @@
       </w:pPr>
     </w:lvl>
   </w:abstractNum>
-  <w:abstractNum w:abstractNumId="16" w15:restartNumberingAfterBreak="0">
+  <w:abstractNum w:abstractNumId="19" w15:restartNumberingAfterBreak="0">
     <w:nsid w:val="3F6431AD"/>
     <w:multiLevelType w:val="multilevel"/>
     <w:tmpl w:val="F07684DA"/>
@@ -23218,7 +24343,156 @@
       </w:pPr>
     </w:lvl>
   </w:abstractNum>
-  <w:abstractNum w:abstractNumId="17" w15:restartNumberingAfterBreak="0">
+  <w:abstractNum w:abstractNumId="20" w15:restartNumberingAfterBreak="0">
+    <w:nsid w:val="3F8817E0"/>
+    <w:multiLevelType w:val="multilevel"/>
+    <w:tmpl w:val="4F2E19CA"/>
+    <w:lvl w:ilvl="0">
+      <w:start w:val="1"/>
+      <w:numFmt w:val="bullet"/>
+      <w:lvlText w:val=""/>
+      <w:lvlJc w:val="left"/>
+      <w:pPr>
+        <w:tabs>
+          <w:tab w:val="num" w:pos="720"/>
+        </w:tabs>
+        <w:ind w:left="720" w:hanging="360"/>
+      </w:pPr>
+      <w:rPr>
+        <w:rFonts w:ascii="Symbol" w:hAnsi="Symbol" w:hint="default"/>
+        <w:sz w:val="20"/>
+      </w:rPr>
+    </w:lvl>
+    <w:lvl w:ilvl="1" w:tentative="1">
+      <w:start w:val="1"/>
+      <w:numFmt w:val="bullet"/>
+      <w:lvlText w:val="o"/>
+      <w:lvlJc w:val="left"/>
+      <w:pPr>
+        <w:tabs>
+          <w:tab w:val="num" w:pos="1440"/>
+        </w:tabs>
+        <w:ind w:left="1440" w:hanging="360"/>
+      </w:pPr>
+      <w:rPr>
+        <w:rFonts w:ascii="Courier New" w:hAnsi="Courier New" w:hint="default"/>
+        <w:sz w:val="20"/>
+      </w:rPr>
+    </w:lvl>
+    <w:lvl w:ilvl="2" w:tentative="1">
+      <w:start w:val="1"/>
+      <w:numFmt w:val="bullet"/>
+      <w:lvlText w:val=""/>
+      <w:lvlJc w:val="left"/>
+      <w:pPr>
+        <w:tabs>
+          <w:tab w:val="num" w:pos="2160"/>
+        </w:tabs>
+        <w:ind w:left="2160" w:hanging="360"/>
+      </w:pPr>
+      <w:rPr>
+        <w:rFonts w:ascii="Wingdings" w:hAnsi="Wingdings" w:hint="default"/>
+        <w:sz w:val="20"/>
+      </w:rPr>
+    </w:lvl>
+    <w:lvl w:ilvl="3" w:tentative="1">
+      <w:start w:val="1"/>
+      <w:numFmt w:val="bullet"/>
+      <w:lvlText w:val=""/>
+      <w:lvlJc w:val="left"/>
+      <w:pPr>
+        <w:tabs>
+          <w:tab w:val="num" w:pos="2880"/>
+        </w:tabs>
+        <w:ind w:left="2880" w:hanging="360"/>
+      </w:pPr>
+      <w:rPr>
+        <w:rFonts w:ascii="Wingdings" w:hAnsi="Wingdings" w:hint="default"/>
+        <w:sz w:val="20"/>
+      </w:rPr>
+    </w:lvl>
+    <w:lvl w:ilvl="4" w:tentative="1">
+      <w:start w:val="1"/>
+      <w:numFmt w:val="bullet"/>
+      <w:lvlText w:val=""/>
+      <w:lvlJc w:val="left"/>
+      <w:pPr>
+        <w:tabs>
+          <w:tab w:val="num" w:pos="3600"/>
+        </w:tabs>
+        <w:ind w:left="3600" w:hanging="360"/>
+      </w:pPr>
+      <w:rPr>
+        <w:rFonts w:ascii="Wingdings" w:hAnsi="Wingdings" w:hint="default"/>
+        <w:sz w:val="20"/>
+      </w:rPr>
+    </w:lvl>
+    <w:lvl w:ilvl="5" w:tentative="1">
+      <w:start w:val="1"/>
+      <w:numFmt w:val="bullet"/>
+      <w:lvlText w:val=""/>
+      <w:lvlJc w:val="left"/>
+      <w:pPr>
+        <w:tabs>
+          <w:tab w:val="num" w:pos="4320"/>
+        </w:tabs>
+        <w:ind w:left="4320" w:hanging="360"/>
+      </w:pPr>
+      <w:rPr>
+        <w:rFonts w:ascii="Wingdings" w:hAnsi="Wingdings" w:hint="default"/>
+        <w:sz w:val="20"/>
+      </w:rPr>
+    </w:lvl>
+    <w:lvl w:ilvl="6" w:tentative="1">
+      <w:start w:val="1"/>
+      <w:numFmt w:val="bullet"/>
+      <w:lvlText w:val=""/>
+      <w:lvlJc w:val="left"/>
+      <w:pPr>
+        <w:tabs>
+          <w:tab w:val="num" w:pos="5040"/>
+        </w:tabs>
+        <w:ind w:left="5040" w:hanging="360"/>
+      </w:pPr>
+      <w:rPr>
+        <w:rFonts w:ascii="Wingdings" w:hAnsi="Wingdings" w:hint="default"/>
+        <w:sz w:val="20"/>
+      </w:rPr>
+    </w:lvl>
+    <w:lvl w:ilvl="7" w:tentative="1">
+      <w:start w:val="1"/>
+      <w:numFmt w:val="bullet"/>
+      <w:lvlText w:val=""/>
+      <w:lvlJc w:val="left"/>
+      <w:pPr>
+        <w:tabs>
+          <w:tab w:val="num" w:pos="5760"/>
+        </w:tabs>
+        <w:ind w:left="5760" w:hanging="360"/>
+      </w:pPr>
+      <w:rPr>
+        <w:rFonts w:ascii="Wingdings" w:hAnsi="Wingdings" w:hint="default"/>
+        <w:sz w:val="20"/>
+      </w:rPr>
+    </w:lvl>
+    <w:lvl w:ilvl="8" w:tentative="1">
+      <w:start w:val="1"/>
+      <w:numFmt w:val="bullet"/>
+      <w:lvlText w:val=""/>
+      <w:lvlJc w:val="left"/>
+      <w:pPr>
+        <w:tabs>
+          <w:tab w:val="num" w:pos="6480"/>
+        </w:tabs>
+        <w:ind w:left="6480" w:hanging="360"/>
+      </w:pPr>
+      <w:rPr>
+        <w:rFonts w:ascii="Wingdings" w:hAnsi="Wingdings" w:hint="default"/>
+        <w:sz w:val="20"/>
+      </w:rPr>
+    </w:lvl>
+  </w:abstractNum>
+  <w:abstractNum w:abstractNumId="21" w15:restartNumberingAfterBreak="0">
     <w:nsid w:val="3FC8273B"/>
     <w:multiLevelType w:val="multilevel"/>
     <w:tmpl w:val="6694A706"/>
@@ -23367,7 +24641,7 @@
       </w:rPr>
     </w:lvl>
   </w:abstractNum>
-  <w:abstractNum w:abstractNumId="18" w15:restartNumberingAfterBreak="0">
+  <w:abstractNum w:abstractNumId="22" w15:restartNumberingAfterBreak="0">
     <w:nsid w:val="409E361B"/>
     <w:multiLevelType w:val="multilevel"/>
     <w:tmpl w:val="C004D940"/>
@@ -23483,7 +24757,7 @@
       </w:pPr>
     </w:lvl>
   </w:abstractNum>
-  <w:abstractNum w:abstractNumId="19" w15:restartNumberingAfterBreak="0">
+  <w:abstractNum w:abstractNumId="23" w15:restartNumberingAfterBreak="0">
     <w:nsid w:val="415174E1"/>
     <w:multiLevelType w:val="multilevel"/>
     <w:tmpl w:val="33E66ED6"/>
@@ -23632,7 +24906,7 @@
       </w:rPr>
     </w:lvl>
   </w:abstractNum>
-  <w:abstractNum w:abstractNumId="20" w15:restartNumberingAfterBreak="0">
+  <w:abstractNum w:abstractNumId="24" w15:restartNumberingAfterBreak="0">
     <w:nsid w:val="475379FC"/>
     <w:multiLevelType w:val="multilevel"/>
     <w:tmpl w:val="F2E01E48"/>
@@ -23781,7 +25055,7 @@
       </w:rPr>
     </w:lvl>
   </w:abstractNum>
-  <w:abstractNum w:abstractNumId="21" w15:restartNumberingAfterBreak="0">
+  <w:abstractNum w:abstractNumId="25" w15:restartNumberingAfterBreak="0">
     <w:nsid w:val="477C2D3D"/>
     <w:multiLevelType w:val="multilevel"/>
     <w:tmpl w:val="699ACB26"/>
@@ -23930,7 +25204,7 @@
       </w:rPr>
     </w:lvl>
   </w:abstractNum>
-  <w:abstractNum w:abstractNumId="22" w15:restartNumberingAfterBreak="0">
+  <w:abstractNum w:abstractNumId="26" w15:restartNumberingAfterBreak="0">
     <w:nsid w:val="48BB7199"/>
     <w:multiLevelType w:val="multilevel"/>
     <w:tmpl w:val="6FD6FC6A"/>
@@ -24079,7 +25353,7 @@
       </w:rPr>
     </w:lvl>
   </w:abstractNum>
-  <w:abstractNum w:abstractNumId="23" w15:restartNumberingAfterBreak="0">
+  <w:abstractNum w:abstractNumId="27" w15:restartNumberingAfterBreak="0">
     <w:nsid w:val="4AF5570D"/>
     <w:multiLevelType w:val="multilevel"/>
     <w:tmpl w:val="C57CCA70"/>
@@ -24192,7 +25466,7 @@
       </w:pPr>
     </w:lvl>
   </w:abstractNum>
-  <w:abstractNum w:abstractNumId="24" w15:restartNumberingAfterBreak="0">
+  <w:abstractNum w:abstractNumId="28" w15:restartNumberingAfterBreak="0">
     <w:nsid w:val="553C14D0"/>
     <w:multiLevelType w:val="multilevel"/>
     <w:tmpl w:val="4E1E2AA2"/>
@@ -24341,7 +25615,7 @@
       </w:rPr>
     </w:lvl>
   </w:abstractNum>
-  <w:abstractNum w:abstractNumId="25" w15:restartNumberingAfterBreak="0">
+  <w:abstractNum w:abstractNumId="29" w15:restartNumberingAfterBreak="0">
     <w:nsid w:val="58655648"/>
     <w:multiLevelType w:val="multilevel"/>
     <w:tmpl w:val="C240A06C"/>
@@ -24490,7 +25764,7 @@
       </w:rPr>
     </w:lvl>
   </w:abstractNum>
-  <w:abstractNum w:abstractNumId="26" w15:restartNumberingAfterBreak="0">
+  <w:abstractNum w:abstractNumId="30" w15:restartNumberingAfterBreak="0">
     <w:nsid w:val="5903124B"/>
     <w:multiLevelType w:val="multilevel"/>
     <w:tmpl w:val="C004D940"/>
@@ -24606,7 +25880,7 @@
       </w:pPr>
     </w:lvl>
   </w:abstractNum>
-  <w:abstractNum w:abstractNumId="27" w15:restartNumberingAfterBreak="0">
+  <w:abstractNum w:abstractNumId="31" w15:restartNumberingAfterBreak="0">
     <w:nsid w:val="5A0C5651"/>
     <w:multiLevelType w:val="multilevel"/>
     <w:tmpl w:val="47C6DCA6"/>
@@ -24755,7 +26029,7 @@
       </w:rPr>
     </w:lvl>
   </w:abstractNum>
-  <w:abstractNum w:abstractNumId="28" w15:restartNumberingAfterBreak="0">
+  <w:abstractNum w:abstractNumId="32" w15:restartNumberingAfterBreak="0">
     <w:nsid w:val="5A326A99"/>
     <w:multiLevelType w:val="multilevel"/>
     <w:tmpl w:val="A1D4B5D4"/>
@@ -24868,7 +26142,7 @@
       </w:pPr>
     </w:lvl>
   </w:abstractNum>
-  <w:abstractNum w:abstractNumId="29" w15:restartNumberingAfterBreak="0">
+  <w:abstractNum w:abstractNumId="33" w15:restartNumberingAfterBreak="0">
     <w:nsid w:val="5BC676C7"/>
     <w:multiLevelType w:val="multilevel"/>
     <w:tmpl w:val="FC5E2E14"/>
@@ -24981,7 +26255,7 @@
       </w:pPr>
     </w:lvl>
   </w:abstractNum>
-  <w:abstractNum w:abstractNumId="30" w15:restartNumberingAfterBreak="0">
+  <w:abstractNum w:abstractNumId="34" w15:restartNumberingAfterBreak="0">
     <w:nsid w:val="5C5863DC"/>
     <w:multiLevelType w:val="hybridMultilevel"/>
     <w:tmpl w:val="5882D8E8"/>
@@ -25094,7 +26368,7 @@
       </w:rPr>
     </w:lvl>
   </w:abstractNum>
-  <w:abstractNum w:abstractNumId="31" w15:restartNumberingAfterBreak="0">
+  <w:abstractNum w:abstractNumId="35" w15:restartNumberingAfterBreak="0">
     <w:nsid w:val="66F348E4"/>
     <w:multiLevelType w:val="multilevel"/>
     <w:tmpl w:val="4380D318"/>
@@ -25243,7 +26517,7 @@
       </w:rPr>
     </w:lvl>
   </w:abstractNum>
-  <w:abstractNum w:abstractNumId="32" w15:restartNumberingAfterBreak="0">
+  <w:abstractNum w:abstractNumId="36" w15:restartNumberingAfterBreak="0">
     <w:nsid w:val="69E410B2"/>
     <w:multiLevelType w:val="multilevel"/>
     <w:tmpl w:val="6B38BF08"/>
@@ -25392,7 +26666,7 @@
       </w:rPr>
     </w:lvl>
   </w:abstractNum>
-  <w:abstractNum w:abstractNumId="33" w15:restartNumberingAfterBreak="0">
+  <w:abstractNum w:abstractNumId="37" w15:restartNumberingAfterBreak="0">
     <w:nsid w:val="6A115713"/>
     <w:multiLevelType w:val="multilevel"/>
     <w:tmpl w:val="7AD6D48C"/>
@@ -25541,7 +26815,7 @@
       </w:rPr>
     </w:lvl>
   </w:abstractNum>
-  <w:abstractNum w:abstractNumId="34" w15:restartNumberingAfterBreak="0">
+  <w:abstractNum w:abstractNumId="38" w15:restartNumberingAfterBreak="0">
     <w:nsid w:val="6FCD542C"/>
     <w:multiLevelType w:val="multilevel"/>
     <w:tmpl w:val="A3AA5444"/>
@@ -25690,7 +26964,7 @@
       </w:rPr>
     </w:lvl>
   </w:abstractNum>
-  <w:abstractNum w:abstractNumId="35" w15:restartNumberingAfterBreak="0">
+  <w:abstractNum w:abstractNumId="39" w15:restartNumberingAfterBreak="0">
     <w:nsid w:val="70E439F3"/>
     <w:multiLevelType w:val="multilevel"/>
     <w:tmpl w:val="C2141348"/>
@@ -25803,7 +27077,7 @@
       </w:pPr>
     </w:lvl>
   </w:abstractNum>
-  <w:abstractNum w:abstractNumId="36" w15:restartNumberingAfterBreak="0">
+  <w:abstractNum w:abstractNumId="40" w15:restartNumberingAfterBreak="0">
     <w:nsid w:val="72056B26"/>
     <w:multiLevelType w:val="multilevel"/>
     <w:tmpl w:val="A3BA91A2"/>
@@ -25952,7 +27226,7 @@
       </w:rPr>
     </w:lvl>
   </w:abstractNum>
-  <w:abstractNum w:abstractNumId="37" w15:restartNumberingAfterBreak="0">
+  <w:abstractNum w:abstractNumId="41" w15:restartNumberingAfterBreak="0">
     <w:nsid w:val="78A3589E"/>
     <w:multiLevelType w:val="multilevel"/>
     <w:tmpl w:val="01A4574E"/>
@@ -26101,7 +27375,7 @@
       </w:rPr>
     </w:lvl>
   </w:abstractNum>
-  <w:abstractNum w:abstractNumId="38" w15:restartNumberingAfterBreak="0">
+  <w:abstractNum w:abstractNumId="42" w15:restartNumberingAfterBreak="0">
     <w:nsid w:val="7B437A23"/>
     <w:multiLevelType w:val="multilevel"/>
     <w:tmpl w:val="BC1E6550"/>
@@ -26250,7 +27524,156 @@
       </w:rPr>
     </w:lvl>
   </w:abstractNum>
-  <w:abstractNum w:abstractNumId="39" w15:restartNumberingAfterBreak="0">
+  <w:abstractNum w:abstractNumId="43" w15:restartNumberingAfterBreak="0">
+    <w:nsid w:val="7D255622"/>
+    <w:multiLevelType w:val="multilevel"/>
+    <w:tmpl w:val="1A163E86"/>
+    <w:lvl w:ilvl="0">
+      <w:start w:val="1"/>
+      <w:numFmt w:val="bullet"/>
+      <w:lvlText w:val=""/>
+      <w:lvlJc w:val="left"/>
+      <w:pPr>
+        <w:tabs>
+          <w:tab w:val="num" w:pos="720"/>
+        </w:tabs>
+        <w:ind w:left="720" w:hanging="360"/>
+      </w:pPr>
+      <w:rPr>
+        <w:rFonts w:ascii="Symbol" w:hAnsi="Symbol" w:hint="default"/>
+        <w:sz w:val="20"/>
+      </w:rPr>
+    </w:lvl>
+    <w:lvl w:ilvl="1" w:tentative="1">
+      <w:start w:val="1"/>
+      <w:numFmt w:val="bullet"/>
+      <w:lvlText w:val="o"/>
+      <w:lvlJc w:val="left"/>
+      <w:pPr>
+        <w:tabs>
+          <w:tab w:val="num" w:pos="1440"/>
+        </w:tabs>
+        <w:ind w:left="1440" w:hanging="360"/>
+      </w:pPr>
+      <w:rPr>
+        <w:rFonts w:ascii="Courier New" w:hAnsi="Courier New" w:hint="default"/>
+        <w:sz w:val="20"/>
+      </w:rPr>
+    </w:lvl>
+    <w:lvl w:ilvl="2" w:tentative="1">
+      <w:start w:val="1"/>
+      <w:numFmt w:val="bullet"/>
+      <w:lvlText w:val=""/>
+      <w:lvlJc w:val="left"/>
+      <w:pPr>
+        <w:tabs>
+          <w:tab w:val="num" w:pos="2160"/>
+        </w:tabs>
+        <w:ind w:left="2160" w:hanging="360"/>
+      </w:pPr>
+      <w:rPr>
+        <w:rFonts w:ascii="Wingdings" w:hAnsi="Wingdings" w:hint="default"/>
+        <w:sz w:val="20"/>
+      </w:rPr>
+    </w:lvl>
+    <w:lvl w:ilvl="3" w:tentative="1">
+      <w:start w:val="1"/>
+      <w:numFmt w:val="bullet"/>
+      <w:lvlText w:val=""/>
+      <w:lvlJc w:val="left"/>
+      <w:pPr>
+        <w:tabs>
+          <w:tab w:val="num" w:pos="2880"/>
+        </w:tabs>
+        <w:ind w:left="2880" w:hanging="360"/>
+      </w:pPr>
+      <w:rPr>
+        <w:rFonts w:ascii="Wingdings" w:hAnsi="Wingdings" w:hint="default"/>
+        <w:sz w:val="20"/>
+      </w:rPr>
+    </w:lvl>
+    <w:lvl w:ilvl="4" w:tentative="1">
+      <w:start w:val="1"/>
+      <w:numFmt w:val="bullet"/>
+      <w:lvlText w:val=""/>
+      <w:lvlJc w:val="left"/>
+      <w:pPr>
+        <w:tabs>
+          <w:tab w:val="num" w:pos="3600"/>
+        </w:tabs>
+        <w:ind w:left="3600" w:hanging="360"/>
+      </w:pPr>
+      <w:rPr>
+        <w:rFonts w:ascii="Wingdings" w:hAnsi="Wingdings" w:hint="default"/>
+        <w:sz w:val="20"/>
+      </w:rPr>
+    </w:lvl>
+    <w:lvl w:ilvl="5" w:tentative="1">
+      <w:start w:val="1"/>
+      <w:numFmt w:val="bullet"/>
+      <w:lvlText w:val=""/>
+      <w:lvlJc w:val="left"/>
+      <w:pPr>
+        <w:tabs>
+          <w:tab w:val="num" w:pos="4320"/>
+        </w:tabs>
+        <w:ind w:left="4320" w:hanging="360"/>
+      </w:pPr>
+      <w:rPr>
+        <w:rFonts w:ascii="Wingdings" w:hAnsi="Wingdings" w:hint="default"/>
+        <w:sz w:val="20"/>
+      </w:rPr>
+    </w:lvl>
+    <w:lvl w:ilvl="6" w:tentative="1">
+      <w:start w:val="1"/>
+      <w:numFmt w:val="bullet"/>
+      <w:lvlText w:val=""/>
+      <w:lvlJc w:val="left"/>
+      <w:pPr>
+        <w:tabs>
+          <w:tab w:val="num" w:pos="5040"/>
+        </w:tabs>
+        <w:ind w:left="5040" w:hanging="360"/>
+      </w:pPr>
+      <w:rPr>
+        <w:rFonts w:ascii="Wingdings" w:hAnsi="Wingdings" w:hint="default"/>
+        <w:sz w:val="20"/>
+      </w:rPr>
+    </w:lvl>
+    <w:lvl w:ilvl="7" w:tentative="1">
+      <w:start w:val="1"/>
+      <w:numFmt w:val="bullet"/>
+      <w:lvlText w:val=""/>
+      <w:lvlJc w:val="left"/>
+      <w:pPr>
+        <w:tabs>
+          <w:tab w:val="num" w:pos="5760"/>
+        </w:tabs>
+        <w:ind w:left="5760" w:hanging="360"/>
+      </w:pPr>
+      <w:rPr>
+        <w:rFonts w:ascii="Wingdings" w:hAnsi="Wingdings" w:hint="default"/>
+        <w:sz w:val="20"/>
+      </w:rPr>
+    </w:lvl>
+    <w:lvl w:ilvl="8" w:tentative="1">
+      <w:start w:val="1"/>
+      <w:numFmt w:val="bullet"/>
+      <w:lvlText w:val=""/>
+      <w:lvlJc w:val="left"/>
+      <w:pPr>
+        <w:tabs>
+          <w:tab w:val="num" w:pos="6480"/>
+        </w:tabs>
+        <w:ind w:left="6480" w:hanging="360"/>
+      </w:pPr>
+      <w:rPr>
+        <w:rFonts w:ascii="Wingdings" w:hAnsi="Wingdings" w:hint="default"/>
+        <w:sz w:val="20"/>
+      </w:rPr>
+    </w:lvl>
+  </w:abstractNum>
+  <w:abstractNum w:abstractNumId="44" w15:restartNumberingAfterBreak="0">
     <w:nsid w:val="7D811C16"/>
     <w:multiLevelType w:val="multilevel"/>
     <w:tmpl w:val="61E2A1F0"/>
@@ -26400,126 +27823,141 @@
     </w:lvl>
   </w:abstractNum>
   <w:num w:numId="1" w16cid:durableId="674111321">
+    <w:abstractNumId w:val="38"/>
+  </w:num>
+  <w:num w:numId="2" w16cid:durableId="1527060396">
+    <w:abstractNumId w:val="27"/>
+  </w:num>
+  <w:num w:numId="3" w16cid:durableId="1072696516">
     <w:abstractNumId w:val="34"/>
   </w:num>
-  <w:num w:numId="2" w16cid:durableId="1527060396">
-    <w:abstractNumId w:val="23"/>
-  </w:num>
-  <w:num w:numId="3" w16cid:durableId="1072696516">
-    <w:abstractNumId w:val="30"/>
-  </w:num>
   <w:num w:numId="4" w16cid:durableId="2101830472">
-    <w:abstractNumId w:val="35"/>
+    <w:abstractNumId w:val="39"/>
   </w:num>
   <w:num w:numId="5" w16cid:durableId="1823423382">
     <w:abstractNumId w:val="0"/>
   </w:num>
   <w:num w:numId="6" w16cid:durableId="1175726370">
-    <w:abstractNumId w:val="11"/>
+    <w:abstractNumId w:val="13"/>
   </w:num>
   <w:num w:numId="7" w16cid:durableId="1598248964">
-    <w:abstractNumId w:val="18"/>
+    <w:abstractNumId w:val="22"/>
   </w:num>
   <w:num w:numId="8" w16cid:durableId="64687026">
-    <w:abstractNumId w:val="26"/>
+    <w:abstractNumId w:val="30"/>
   </w:num>
   <w:num w:numId="9" w16cid:durableId="1352413890">
-    <w:abstractNumId w:val="4"/>
+    <w:abstractNumId w:val="5"/>
   </w:num>
   <w:num w:numId="10" w16cid:durableId="1627735424">
-    <w:abstractNumId w:val="37"/>
+    <w:abstractNumId w:val="41"/>
   </w:num>
   <w:num w:numId="11" w16cid:durableId="1931740864">
     <w:abstractNumId w:val="1"/>
   </w:num>
   <w:num w:numId="12" w16cid:durableId="125398755">
+    <w:abstractNumId w:val="25"/>
+  </w:num>
+  <w:num w:numId="13" w16cid:durableId="645361614">
+    <w:abstractNumId w:val="16"/>
+  </w:num>
+  <w:num w:numId="14" w16cid:durableId="1778089636">
+    <w:abstractNumId w:val="6"/>
+  </w:num>
+  <w:num w:numId="15" w16cid:durableId="1294411949">
+    <w:abstractNumId w:val="17"/>
+  </w:num>
+  <w:num w:numId="16" w16cid:durableId="1287663750">
+    <w:abstractNumId w:val="8"/>
+  </w:num>
+  <w:num w:numId="17" w16cid:durableId="766266452">
+    <w:abstractNumId w:val="7"/>
+  </w:num>
+  <w:num w:numId="18" w16cid:durableId="432360908">
     <w:abstractNumId w:val="21"/>
   </w:num>
-  <w:num w:numId="13" w16cid:durableId="645361614">
-    <w:abstractNumId w:val="13"/>
-  </w:num>
-  <w:num w:numId="14" w16cid:durableId="1778089636">
-    <w:abstractNumId w:val="5"/>
-  </w:num>
-  <w:num w:numId="15" w16cid:durableId="1294411949">
-    <w:abstractNumId w:val="14"/>
-  </w:num>
-  <w:num w:numId="16" w16cid:durableId="1287663750">
-    <w:abstractNumId w:val="7"/>
-  </w:num>
-  <w:num w:numId="17" w16cid:durableId="766266452">
-    <w:abstractNumId w:val="6"/>
-  </w:num>
-  <w:num w:numId="18" w16cid:durableId="432360908">
-    <w:abstractNumId w:val="17"/>
-  </w:num>
   <w:num w:numId="19" w16cid:durableId="425810958">
-    <w:abstractNumId w:val="16"/>
+    <w:abstractNumId w:val="19"/>
   </w:num>
   <w:num w:numId="20" w16cid:durableId="1670214639">
-    <w:abstractNumId w:val="25"/>
+    <w:abstractNumId w:val="29"/>
   </w:num>
   <w:num w:numId="21" w16cid:durableId="2055423511">
-    <w:abstractNumId w:val="28"/>
+    <w:abstractNumId w:val="32"/>
   </w:num>
   <w:num w:numId="22" w16cid:durableId="727997857">
-    <w:abstractNumId w:val="27"/>
+    <w:abstractNumId w:val="31"/>
   </w:num>
   <w:num w:numId="23" w16cid:durableId="907811819">
-    <w:abstractNumId w:val="9"/>
+    <w:abstractNumId w:val="10"/>
   </w:num>
   <w:num w:numId="24" w16cid:durableId="295452331">
-    <w:abstractNumId w:val="29"/>
+    <w:abstractNumId w:val="33"/>
   </w:num>
   <w:num w:numId="25" w16cid:durableId="2013142236">
-    <w:abstractNumId w:val="31"/>
+    <w:abstractNumId w:val="35"/>
   </w:num>
   <w:num w:numId="26" w16cid:durableId="264655735">
-    <w:abstractNumId w:val="39"/>
+    <w:abstractNumId w:val="44"/>
   </w:num>
   <w:num w:numId="27" w16cid:durableId="2059474405">
-    <w:abstractNumId w:val="20"/>
+    <w:abstractNumId w:val="24"/>
   </w:num>
   <w:num w:numId="28" w16cid:durableId="416483937">
     <w:abstractNumId w:val="3"/>
   </w:num>
   <w:num w:numId="29" w16cid:durableId="67851074">
-    <w:abstractNumId w:val="24"/>
+    <w:abstractNumId w:val="28"/>
   </w:num>
   <w:num w:numId="30" w16cid:durableId="918095755">
-    <w:abstractNumId w:val="19"/>
+    <w:abstractNumId w:val="23"/>
   </w:num>
   <w:num w:numId="31" w16cid:durableId="856116538">
     <w:abstractNumId w:val="2"/>
   </w:num>
   <w:num w:numId="32" w16cid:durableId="1379279393">
-    <w:abstractNumId w:val="33"/>
+    <w:abstractNumId w:val="37"/>
   </w:num>
   <w:num w:numId="33" w16cid:durableId="612983133">
-    <w:abstractNumId w:val="32"/>
+    <w:abstractNumId w:val="36"/>
   </w:num>
   <w:num w:numId="34" w16cid:durableId="356542081">
-    <w:abstractNumId w:val="38"/>
+    <w:abstractNumId w:val="42"/>
   </w:num>
   <w:num w:numId="35" w16cid:durableId="118382609">
+    <w:abstractNumId w:val="15"/>
+  </w:num>
+  <w:num w:numId="36" w16cid:durableId="1312759144">
     <w:abstractNumId w:val="12"/>
   </w:num>
-  <w:num w:numId="36" w16cid:durableId="1312759144">
-    <w:abstractNumId w:val="10"/>
-  </w:num>
   <w:num w:numId="37" w16cid:durableId="428620864">
-    <w:abstractNumId w:val="22"/>
+    <w:abstractNumId w:val="26"/>
   </w:num>
   <w:num w:numId="38" w16cid:durableId="1853303645">
-    <w:abstractNumId w:val="8"/>
+    <w:abstractNumId w:val="9"/>
   </w:num>
   <w:num w:numId="39" w16cid:durableId="2066829017">
-    <w:abstractNumId w:val="15"/>
+    <w:abstractNumId w:val="18"/>
   </w:num>
   <w:num w:numId="40" w16cid:durableId="1238318395">
-    <w:abstractNumId w:val="36"/>
+    <w:abstractNumId w:val="40"/>
   </w:num>
-  <w:numIdMacAtCleanup w:val="40"/>
+  <w:num w:numId="41" w16cid:durableId="501773569">
+    <w:abstractNumId w:val="14"/>
+  </w:num>
+  <w:num w:numId="42" w16cid:durableId="115949436">
+    <w:abstractNumId w:val="43"/>
+  </w:num>
+  <w:num w:numId="43" w16cid:durableId="1680886887">
+    <w:abstractNumId w:val="11"/>
+  </w:num>
+  <w:num w:numId="44" w16cid:durableId="1571234587">
+    <w:abstractNumId w:val="20"/>
+  </w:num>
+  <w:num w:numId="45" w16cid:durableId="1198934282">
+    <w:abstractNumId w:val="4"/>
+  </w:num>
+  <w:numIdMacAtCleanup w:val="45"/>
 </w:numbering>
 </file>
 

</xml_diff>

<commit_message>
Things to do updates
</commit_message>
<xml_diff>
--- a/Things To Do.docx
+++ b/Things To Do.docx
@@ -21728,6 +21728,275 @@
         <w:contextualSpacing/>
         <w:rPr>
           <w:rFonts w:ascii="Times New Roman" w:hAnsi="Times New Roman" w:cs="Times New Roman"/>
+        </w:rPr>
+      </w:pPr>
+    </w:p>
+    <w:p>
+      <w:pPr>
+        <w:spacing w:line="240" w:lineRule="auto"/>
+        <w:contextualSpacing/>
+        <w:rPr>
+          <w:rFonts w:ascii="Times New Roman" w:hAnsi="Times New Roman" w:cs="Times New Roman"/>
+        </w:rPr>
+      </w:pPr>
+    </w:p>
+    <w:p>
+      <w:pPr>
+        <w:spacing w:line="240" w:lineRule="auto"/>
+        <w:contextualSpacing/>
+        <w:rPr>
+          <w:rFonts w:ascii="Times New Roman" w:hAnsi="Times New Roman" w:cs="Times New Roman"/>
+          <w:b/>
+          <w:bCs/>
+        </w:rPr>
+      </w:pPr>
+      <w:r>
+        <w:rPr>
+          <w:rFonts w:ascii="Times New Roman" w:hAnsi="Times New Roman" w:cs="Times New Roman"/>
+          <w:b/>
+          <w:bCs/>
+        </w:rPr>
+        <w:t>Download visual charts</w:t>
+      </w:r>
+    </w:p>
+    <w:tbl>
+      <w:tblPr>
+        <w:tblW w:w="11280" w:type="dxa"/>
+        <w:shd w:val="clear" w:color="auto" w:fill="FFFFFF"/>
+        <w:tblCellMar>
+          <w:top w:w="15" w:type="dxa"/>
+          <w:left w:w="15" w:type="dxa"/>
+          <w:bottom w:w="15" w:type="dxa"/>
+          <w:right w:w="15" w:type="dxa"/>
+        </w:tblCellMar>
+        <w:tblLook w:val="04A0" w:firstRow="1" w:lastRow="0" w:firstColumn="1" w:lastColumn="0" w:noHBand="0" w:noVBand="1"/>
+      </w:tblPr>
+      <w:tblGrid>
+        <w:gridCol w:w="6752"/>
+        <w:gridCol w:w="1941"/>
+        <w:gridCol w:w="2587"/>
+      </w:tblGrid>
+      <w:tr>
+        <w:tc>
+          <w:tcPr>
+            <w:tcW w:w="0" w:type="auto"/>
+            <w:shd w:val="clear" w:color="auto" w:fill="FFFFFF"/>
+            <w:tcMar>
+              <w:top w:w="150" w:type="dxa"/>
+              <w:left w:w="0" w:type="dxa"/>
+              <w:bottom w:w="150" w:type="dxa"/>
+              <w:right w:w="240" w:type="dxa"/>
+            </w:tcMar>
+            <w:vAlign w:val="center"/>
+            <w:hideMark/>
+          </w:tcPr>
+          <w:p>
+            <w:pPr>
+              <w:spacing w:line="240" w:lineRule="auto"/>
+              <w:contextualSpacing/>
+              <w:rPr>
+                <w:rFonts w:ascii="Times New Roman" w:hAnsi="Times New Roman" w:cs="Times New Roman"/>
+                <w:b/>
+                <w:bCs/>
+              </w:rPr>
+            </w:pPr>
+            <w:r>
+              <w:rPr>
+                <w:rFonts w:ascii="Times New Roman" w:hAnsi="Times New Roman" w:cs="Times New Roman"/>
+                <w:b/>
+                <w:bCs/>
+              </w:rPr>
+              <w:t>Documentation (screenshots + report)</w:t>
+            </w:r>
+          </w:p>
+        </w:tc>
+        <w:tc>
+          <w:tcPr>
+            <w:tcW w:w="0" w:type="auto"/>
+            <w:shd w:val="clear" w:color="auto" w:fill="FFFFFF"/>
+            <w:tcMar>
+              <w:top w:w="150" w:type="dxa"/>
+              <w:left w:w="240" w:type="dxa"/>
+              <w:bottom w:w="150" w:type="dxa"/>
+              <w:right w:w="240" w:type="dxa"/>
+            </w:tcMar>
+            <w:vAlign w:val="center"/>
+            <w:hideMark/>
+          </w:tcPr>
+          <w:p>
+            <w:pPr>
+              <w:spacing w:line="240" w:lineRule="auto"/>
+              <w:contextualSpacing/>
+              <w:rPr>
+                <w:rFonts w:ascii="Times New Roman" w:hAnsi="Times New Roman" w:cs="Times New Roman"/>
+                <w:b/>
+                <w:bCs/>
+              </w:rPr>
+            </w:pPr>
+            <w:r>
+              <w:rPr>
+                <w:rFonts w:ascii="Times New Roman" w:hAnsi="Times New Roman" w:cs="Times New Roman"/>
+                <w:b/>
+                <w:bCs/>
+              </w:rPr>
+              <w:t xml:space="preserve">1 </w:t>
+            </w:r>
+            <w:proofErr w:type="spellStart"/>
+            <w:r>
+              <w:rPr>
+                <w:rFonts w:ascii="Times New Roman" w:hAnsi="Times New Roman" w:cs="Times New Roman"/>
+                <w:b/>
+                <w:bCs/>
+              </w:rPr>
+              <w:t>hr</w:t>
+            </w:r>
+            <w:proofErr w:type="spellEnd"/>
+          </w:p>
+        </w:tc>
+        <w:tc>
+          <w:tcPr>
+            <w:tcW w:w="0" w:type="auto"/>
+            <w:shd w:val="clear" w:color="auto" w:fill="FFFFFF"/>
+            <w:tcMar>
+              <w:top w:w="150" w:type="dxa"/>
+              <w:left w:w="240" w:type="dxa"/>
+              <w:bottom w:w="150" w:type="dxa"/>
+              <w:right w:w="0" w:type="dxa"/>
+            </w:tcMar>
+            <w:vAlign w:val="center"/>
+            <w:hideMark/>
+          </w:tcPr>
+          <w:p>
+            <w:pPr>
+              <w:spacing w:line="240" w:lineRule="auto"/>
+              <w:contextualSpacing/>
+              <w:rPr>
+                <w:rFonts w:ascii="Times New Roman" w:hAnsi="Times New Roman" w:cs="Times New Roman"/>
+                <w:b/>
+                <w:bCs/>
+              </w:rPr>
+            </w:pPr>
+            <w:r>
+              <w:rPr>
+                <w:rFonts w:ascii="Times New Roman" w:hAnsi="Times New Roman" w:cs="Times New Roman"/>
+                <w:b/>
+                <w:bCs/>
+              </w:rPr>
+              <w:t>You (I guide)</w:t>
+            </w:r>
+          </w:p>
+        </w:tc>
+      </w:tr>
+      <w:tr>
+        <w:tc>
+          <w:tcPr>
+            <w:tcW w:w="0" w:type="auto"/>
+            <w:shd w:val="clear" w:color="auto" w:fill="FFFFFF"/>
+            <w:tcMar>
+              <w:top w:w="150" w:type="dxa"/>
+              <w:left w:w="0" w:type="dxa"/>
+              <w:bottom w:w="150" w:type="dxa"/>
+              <w:right w:w="240" w:type="dxa"/>
+            </w:tcMar>
+            <w:vAlign w:val="center"/>
+            <w:hideMark/>
+          </w:tcPr>
+          <w:p>
+            <w:pPr>
+              <w:spacing w:line="240" w:lineRule="auto"/>
+              <w:contextualSpacing/>
+              <w:rPr>
+                <w:rFonts w:ascii="Times New Roman" w:hAnsi="Times New Roman" w:cs="Times New Roman"/>
+                <w:b/>
+                <w:bCs/>
+              </w:rPr>
+            </w:pPr>
+            <w:r>
+              <w:rPr>
+                <w:rFonts w:ascii="Times New Roman" w:hAnsi="Times New Roman" w:cs="Times New Roman"/>
+                <w:b/>
+                <w:bCs/>
+              </w:rPr>
+              <w:t>Demo script (5-min walkthrough)</w:t>
+            </w:r>
+          </w:p>
+        </w:tc>
+        <w:tc>
+          <w:tcPr>
+            <w:tcW w:w="0" w:type="auto"/>
+            <w:shd w:val="clear" w:color="auto" w:fill="FFFFFF"/>
+            <w:tcMar>
+              <w:top w:w="150" w:type="dxa"/>
+              <w:left w:w="240" w:type="dxa"/>
+              <w:bottom w:w="150" w:type="dxa"/>
+              <w:right w:w="240" w:type="dxa"/>
+            </w:tcMar>
+            <w:vAlign w:val="center"/>
+            <w:hideMark/>
+          </w:tcPr>
+          <w:p>
+            <w:pPr>
+              <w:spacing w:line="240" w:lineRule="auto"/>
+              <w:contextualSpacing/>
+              <w:rPr>
+                <w:rFonts w:ascii="Times New Roman" w:hAnsi="Times New Roman" w:cs="Times New Roman"/>
+                <w:b/>
+                <w:bCs/>
+              </w:rPr>
+            </w:pPr>
+            <w:r>
+              <w:rPr>
+                <w:rFonts w:ascii="Times New Roman" w:hAnsi="Times New Roman" w:cs="Times New Roman"/>
+                <w:b/>
+                <w:bCs/>
+              </w:rPr>
+              <w:t>20 min</w:t>
+            </w:r>
+          </w:p>
+        </w:tc>
+        <w:tc>
+          <w:tcPr>
+            <w:tcW w:w="0" w:type="auto"/>
+            <w:shd w:val="clear" w:color="auto" w:fill="FFFFFF"/>
+            <w:tcMar>
+              <w:top w:w="150" w:type="dxa"/>
+              <w:left w:w="240" w:type="dxa"/>
+              <w:bottom w:w="150" w:type="dxa"/>
+              <w:right w:w="0" w:type="dxa"/>
+            </w:tcMar>
+            <w:vAlign w:val="center"/>
+            <w:hideMark/>
+          </w:tcPr>
+          <w:p>
+            <w:pPr>
+              <w:spacing w:line="240" w:lineRule="auto"/>
+              <w:contextualSpacing/>
+              <w:rPr>
+                <w:rFonts w:ascii="Times New Roman" w:hAnsi="Times New Roman" w:cs="Times New Roman"/>
+                <w:b/>
+                <w:bCs/>
+              </w:rPr>
+            </w:pPr>
+            <w:r>
+              <w:rPr>
+                <w:rFonts w:ascii="Times New Roman" w:hAnsi="Times New Roman" w:cs="Times New Roman"/>
+                <w:b/>
+                <w:bCs/>
+              </w:rPr>
+              <w:t>Me</w:t>
+            </w:r>
+          </w:p>
+        </w:tc>
+      </w:tr>
+    </w:tbl>
+    <w:p>
+      <w:pPr>
+        <w:spacing w:line="240" w:lineRule="auto"/>
+        <w:contextualSpacing/>
+        <w:rPr>
+          <w:rFonts w:ascii="Times New Roman" w:hAnsi="Times New Roman" w:cs="Times New Roman"/>
+          <w:b/>
+          <w:bCs/>
         </w:rPr>
       </w:pPr>
     </w:p>

</xml_diff>